<commit_message>
Rebuild executive resume in single-column ATS-friendly format
Co-Authored-By: Claude Opus 5.5 <noreply@anthropic.com>
Claude-Session: https://claude.ai/code/session_01Rb4ZTXZXZvRymPmEXq9dPj
</commit_message>
<xml_diff>
--- a/resumes/Clavel_Lazarre_Executive_Resume.docx
+++ b/resumes/Clavel_Lazarre_Executive_Resume.docx
@@ -4,1858 +4,1579 @@
   <w:body>
     <w:p>
       <w:pPr>
-        <w:spacing w:before="0" w:after="30"/>
+        <w:keepNext w:val="0"/>
+        <w:spacing w:before="0" w:after="0" w:line="240" w:lineRule="auto"/>
         <w:jc w:val="center"/>
       </w:pPr>
       <w:r>
         <w:rPr>
-          <w:rFonts w:ascii="Calibri" w:hAnsi="Calibri"/>
+          <w:rFonts w:ascii="Calibri" w:hAnsi="Calibri" w:eastAsia="Calibri"/>
           <w:b/>
           <w:i w:val="0"/>
-          <w:color w:val="1C1C1C"/>
-          <w:sz w:val="46"/>
+          <w:caps w:val="0"/>
+          <w:color w:val="1F3A5F"/>
+          <w:sz w:val="44"/>
         </w:rPr>
-        <w:t xml:space="preserve">CLAVEL LAZARRE</w:t>
-      </w:r>
-      <w:r>
-        <w:rPr>
-          <w:rFonts w:ascii="Calibri" w:hAnsi="Calibri"/>
-          <w:b w:val="0"/>
-          <w:i w:val="0"/>
-          <w:color w:val="C09628"/>
-          <w:sz w:val="26"/>
-        </w:rPr>
-        <w:t xml:space="preserve">,  MBA</w:t>
+        <w:t>CLAVEL LAZARRE, MBA</w:t>
       </w:r>
     </w:p>
     <w:p>
       <w:pPr>
-        <w:spacing w:before="0" w:after="30"/>
+        <w:keepNext w:val="0"/>
+        <w:spacing w:before="40" w:after="0" w:line="240" w:lineRule="auto"/>
         <w:jc w:val="center"/>
       </w:pPr>
       <w:r>
         <w:rPr>
-          <w:rFonts w:ascii="Calibri" w:hAnsi="Calibri"/>
+          <w:rFonts w:ascii="Calibri" w:hAnsi="Calibri" w:eastAsia="Calibri"/>
           <w:b/>
           <w:i w:val="0"/>
-          <w:color w:val="C09628"/>
-          <w:sz w:val="17"/>
+          <w:caps w:val="0"/>
+          <w:color w:val="222222"/>
+          <w:sz w:val="23"/>
         </w:rPr>
-        <w:t xml:space="preserve">EXECUTIVE LEADERSHIP  ·  ORGANIZATIONAL GROWTH  ·  STRATEGY &amp; OPERATIONS</w:t>
+        <w:t>Executive Leadership  |  Organizational Growth  |  Strategy &amp; Operations</w:t>
       </w:r>
     </w:p>
     <w:p>
       <w:pPr>
-        <w:spacing w:before="0" w:after="60"/>
+        <w:keepNext w:val="0"/>
+        <w:spacing w:before="40" w:after="40" w:line="240" w:lineRule="auto"/>
         <w:jc w:val="center"/>
+        <w:pBdr>
+          <w:bottom w:val="single" w:sz="12" w:space="1" w:color="1F3A5F"/>
+        </w:pBdr>
       </w:pPr>
       <w:r>
         <w:rPr>
-          <w:rFonts w:ascii="Calibri" w:hAnsi="Calibri"/>
+          <w:rFonts w:ascii="Calibri" w:hAnsi="Calibri" w:eastAsia="Calibri"/>
           <w:b w:val="0"/>
           <w:i w:val="0"/>
+          <w:caps w:val="0"/>
           <w:color w:val="555555"/>
-          <w:sz w:val="17"/>
+          <w:sz w:val="20"/>
         </w:rPr>
-        <w:t xml:space="preserve">New York, NY  |  347-607-8164  |  lazarreclavel3@gmail.com  |  linkedin.com/in/clavel-lazarre</w:t>
+        <w:t>New York, NY  |  347-607-8164  |  lazarreclavel3@gmail.com  |  linkedin.com/in/clavel-lazarre</w:t>
       </w:r>
     </w:p>
     <w:p>
       <w:pPr>
-        <w:spacing w:before="0" w:after="60"/>
+        <w:keepNext/>
+        <w:spacing w:before="160" w:after="60" w:line="240" w:lineRule="auto"/>
         <w:pBdr>
-          <w:bottom w:val="single" w:sz="8" w:space="1" w:color="C09628"/>
+          <w:bottom w:val="single" w:sz="8" w:space="1" w:color="1F3A5F"/>
         </w:pBdr>
       </w:pPr>
+      <w:r>
+        <w:rPr>
+          <w:rFonts w:ascii="Calibri" w:hAnsi="Calibri" w:eastAsia="Calibri"/>
+          <w:b/>
+          <w:i w:val="0"/>
+          <w:caps/>
+          <w:color w:val="1F3A5F"/>
+          <w:sz w:val="23"/>
+        </w:rPr>
+        <w:t>Executive Summary</w:t>
+      </w:r>
+    </w:p>
+    <w:p>
+      <w:pPr>
+        <w:keepNext w:val="0"/>
+        <w:spacing w:before="0" w:after="60" w:line="252" w:lineRule="auto"/>
+      </w:pPr>
+      <w:r>
+        <w:rPr>
+          <w:rFonts w:ascii="Calibri" w:hAnsi="Calibri" w:eastAsia="Calibri"/>
+          <w:b w:val="0"/>
+          <w:i w:val="0"/>
+          <w:caps w:val="0"/>
+          <w:color w:val="222222"/>
+          <w:sz w:val="21"/>
+        </w:rPr>
+        <w:t>Operations and finance executive with 20+ years of experience building businesses, leading mission-driven programs, and creating the systems organizations need to grow. Held full P&amp;L accountability for an $80M portfolio and financial and operational oversight of a 140-person division. Co-founded a fitness business that reached $1M in annual revenue within 24 months, then expanded through a franchise model to $10M in annual sales.</w:t>
+      </w:r>
+    </w:p>
+    <w:p>
+      <w:pPr>
+        <w:keepNext w:val="0"/>
+        <w:spacing w:before="0" w:after="20" w:line="252" w:lineRule="auto"/>
+      </w:pPr>
+      <w:r>
+        <w:rPr>
+          <w:rFonts w:ascii="Calibri" w:hAnsi="Calibri" w:eastAsia="Calibri"/>
+          <w:b w:val="0"/>
+          <w:i w:val="0"/>
+          <w:caps w:val="0"/>
+          <w:color w:val="222222"/>
+          <w:sz w:val="21"/>
+        </w:rPr>
+        <w:t>Brings a founder’s understanding of growth and an operator’s discipline in execution. Partners with CEOs, boards, public agencies, and community organizations to evaluate opportunities, align resources, and translate strategy into budgets, partnerships, programs, and operating processes.</w:t>
+      </w:r>
     </w:p>
     <w:p>
       <w:pPr>
         <w:keepNext/>
-        <w:spacing w:before="120" w:after="40"/>
+        <w:spacing w:before="160" w:after="60" w:line="240" w:lineRule="auto"/>
         <w:pBdr>
-          <w:bottom w:val="single" w:sz="8" w:space="1" w:color="C09628"/>
+          <w:bottom w:val="single" w:sz="8" w:space="1" w:color="1F3A5F"/>
         </w:pBdr>
-      </w:pPr>
-    </w:p>
-    <w:p>
-      <w:pPr>
-        <w:keepNext/>
-        <w:spacing w:before="0" w:after="60"/>
-        <w:ind w:left="0"/>
       </w:pPr>
       <w:r>
         <w:rPr>
-          <w:rFonts w:ascii="Calibri" w:hAnsi="Calibri"/>
+          <w:rFonts w:ascii="Calibri" w:hAnsi="Calibri" w:eastAsia="Calibri"/>
           <w:b/>
           <w:i w:val="0"/>
-          <w:color w:val="C09628"/>
-          <w:sz w:val="19"/>
+          <w:caps/>
+          <w:color w:val="1F3A5F"/>
+          <w:sz w:val="23"/>
         </w:rPr>
-        <w:t xml:space="preserve">EXECUTIVE PROFILE</w:t>
+        <w:t>Selected Leadership Results</w:t>
       </w:r>
     </w:p>
     <w:p>
       <w:pPr>
-        <w:spacing w:before="20" w:after="50" w:lineRule="exact" w:line="236"/>
-        <w:jc w:val="both"/>
+        <w:keepNext w:val="0"/>
+        <w:spacing w:before="0" w:after="30" w:line="247" w:lineRule="auto"/>
+        <w:ind w:left="259" w:hanging="202"/>
       </w:pPr>
       <w:r>
         <w:rPr>
-          <w:rFonts w:ascii="Calibri" w:hAnsi="Calibri"/>
+          <w:rFonts w:ascii="Calibri" w:hAnsi="Calibri" w:eastAsia="Calibri"/>
           <w:b w:val="0"/>
           <w:i w:val="0"/>
-          <w:color w:val="3A3A3A"/>
-          <w:sz w:val="18"/>
+          <w:caps w:val="0"/>
+          <w:color w:val="1F3A5F"/>
+          <w:sz w:val="21"/>
         </w:rPr>
-        <w:t xml:space="preserve">Operations and finance executive with more than 20 years of experience building businesses, leading mission-driven programs, and creating the systems organizations need to grow. Held full P&amp;L accountability for an $80M portfolio and financial and operational oversight of a 140-person division. Co-founded a fitness business that reached $1M in annual revenue within 24 months, then expanded through a franchise model to $10M in annual sales, with HR, payroll, and benefits infrastructure supporting 50+ employees.</w:t>
-      </w:r>
-    </w:p>
-    <w:p>
-      <w:pPr>
-        <w:spacing w:before="0" w:after="60" w:lineRule="exact" w:line="236"/>
-        <w:jc w:val="both"/>
-      </w:pPr>
-      <w:r>
-        <w:rPr>
-          <w:rFonts w:ascii="Calibri" w:hAnsi="Calibri"/>
-          <w:b w:val="0"/>
-          <w:i w:val="0"/>
-          <w:color w:val="3A3A3A"/>
-          <w:sz w:val="18"/>
-        </w:rPr>
-        <w:t xml:space="preserve">Brings a founder’s understanding of growth and an operator’s discipline in execution. Partners with CEOs, boards, public agencies, and community organizations to evaluate opportunities, align resources, and translate strategy into budgets, partnerships, programs, and operating processes. Experience spans workforce development, social enterprise, financial advisory, logistics, and practical AI implementation.</w:t>
-      </w:r>
-    </w:p>
-    <w:tbl>
-      <w:tblPr>
-        <w:tblW w:type="auto" w:w="0"/>
-        <w:tblLook w:firstColumn="1" w:firstRow="1" w:lastColumn="0" w:lastRow="0" w:noHBand="0" w:noVBand="1" w:val="04A0"/>
-        <w:jc w:val="center"/>
-        <w:tblBorders>
-          <w:top w:val="none" w:sz="0" w:space="0" w:color="auto"/>
-          <w:left w:val="none" w:sz="0" w:space="0" w:color="auto"/>
-          <w:bottom w:val="none" w:sz="0" w:space="0" w:color="auto"/>
-          <w:right w:val="none" w:sz="0" w:space="0" w:color="auto"/>
-          <w:insideH w:val="none" w:sz="0" w:space="0" w:color="auto"/>
-          <w:insideV w:val="none" w:sz="0" w:space="0" w:color="auto"/>
-        </w:tblBorders>
-      </w:tblPr>
-      <w:tblGrid>
-        <w:gridCol w:w="2592"/>
-        <w:gridCol w:w="2592"/>
-        <w:gridCol w:w="2592"/>
-        <w:gridCol w:w="2592"/>
-      </w:tblGrid>
-      <w:tr>
-        <w:tc>
-          <w:tcPr>
-            <w:tcW w:type="dxa" w:w="2592"/>
-            <w:shd w:val="clear" w:color="auto" w:fill="C09628"/>
-            <w:vAlign w:val="center"/>
-          </w:tcPr>
-          <w:p>
-            <w:pPr>
-              <w:spacing w:before="80" w:after="30"/>
-              <w:jc w:val="center"/>
-            </w:pPr>
-            <w:r>
-              <w:rPr>
-                <w:rFonts w:ascii="Calibri" w:hAnsi="Calibri"/>
-                <w:b/>
-                <w:i w:val="0"/>
-                <w:color w:val="FFFFFF"/>
-                <w:sz w:val="30"/>
-              </w:rPr>
-              <w:t xml:space="preserve">$80M</w:t>
-            </w:r>
-          </w:p>
-        </w:tc>
-        <w:tc>
-          <w:tcPr>
-            <w:tcW w:type="dxa" w:w="2592"/>
-            <w:shd w:val="clear" w:color="auto" w:fill="C09628"/>
-            <w:vAlign w:val="center"/>
-          </w:tcPr>
-          <w:p>
-            <w:pPr>
-              <w:spacing w:before="80" w:after="30"/>
-              <w:jc w:val="center"/>
-            </w:pPr>
-            <w:r>
-              <w:rPr>
-                <w:rFonts w:ascii="Calibri" w:hAnsi="Calibri"/>
-                <w:b/>
-                <w:i w:val="0"/>
-                <w:color w:val="FFFFFF"/>
-                <w:sz w:val="30"/>
-              </w:rPr>
-              <w:t xml:space="preserve">140</w:t>
-            </w:r>
-          </w:p>
-        </w:tc>
-        <w:tc>
-          <w:tcPr>
-            <w:tcW w:type="dxa" w:w="2592"/>
-            <w:shd w:val="clear" w:color="auto" w:fill="C09628"/>
-            <w:vAlign w:val="center"/>
-          </w:tcPr>
-          <w:p>
-            <w:pPr>
-              <w:spacing w:before="80" w:after="30"/>
-              <w:jc w:val="center"/>
-            </w:pPr>
-            <w:r>
-              <w:rPr>
-                <w:rFonts w:ascii="Calibri" w:hAnsi="Calibri"/>
-                <w:b/>
-                <w:i w:val="0"/>
-                <w:color w:val="FFFFFF"/>
-                <w:sz w:val="30"/>
-              </w:rPr>
-              <w:t xml:space="preserve">300+</w:t>
-            </w:r>
-          </w:p>
-        </w:tc>
-        <w:tc>
-          <w:tcPr>
-            <w:tcW w:type="dxa" w:w="2592"/>
-            <w:shd w:val="clear" w:color="auto" w:fill="C09628"/>
-            <w:vAlign w:val="center"/>
-          </w:tcPr>
-          <w:p>
-            <w:pPr>
-              <w:spacing w:before="80" w:after="30"/>
-              <w:jc w:val="center"/>
-            </w:pPr>
-            <w:r>
-              <w:rPr>
-                <w:rFonts w:ascii="Calibri" w:hAnsi="Calibri"/>
-                <w:b/>
-                <w:i w:val="0"/>
-                <w:color w:val="FFFFFF"/>
-                <w:sz w:val="30"/>
-              </w:rPr>
-              <w:t xml:space="preserve">$200M</w:t>
-            </w:r>
-          </w:p>
-        </w:tc>
-      </w:tr>
-      <w:tr>
-        <w:tc>
-          <w:tcPr>
-            <w:tcW w:type="dxa" w:w="2592"/>
-            <w:shd w:val="clear" w:color="auto" w:fill="1C1C1C"/>
-            <w:vAlign w:val="center"/>
-          </w:tcPr>
-          <w:p>
-            <w:pPr>
-              <w:spacing w:before="40" w:after="80"/>
-              <w:jc w:val="center"/>
-            </w:pPr>
-            <w:r>
-              <w:rPr>
-                <w:rFonts w:ascii="Calibri" w:hAnsi="Calibri"/>
-                <w:b w:val="0"/>
-                <w:i w:val="0"/>
-                <w:color w:val="FFFFFF"/>
-                <w:sz w:val="15"/>
-              </w:rPr>
-              <w:t xml:space="preserve">P&amp;L portfolio led</w:t>
-            </w:r>
-          </w:p>
-        </w:tc>
-        <w:tc>
-          <w:tcPr>
-            <w:tcW w:type="dxa" w:w="2592"/>
-            <w:shd w:val="clear" w:color="auto" w:fill="1C1C1C"/>
-            <w:vAlign w:val="center"/>
-          </w:tcPr>
-          <w:p>
-            <w:pPr>
-              <w:spacing w:before="40" w:after="80"/>
-              <w:jc w:val="center"/>
-            </w:pPr>
-            <w:r>
-              <w:rPr>
-                <w:rFonts w:ascii="Calibri" w:hAnsi="Calibri"/>
-                <w:b w:val="0"/>
-                <w:i w:val="0"/>
-                <w:color w:val="FFFFFF"/>
-                <w:sz w:val="15"/>
-              </w:rPr>
-              <w:t xml:space="preserve">Person division overseen</w:t>
-            </w:r>
-          </w:p>
-        </w:tc>
-        <w:tc>
-          <w:tcPr>
-            <w:tcW w:type="dxa" w:w="2592"/>
-            <w:shd w:val="clear" w:color="auto" w:fill="1C1C1C"/>
-            <w:vAlign w:val="center"/>
-          </w:tcPr>
-          <w:p>
-            <w:pPr>
-              <w:spacing w:before="40" w:after="80"/>
-              <w:jc w:val="center"/>
-            </w:pPr>
-            <w:r>
-              <w:rPr>
-                <w:rFonts w:ascii="Calibri" w:hAnsi="Calibri"/>
-                <w:b w:val="0"/>
-                <w:i w:val="0"/>
-                <w:color w:val="FFFFFF"/>
-                <w:sz w:val="15"/>
-              </w:rPr>
-              <w:t xml:space="preserve">Participants served annually</w:t>
-            </w:r>
-          </w:p>
-        </w:tc>
-        <w:tc>
-          <w:tcPr>
-            <w:tcW w:type="dxa" w:w="2592"/>
-            <w:shd w:val="clear" w:color="auto" w:fill="1C1C1C"/>
-            <w:vAlign w:val="center"/>
-          </w:tcPr>
-          <w:p>
-            <w:pPr>
-              <w:spacing w:before="40" w:after="80"/>
-              <w:jc w:val="center"/>
-            </w:pPr>
-            <w:r>
-              <w:rPr>
-                <w:rFonts w:ascii="Calibri" w:hAnsi="Calibri"/>
-                <w:b w:val="0"/>
-                <w:i w:val="0"/>
-                <w:color w:val="FFFFFF"/>
-                <w:sz w:val="15"/>
-              </w:rPr>
-              <w:t xml:space="preserve">Banking initiative structured</w:t>
-            </w:r>
-          </w:p>
-        </w:tc>
-      </w:tr>
-    </w:tbl>
-    <w:p>
-      <w:pPr>
-        <w:keepNext/>
-        <w:spacing w:before="120" w:after="40"/>
-        <w:pBdr>
-          <w:bottom w:val="single" w:sz="8" w:space="1" w:color="C09628"/>
-        </w:pBdr>
-      </w:pPr>
-    </w:p>
-    <w:p>
-      <w:pPr>
-        <w:keepNext/>
-        <w:spacing w:before="0" w:after="60"/>
-        <w:ind w:left="0"/>
-      </w:pPr>
-      <w:r>
-        <w:rPr>
-          <w:rFonts w:ascii="Calibri" w:hAnsi="Calibri"/>
-          <w:b/>
-          <w:i w:val="0"/>
-          <w:color w:val="C09628"/>
-          <w:sz w:val="19"/>
-        </w:rPr>
-        <w:t xml:space="preserve">SELECTED LEADERSHIP RESULTS</w:t>
-      </w:r>
-    </w:p>
-    <w:p>
-      <w:pPr>
-        <w:spacing w:before="14" w:after="14" w:lineRule="exact" w:line="228"/>
-        <w:ind w:left="187" w:hanging="187"/>
-      </w:pPr>
-      <w:r>
-        <w:rPr>
-          <w:rFonts w:ascii="Calibri" w:hAnsi="Calibri"/>
-          <w:b w:val="0"/>
-          <w:i w:val="0"/>
-          <w:color w:val="C09628"/>
-          <w:sz w:val="18"/>
-        </w:rPr>
-        <w:t xml:space="preserve">• </w:t>
+        <w:t xml:space="preserve">•  </w:t>
       </w:r>
       <w:r>
         <w:rPr>
-          <w:rFonts w:ascii="Calibri" w:hAnsi="Calibri"/>
+          <w:rFonts w:ascii="Calibri" w:hAnsi="Calibri" w:eastAsia="Calibri"/>
           <w:b/>
           <w:i w:val="0"/>
-          <w:color w:val="1C1C1C"/>
-          <w:sz w:val="18"/>
+          <w:caps w:val="0"/>
+          <w:color w:val="222222"/>
+          <w:sz w:val="21"/>
         </w:rPr>
         <w:t xml:space="preserve">Built and expanded a business: </w:t>
       </w:r>
       <w:r>
         <w:rPr>
-          <w:rFonts w:ascii="Calibri" w:hAnsi="Calibri"/>
+          <w:rFonts w:ascii="Calibri" w:hAnsi="Calibri" w:eastAsia="Calibri"/>
           <w:b w:val="0"/>
           <w:i w:val="0"/>
-          <w:color w:val="3A3A3A"/>
-          <w:sz w:val="18"/>
+          <w:caps w:val="0"/>
+          <w:color w:val="222222"/>
+          <w:sz w:val="21"/>
         </w:rPr>
-        <w:t xml:space="preserve">Grew Fitness Collective from a $5,000 investment, established a franchise model, and launched three additional locations.</w:t>
+        <w:t>Grew Fitness Collective from a $5,000 investment to $10M in annual sales, establishing a franchise model and launching three additional locations.</w:t>
       </w:r>
     </w:p>
     <w:p>
       <w:pPr>
-        <w:spacing w:before="14" w:after="14" w:lineRule="exact" w:line="228"/>
-        <w:ind w:left="187" w:hanging="187"/>
+        <w:keepNext w:val="0"/>
+        <w:spacing w:before="0" w:after="30" w:line="247" w:lineRule="auto"/>
+        <w:ind w:left="259" w:hanging="202"/>
       </w:pPr>
       <w:r>
         <w:rPr>
-          <w:rFonts w:ascii="Calibri" w:hAnsi="Calibri"/>
+          <w:rFonts w:ascii="Calibri" w:hAnsi="Calibri" w:eastAsia="Calibri"/>
           <w:b w:val="0"/>
           <w:i w:val="0"/>
-          <w:color w:val="C09628"/>
-          <w:sz w:val="18"/>
+          <w:caps w:val="0"/>
+          <w:color w:val="1F3A5F"/>
+          <w:sz w:val="21"/>
         </w:rPr>
-        <w:t xml:space="preserve">• </w:t>
+        <w:t xml:space="preserve">•  </w:t>
       </w:r>
       <w:r>
         <w:rPr>
-          <w:rFonts w:ascii="Calibri" w:hAnsi="Calibri"/>
+          <w:rFonts w:ascii="Calibri" w:hAnsi="Calibri" w:eastAsia="Calibri"/>
           <w:b/>
           <w:i w:val="0"/>
-          <w:color w:val="1C1C1C"/>
-          <w:sz w:val="18"/>
+          <w:caps w:val="0"/>
+          <w:color w:val="222222"/>
+          <w:sz w:val="21"/>
         </w:rPr>
         <w:t xml:space="preserve">Led at substantial scale: </w:t>
       </w:r>
       <w:r>
         <w:rPr>
-          <w:rFonts w:ascii="Calibri" w:hAnsi="Calibri"/>
+          <w:rFonts w:ascii="Calibri" w:hAnsi="Calibri" w:eastAsia="Calibri"/>
           <w:b w:val="0"/>
           <w:i w:val="0"/>
-          <w:color w:val="3A3A3A"/>
-          <w:sz w:val="18"/>
+          <w:caps w:val="0"/>
+          <w:color w:val="222222"/>
+          <w:sz w:val="21"/>
         </w:rPr>
-        <w:t xml:space="preserve">Oversaw a 140-person division at Osborne Association, connecting financial accountability, workforce development, partnerships, and service delivery.</w:t>
+        <w:t>Oversaw a 140-person division and an $80M P&amp;L at Osborne Association, connecting financial accountability, workforce development, partnerships, and service delivery.</w:t>
       </w:r>
     </w:p>
     <w:p>
       <w:pPr>
-        <w:spacing w:before="14" w:after="14" w:lineRule="exact" w:line="228"/>
-        <w:ind w:left="187" w:hanging="187"/>
+        <w:keepNext w:val="0"/>
+        <w:spacing w:before="0" w:after="30" w:line="247" w:lineRule="auto"/>
+        <w:ind w:left="259" w:hanging="202"/>
       </w:pPr>
       <w:r>
         <w:rPr>
-          <w:rFonts w:ascii="Calibri" w:hAnsi="Calibri"/>
+          <w:rFonts w:ascii="Calibri" w:hAnsi="Calibri" w:eastAsia="Calibri"/>
           <w:b w:val="0"/>
           <w:i w:val="0"/>
-          <w:color w:val="C09628"/>
-          <w:sz w:val="18"/>
+          <w:caps w:val="0"/>
+          <w:color w:val="1F3A5F"/>
+          <w:sz w:val="21"/>
         </w:rPr>
-        <w:t xml:space="preserve">• </w:t>
+        <w:t xml:space="preserve">•  </w:t>
       </w:r>
       <w:r>
         <w:rPr>
-          <w:rFonts w:ascii="Calibri" w:hAnsi="Calibri"/>
+          <w:rFonts w:ascii="Calibri" w:hAnsi="Calibri" w:eastAsia="Calibri"/>
           <w:b/>
           <w:i w:val="0"/>
-          <w:color w:val="1C1C1C"/>
-          <w:sz w:val="18"/>
+          <w:caps w:val="0"/>
+          <w:color w:val="222222"/>
+          <w:sz w:val="21"/>
         </w:rPr>
         <w:t xml:space="preserve">Created mission-driven programs: </w:t>
       </w:r>
       <w:r>
         <w:rPr>
-          <w:rFonts w:ascii="Calibri" w:hAnsi="Calibri"/>
+          <w:rFonts w:ascii="Calibri" w:hAnsi="Calibri" w:eastAsia="Calibri"/>
           <w:b w:val="0"/>
           <w:i w:val="0"/>
-          <w:color w:val="3A3A3A"/>
-          <w:sz w:val="18"/>
+          <w:caps w:val="0"/>
+          <w:color w:val="222222"/>
+          <w:sz w:val="21"/>
         </w:rPr>
-        <w:t xml:space="preserve">Led a nine-month transitional-employment program serving 300+ formerly incarcerated people annually; created and delivered an NYPA clean-energy workforce project over 18 months.</w:t>
+        <w:t>Led a nine-month transitional-employment program serving 300+ formerly incarcerated people annually; created and delivered an 18-month NYPA clean-energy workforce project.</w:t>
       </w:r>
     </w:p>
     <w:p>
       <w:pPr>
-        <w:spacing w:before="14" w:after="14" w:lineRule="exact" w:line="228"/>
-        <w:ind w:left="187" w:hanging="187"/>
+        <w:keepNext w:val="0"/>
+        <w:spacing w:before="0" w:after="30" w:line="247" w:lineRule="auto"/>
+        <w:ind w:left="259" w:hanging="202"/>
       </w:pPr>
       <w:r>
         <w:rPr>
-          <w:rFonts w:ascii="Calibri" w:hAnsi="Calibri"/>
+          <w:rFonts w:ascii="Calibri" w:hAnsi="Calibri" w:eastAsia="Calibri"/>
           <w:b w:val="0"/>
           <w:i w:val="0"/>
-          <w:color w:val="C09628"/>
-          <w:sz w:val="18"/>
+          <w:caps w:val="0"/>
+          <w:color w:val="1F3A5F"/>
+          <w:sz w:val="21"/>
         </w:rPr>
-        <w:t xml:space="preserve">• </w:t>
+        <w:t xml:space="preserve">•  </w:t>
       </w:r>
       <w:r>
         <w:rPr>
-          <w:rFonts w:ascii="Calibri" w:hAnsi="Calibri"/>
+          <w:rFonts w:ascii="Calibri" w:hAnsi="Calibri" w:eastAsia="Calibri"/>
           <w:b/>
           <w:i w:val="0"/>
-          <w:color w:val="1C1C1C"/>
-          <w:sz w:val="18"/>
+          <w:caps w:val="0"/>
+          <w:color w:val="222222"/>
+          <w:sz w:val="21"/>
         </w:rPr>
         <w:t xml:space="preserve">Improved operating performance: </w:t>
       </w:r>
       <w:r>
         <w:rPr>
-          <w:rFonts w:ascii="Calibri" w:hAnsi="Calibri"/>
+          <w:rFonts w:ascii="Calibri" w:hAnsi="Calibri" w:eastAsia="Calibri"/>
           <w:b w:val="0"/>
           <w:i w:val="0"/>
-          <w:color w:val="3A3A3A"/>
-          <w:sz w:val="18"/>
+          <w:caps w:val="0"/>
+          <w:color w:val="222222"/>
+          <w:sz w:val="21"/>
         </w:rPr>
-        <w:t xml:space="preserve">Reduced vendor costs 35% and processing time 60% at Alluel through negotiations and systems improvements.</w:t>
+        <w:t>Cut vendor costs 35% and processing time 60% at Alluel Logistics through negotiation and systems improvements.</w:t>
       </w:r>
     </w:p>
     <w:p>
       <w:pPr>
         <w:keepNext/>
-        <w:spacing w:before="120" w:after="40"/>
+        <w:spacing w:before="160" w:after="60" w:line="240" w:lineRule="auto"/>
         <w:pBdr>
-          <w:bottom w:val="single" w:sz="8" w:space="1" w:color="C09628"/>
+          <w:bottom w:val="single" w:sz="8" w:space="1" w:color="1F3A5F"/>
         </w:pBdr>
-      </w:pPr>
-    </w:p>
-    <w:p>
-      <w:pPr>
-        <w:keepNext/>
-        <w:spacing w:before="0" w:after="60"/>
-        <w:ind w:left="0"/>
       </w:pPr>
       <w:r>
         <w:rPr>
-          <w:rFonts w:ascii="Calibri" w:hAnsi="Calibri"/>
+          <w:rFonts w:ascii="Calibri" w:hAnsi="Calibri" w:eastAsia="Calibri"/>
           <w:b/>
           <w:i w:val="0"/>
-          <w:color w:val="C09628"/>
-          <w:sz w:val="19"/>
+          <w:caps/>
+          <w:color w:val="1F3A5F"/>
+          <w:sz w:val="23"/>
         </w:rPr>
-        <w:t xml:space="preserve">CORE EXPERTISE</w:t>
+        <w:t>Core Expertise</w:t>
       </w:r>
     </w:p>
     <w:p>
       <w:pPr>
-        <w:spacing w:before="20" w:after="40" w:lineRule="exact" w:line="230"/>
-        <w:jc w:val="center"/>
+        <w:keepNext w:val="0"/>
+        <w:spacing w:before="0" w:after="20" w:line="264" w:lineRule="auto"/>
       </w:pPr>
       <w:r>
         <w:rPr>
-          <w:rFonts w:ascii="Calibri" w:hAnsi="Calibri"/>
+          <w:rFonts w:ascii="Calibri" w:hAnsi="Calibri" w:eastAsia="Calibri"/>
           <w:b w:val="0"/>
           <w:i w:val="0"/>
-          <w:color w:val="3A3A3A"/>
-          <w:sz w:val="17"/>
+          <w:caps w:val="0"/>
+          <w:color w:val="222222"/>
+          <w:sz w:val="21"/>
         </w:rPr>
-        <w:t xml:space="preserve">Organizational Growth  •  General Management  •  P&amp;L Leadership  •  Budgeting &amp; Resource Allocation  •  CEO &amp; Board Partnership  •  People Operations  •  Program Development  •  Coalition Building  •  Fundraising &amp; Grant Stewardship  •  Risk Management  •  Performance Reporting  •  Technology &amp; Process Improvement</w:t>
+        <w:t>Organizational Growth  |  General Management  |  P&amp;L Leadership  |  Budgeting &amp; Resource Allocation  |  CEO &amp; Board Partnership  |  People Operations  |  Program Development  |  Coalition Building  |  Fundraising &amp; Grant Stewardship  |  Risk Management  |  Performance Reporting &amp; KPIs  |  Technology &amp; Process Improvement  |  Workforce Development  |  Social Enterprise  |  Practical AI Implementation</w:t>
       </w:r>
     </w:p>
     <w:p>
       <w:pPr>
         <w:keepNext/>
-        <w:spacing w:before="120" w:after="40"/>
+        <w:spacing w:before="160" w:after="60" w:line="240" w:lineRule="auto"/>
         <w:pBdr>
-          <w:bottom w:val="single" w:sz="8" w:space="1" w:color="C09628"/>
+          <w:bottom w:val="single" w:sz="8" w:space="1" w:color="1F3A5F"/>
         </w:pBdr>
-      </w:pPr>
-    </w:p>
-    <w:p>
-      <w:pPr>
-        <w:keepNext/>
-        <w:spacing w:before="0" w:after="60"/>
-        <w:ind w:left="0"/>
       </w:pPr>
       <w:r>
         <w:rPr>
-          <w:rFonts w:ascii="Calibri" w:hAnsi="Calibri"/>
+          <w:rFonts w:ascii="Calibri" w:hAnsi="Calibri" w:eastAsia="Calibri"/>
           <w:b/>
           <w:i w:val="0"/>
-          <w:color w:val="C09628"/>
-          <w:sz w:val="19"/>
+          <w:caps/>
+          <w:color w:val="1F3A5F"/>
+          <w:sz w:val="23"/>
         </w:rPr>
-        <w:t xml:space="preserve">PROFESSIONAL EXPERIENCE</w:t>
-      </w:r>
-    </w:p>
-    <w:tbl>
-      <w:tblPr>
-        <w:tblW w:type="auto" w:w="0"/>
-        <w:tblLook w:firstColumn="1" w:firstRow="1" w:lastColumn="0" w:lastRow="0" w:noHBand="0" w:noVBand="1" w:val="04A0"/>
-        <w:jc w:val="left"/>
-        <w:tblBorders>
-          <w:top w:val="none" w:sz="0" w:space="0" w:color="auto"/>
-          <w:left w:val="none" w:sz="0" w:space="0" w:color="auto"/>
-          <w:bottom w:val="none" w:sz="0" w:space="0" w:color="auto"/>
-          <w:right w:val="none" w:sz="0" w:space="0" w:color="auto"/>
-          <w:insideH w:val="none" w:sz="0" w:space="0" w:color="auto"/>
-          <w:insideV w:val="none" w:sz="0" w:space="0" w:color="auto"/>
-        </w:tblBorders>
-      </w:tblPr>
-      <w:tblGrid>
-        <w:gridCol w:w="7368"/>
-        <w:gridCol w:w="3000"/>
-      </w:tblGrid>
-      <w:tr>
-        <w:tc>
-          <w:tcPr>
-            <w:tcW w:type="dxa" w:w="7368"/>
-          </w:tcPr>
-          <w:p>
-            <w:pPr>
-              <w:keepNext/>
-              <w:spacing w:before="90" w:after="0"/>
-            </w:pPr>
-            <w:r>
-              <w:rPr>
-                <w:rFonts w:ascii="Calibri" w:hAnsi="Calibri"/>
-                <w:b/>
-                <w:i w:val="0"/>
-                <w:color w:val="1C1C1C"/>
-                <w:sz w:val="19"/>
-              </w:rPr>
-              <w:t xml:space="preserve">MAROON STRATEGIST, LLC</w:t>
-            </w:r>
-            <w:r>
-              <w:rPr>
-                <w:rFonts w:ascii="Calibri" w:hAnsi="Calibri"/>
-                <w:b w:val="0"/>
-                <w:i w:val="0"/>
-                <w:color w:val="555555"/>
-                <w:sz w:val="17"/>
-              </w:rPr>
-              <w:t xml:space="preserve">  |  Brooklyn, NY</w:t>
-            </w:r>
-          </w:p>
-        </w:tc>
-        <w:tc>
-          <w:tcPr>
-            <w:tcW w:type="dxa" w:w="3000"/>
-          </w:tcPr>
-          <w:p>
-            <w:pPr>
-              <w:keepNext/>
-              <w:spacing w:before="90" w:after="0"/>
-              <w:jc w:val="right"/>
-            </w:pPr>
-            <w:r>
-              <w:rPr>
-                <w:rFonts w:ascii="Calibri" w:hAnsi="Calibri"/>
-                <w:b/>
-                <w:i w:val="0"/>
-                <w:color w:val="C09628"/>
-                <w:sz w:val="18"/>
-              </w:rPr>
-              <w:t xml:space="preserve">Mar 2024–Present</w:t>
-            </w:r>
-          </w:p>
-        </w:tc>
-      </w:tr>
-    </w:tbl>
-    <w:p>
-      <w:pPr>
-        <w:keepNext/>
-        <w:spacing w:before="0" w:after="20"/>
-      </w:pPr>
-      <w:r>
-        <w:rPr>
-          <w:rFonts w:ascii="Calibri" w:hAnsi="Calibri"/>
-          <w:b w:val="0"/>
-          <w:i/>
-          <w:color w:val="1C1C1C"/>
-          <w:sz w:val="18"/>
-        </w:rPr>
-        <w:t xml:space="preserve">Chief Financial Strategy Officer</w:t>
+        <w:t>Professional Experience</w:t>
       </w:r>
     </w:p>
     <w:p>
       <w:pPr>
         <w:keepNext/>
-        <w:spacing w:before="0" w:after="30" w:lineRule="exact" w:line="220"/>
+        <w:tabs>
+          <w:tab w:pos="10368" w:val="right"/>
+        </w:tabs>
+        <w:spacing w:before="120" w:after="0" w:line="240" w:lineRule="auto"/>
       </w:pPr>
       <w:r>
         <w:rPr>
-          <w:rFonts w:ascii="Calibri" w:hAnsi="Calibri"/>
-          <w:b w:val="0"/>
-          <w:i/>
-          <w:color w:val="555555"/>
-          <w:sz w:val="17"/>
+          <w:rFonts w:ascii="Calibri" w:hAnsi="Calibri" w:eastAsia="Calibri"/>
+          <w:b/>
+          <w:i w:val="0"/>
+          <w:caps w:val="0"/>
+          <w:color w:val="1F3A5F"/>
+          <w:sz w:val="21"/>
         </w:rPr>
-        <w:t xml:space="preserve">Fractional CFO and program leadership across nonprofit, public-sector, education, healthcare, personal services, tax advisory, event planning, and other business operations.</w:t>
-      </w:r>
-    </w:p>
-    <w:p>
-      <w:pPr>
-        <w:spacing w:before="14" w:after="14" w:lineRule="exact" w:line="228"/>
-        <w:ind w:left="187" w:hanging="187"/>
-      </w:pPr>
-      <w:r>
-        <w:rPr>
-          <w:rFonts w:ascii="Calibri" w:hAnsi="Calibri"/>
-          <w:b w:val="0"/>
-          <w:i w:val="0"/>
-          <w:color w:val="C09628"/>
-          <w:sz w:val="18"/>
-        </w:rPr>
-        <w:t xml:space="preserve">• </w:t>
+        <w:t>MAROON STRATEGIST, LLC</w:t>
       </w:r>
       <w:r>
         <w:rPr>
-          <w:rFonts w:ascii="Calibri" w:hAnsi="Calibri"/>
+          <w:rFonts w:ascii="Calibri" w:hAnsi="Calibri" w:eastAsia="Calibri"/>
           <w:b w:val="0"/>
           <w:i w:val="0"/>
-          <w:color w:val="3A3A3A"/>
-          <w:sz w:val="18"/>
+          <w:caps w:val="0"/>
+          <w:color w:val="555555"/>
+          <w:sz w:val="21"/>
         </w:rPr>
-        <w:t xml:space="preserve">Created and led the NYPA clean-energy workforce training project from inception through final delivery over 18 months, overseeing proposal development, program design, budgeting, partner coordination, and participant training.</w:t>
-      </w:r>
-    </w:p>
-    <w:p>
-      <w:pPr>
-        <w:spacing w:before="14" w:after="14" w:lineRule="exact" w:line="228"/>
-        <w:ind w:left="187" w:hanging="187"/>
-      </w:pPr>
-      <w:r>
-        <w:rPr>
-          <w:rFonts w:ascii="Calibri" w:hAnsi="Calibri"/>
-          <w:b w:val="0"/>
-          <w:i w:val="0"/>
-          <w:color w:val="C09628"/>
-          <w:sz w:val="18"/>
-        </w:rPr>
-        <w:t xml:space="preserve">• </w:t>
+        <w:t xml:space="preserve">  |  Brooklyn, NY</w:t>
       </w:r>
       <w:r>
         <w:rPr>
-          <w:rFonts w:ascii="Calibri" w:hAnsi="Calibri"/>
-          <w:b w:val="0"/>
+          <w:rFonts w:ascii="Calibri" w:hAnsi="Calibri" w:eastAsia="Calibri"/>
+          <w:b/>
           <w:i w:val="0"/>
-          <w:color w:val="3A3A3A"/>
-          <w:sz w:val="18"/>
+          <w:caps w:val="0"/>
+          <w:color w:val="222222"/>
+          <w:sz w:val="21"/>
         </w:rPr>
-        <w:t xml:space="preserve">Built a workforce coalition spanning city and state agencies, elected officials, academic partners, Stanford Innovation Lab, KPMG, and the New York Power Authority, coordinating responsibilities and resources around energy training.</w:t>
-      </w:r>
-    </w:p>
-    <w:p>
-      <w:pPr>
-        <w:spacing w:before="14" w:after="14" w:lineRule="exact" w:line="228"/>
-        <w:ind w:left="187" w:hanging="187"/>
-      </w:pPr>
-      <w:r>
-        <w:rPr>
-          <w:rFonts w:ascii="Calibri" w:hAnsi="Calibri"/>
-          <w:b w:val="0"/>
-          <w:i w:val="0"/>
-          <w:color w:val="C09628"/>
-          <w:sz w:val="18"/>
-        </w:rPr>
-        <w:t xml:space="preserve">• </w:t>
-      </w:r>
-      <w:r>
-        <w:rPr>
-          <w:rFonts w:ascii="Calibri" w:hAnsi="Calibri"/>
-          <w:b w:val="0"/>
-          <w:i w:val="0"/>
-          <w:color w:val="3A3A3A"/>
-          <w:sz w:val="18"/>
-        </w:rPr>
-        <w:t xml:space="preserve">Developed and managed a multimillion-dollar project budget, allocating direct and indirect costs, managing restricted cash flow, and aligning expenditures with grant requirements and delivery milestones.</w:t>
-      </w:r>
-    </w:p>
-    <w:p>
-      <w:pPr>
-        <w:spacing w:before="14" w:after="14" w:lineRule="exact" w:line="228"/>
-        <w:ind w:left="187" w:hanging="187"/>
-      </w:pPr>
-      <w:r>
-        <w:rPr>
-          <w:rFonts w:ascii="Calibri" w:hAnsi="Calibri"/>
-          <w:b w:val="0"/>
-          <w:i w:val="0"/>
-          <w:color w:val="C09628"/>
-          <w:sz w:val="18"/>
-        </w:rPr>
-        <w:t xml:space="preserve">• </w:t>
-      </w:r>
-      <w:r>
-        <w:rPr>
-          <w:rFonts w:ascii="Calibri" w:hAnsi="Calibri"/>
-          <w:b w:val="0"/>
-          <w:i w:val="0"/>
-          <w:color w:val="3A3A3A"/>
-          <w:sz w:val="18"/>
-        </w:rPr>
-        <w:t xml:space="preserve">Led fundraising and partnership-agreement development, connecting funding commitments, partner responsibilities, and implementation needs.</w:t>
-      </w:r>
-    </w:p>
-    <w:p>
-      <w:pPr>
-        <w:spacing w:before="14" w:after="14" w:lineRule="exact" w:line="228"/>
-        <w:ind w:left="187" w:hanging="187"/>
-      </w:pPr>
-      <w:r>
-        <w:rPr>
-          <w:rFonts w:ascii="Calibri" w:hAnsi="Calibri"/>
-          <w:b w:val="0"/>
-          <w:i w:val="0"/>
-          <w:color w:val="C09628"/>
-          <w:sz w:val="18"/>
-        </w:rPr>
-        <w:t xml:space="preserve">• </w:t>
-      </w:r>
-      <w:r>
-        <w:rPr>
-          <w:rFonts w:ascii="Calibri" w:hAnsi="Calibri"/>
-          <w:b w:val="0"/>
-          <w:i w:val="0"/>
-          <w:color w:val="3A3A3A"/>
-          <w:sz w:val="18"/>
-        </w:rPr>
-        <w:t xml:space="preserve">Direct budgeting, forecasting, cash management, and multi-entity financial planning; advise leaders on financing, working capital, and growth priorities.</w:t>
-      </w:r>
-    </w:p>
-    <w:p>
-      <w:pPr>
-        <w:spacing w:before="14" w:after="14" w:lineRule="exact" w:line="228"/>
-        <w:ind w:left="187" w:hanging="187"/>
-      </w:pPr>
-      <w:r>
-        <w:rPr>
-          <w:rFonts w:ascii="Calibri" w:hAnsi="Calibri"/>
-          <w:b w:val="0"/>
-          <w:i w:val="0"/>
-          <w:color w:val="C09628"/>
-          <w:sz w:val="18"/>
-        </w:rPr>
-        <w:t xml:space="preserve">• </w:t>
-      </w:r>
-      <w:r>
-        <w:rPr>
-          <w:rFonts w:ascii="Calibri" w:hAnsi="Calibri"/>
-          <w:b w:val="0"/>
-          <w:i w:val="0"/>
-          <w:color w:val="3A3A3A"/>
-          <w:sz w:val="18"/>
-        </w:rPr>
-        <w:t xml:space="preserve">Build financial models, KPI dashboards, and SOPs; coordinate financial cleanup and reporting remediation with clients, accountants, and stakeholders.</w:t>
-      </w:r>
-    </w:p>
-    <w:tbl>
-      <w:tblPr>
-        <w:tblW w:type="auto" w:w="0"/>
-        <w:tblLook w:firstColumn="1" w:firstRow="1" w:lastColumn="0" w:lastRow="0" w:noHBand="0" w:noVBand="1" w:val="04A0"/>
-        <w:jc w:val="left"/>
-        <w:tblBorders>
-          <w:top w:val="none" w:sz="0" w:space="0" w:color="auto"/>
-          <w:left w:val="none" w:sz="0" w:space="0" w:color="auto"/>
-          <w:bottom w:val="none" w:sz="0" w:space="0" w:color="auto"/>
-          <w:right w:val="none" w:sz="0" w:space="0" w:color="auto"/>
-          <w:insideH w:val="none" w:sz="0" w:space="0" w:color="auto"/>
-          <w:insideV w:val="none" w:sz="0" w:space="0" w:color="auto"/>
-        </w:tblBorders>
-      </w:tblPr>
-      <w:tblGrid>
-        <w:gridCol w:w="7368"/>
-        <w:gridCol w:w="3000"/>
-      </w:tblGrid>
-      <w:tr>
-        <w:tc>
-          <w:tcPr>
-            <w:tcW w:type="dxa" w:w="7368"/>
-          </w:tcPr>
-          <w:p>
-            <w:pPr>
-              <w:keepNext/>
-              <w:spacing w:before="90" w:after="0"/>
-            </w:pPr>
-            <w:r>
-              <w:rPr>
-                <w:rFonts w:ascii="Calibri" w:hAnsi="Calibri"/>
-                <w:b/>
-                <w:i w:val="0"/>
-                <w:color w:val="1C1C1C"/>
-                <w:sz w:val="19"/>
-              </w:rPr>
-              <w:t xml:space="preserve">OSBORNE ASSOCIATION</w:t>
-            </w:r>
-            <w:r>
-              <w:rPr>
-                <w:rFonts w:ascii="Calibri" w:hAnsi="Calibri"/>
-                <w:b w:val="0"/>
-                <w:i w:val="0"/>
-                <w:color w:val="555555"/>
-                <w:sz w:val="17"/>
-              </w:rPr>
-              <w:t xml:space="preserve">  |  New York, NY</w:t>
-            </w:r>
-          </w:p>
-        </w:tc>
-        <w:tc>
-          <w:tcPr>
-            <w:tcW w:type="dxa" w:w="3000"/>
-          </w:tcPr>
-          <w:p>
-            <w:pPr>
-              <w:keepNext/>
-              <w:spacing w:before="90" w:after="0"/>
-              <w:jc w:val="right"/>
-            </w:pPr>
-            <w:r>
-              <w:rPr>
-                <w:rFonts w:ascii="Calibri" w:hAnsi="Calibri"/>
-                <w:b/>
-                <w:i w:val="0"/>
-                <w:color w:val="C09628"/>
-                <w:sz w:val="18"/>
-              </w:rPr>
-              <w:t xml:space="preserve">Jan 2023–Oct 2025</w:t>
-            </w:r>
-          </w:p>
-        </w:tc>
-      </w:tr>
-    </w:tbl>
-    <w:p>
-      <w:pPr>
-        <w:keepNext/>
-        <w:spacing w:before="0" w:after="20"/>
-      </w:pPr>
-      <w:r>
-        <w:rPr>
-          <w:rFonts w:ascii="Calibri" w:hAnsi="Calibri"/>
-          <w:b w:val="0"/>
-          <w:i/>
-          <w:color w:val="1C1C1C"/>
-          <w:sz w:val="18"/>
-        </w:rPr>
-        <w:t xml:space="preserve">Vice President, Business Development &amp; Social Ventures</w:t>
+        <w:tab/>
+        <w:t>Mar 2024 – Present</w:t>
       </w:r>
     </w:p>
     <w:p>
       <w:pPr>
         <w:keepNext/>
-        <w:spacing w:before="0" w:after="30" w:lineRule="exact" w:line="220"/>
+        <w:spacing w:before="0" w:after="20" w:line="240" w:lineRule="auto"/>
       </w:pPr>
       <w:r>
         <w:rPr>
-          <w:rFonts w:ascii="Calibri" w:hAnsi="Calibri"/>
-          <w:b w:val="0"/>
+          <w:rFonts w:ascii="Calibri" w:hAnsi="Calibri" w:eastAsia="Calibri"/>
+          <w:b/>
           <w:i/>
-          <w:color w:val="555555"/>
-          <w:sz w:val="17"/>
+          <w:caps w:val="0"/>
+          <w:color w:val="222222"/>
+          <w:sz w:val="21"/>
         </w:rPr>
-        <w:t xml:space="preserve">Financial and operational oversight of a 140-person division in a human-services organization supporting people affected by the criminal legal system.</w:t>
-      </w:r>
-    </w:p>
-    <w:p>
-      <w:pPr>
-        <w:spacing w:before="14" w:after="14" w:lineRule="exact" w:line="228"/>
-        <w:ind w:left="187" w:hanging="187"/>
-      </w:pPr>
-      <w:r>
-        <w:rPr>
-          <w:rFonts w:ascii="Calibri" w:hAnsi="Calibri"/>
-          <w:b w:val="0"/>
-          <w:i w:val="0"/>
-          <w:color w:val="C09628"/>
-          <w:sz w:val="18"/>
-        </w:rPr>
-        <w:t xml:space="preserve">• </w:t>
-      </w:r>
-      <w:r>
-        <w:rPr>
-          <w:rFonts w:ascii="Calibri" w:hAnsi="Calibri"/>
-          <w:b w:val="0"/>
-          <w:i w:val="0"/>
-          <w:color w:val="3A3A3A"/>
-          <w:sz w:val="18"/>
-        </w:rPr>
-        <w:t xml:space="preserve">Held full P&amp;L accountability for an $80M portfolio, aligning budgets, staffing, partnerships, and program priorities.</w:t>
-      </w:r>
-    </w:p>
-    <w:p>
-      <w:pPr>
-        <w:spacing w:before="14" w:after="14" w:lineRule="exact" w:line="228"/>
-        <w:ind w:left="187" w:hanging="187"/>
-      </w:pPr>
-      <w:r>
-        <w:rPr>
-          <w:rFonts w:ascii="Calibri" w:hAnsi="Calibri"/>
-          <w:b w:val="0"/>
-          <w:i w:val="0"/>
-          <w:color w:val="C09628"/>
-          <w:sz w:val="18"/>
-        </w:rPr>
-        <w:t xml:space="preserve">• </w:t>
-      </w:r>
-      <w:r>
-        <w:rPr>
-          <w:rFonts w:ascii="Calibri" w:hAnsi="Calibri"/>
-          <w:b w:val="0"/>
-          <w:i w:val="0"/>
-          <w:color w:val="3A3A3A"/>
-          <w:sz w:val="18"/>
-        </w:rPr>
-        <w:t xml:space="preserve">Partnered with the CEO and Board on long-range planning, risk management, resource allocation, and organizational growth.</w:t>
-      </w:r>
-    </w:p>
-    <w:p>
-      <w:pPr>
-        <w:spacing w:before="14" w:after="14" w:lineRule="exact" w:line="228"/>
-        <w:ind w:left="187" w:hanging="187"/>
-      </w:pPr>
-      <w:r>
-        <w:rPr>
-          <w:rFonts w:ascii="Calibri" w:hAnsi="Calibri"/>
-          <w:b w:val="0"/>
-          <w:i w:val="0"/>
-          <w:color w:val="C09628"/>
-          <w:sz w:val="18"/>
-        </w:rPr>
-        <w:t xml:space="preserve">• </w:t>
-      </w:r>
-      <w:r>
-        <w:rPr>
-          <w:rFonts w:ascii="Calibri" w:hAnsi="Calibri"/>
-          <w:b w:val="0"/>
-          <w:i w:val="0"/>
-          <w:color w:val="3A3A3A"/>
-          <w:sz w:val="18"/>
-        </w:rPr>
-        <w:t xml:space="preserve">Led a nine-month transitional-employment program serving 300+ formerly incarcerated people annually, coordinating employer partnerships and tracking outcomes against funder benchmarks.</w:t>
-      </w:r>
-    </w:p>
-    <w:p>
-      <w:pPr>
-        <w:spacing w:before="14" w:after="14" w:lineRule="exact" w:line="228"/>
-        <w:ind w:left="187" w:hanging="187"/>
-      </w:pPr>
-      <w:r>
-        <w:rPr>
-          <w:rFonts w:ascii="Calibri" w:hAnsi="Calibri"/>
-          <w:b w:val="0"/>
-          <w:i w:val="0"/>
-          <w:color w:val="C09628"/>
-          <w:sz w:val="18"/>
-        </w:rPr>
-        <w:t xml:space="preserve">• </w:t>
-      </w:r>
-      <w:r>
-        <w:rPr>
-          <w:rFonts w:ascii="Calibri" w:hAnsi="Calibri"/>
-          <w:b w:val="0"/>
-          <w:i w:val="0"/>
-          <w:color w:val="3A3A3A"/>
-          <w:sz w:val="18"/>
-        </w:rPr>
-        <w:t xml:space="preserve">Negotiated government, corporate, and philanthropic partnerships and developed earned-income social ventures to support mission delivery.</w:t>
-      </w:r>
-    </w:p>
-    <w:p>
-      <w:pPr>
-        <w:spacing w:before="14" w:after="14" w:lineRule="exact" w:line="228"/>
-        <w:ind w:left="187" w:hanging="187"/>
-      </w:pPr>
-      <w:r>
-        <w:rPr>
-          <w:rFonts w:ascii="Calibri" w:hAnsi="Calibri"/>
-          <w:b w:val="0"/>
-          <w:i w:val="0"/>
-          <w:color w:val="C09628"/>
-          <w:sz w:val="18"/>
-        </w:rPr>
-        <w:t xml:space="preserve">• </w:t>
-      </w:r>
-      <w:r>
-        <w:rPr>
-          <w:rFonts w:ascii="Calibri" w:hAnsi="Calibri"/>
-          <w:b w:val="0"/>
-          <w:i w:val="0"/>
-          <w:color w:val="3A3A3A"/>
-          <w:sz w:val="18"/>
-        </w:rPr>
-        <w:t xml:space="preserve">Authored a strategic growth and feasibility white paper on a potential Rikers Island service contract, integrating financial modeling, workforce needs, mission alignment, employee well-being, and operational risk.</w:t>
-      </w:r>
-    </w:p>
-    <w:p>
-      <w:pPr>
-        <w:spacing w:before="14" w:after="14" w:lineRule="exact" w:line="228"/>
-        <w:ind w:left="187" w:hanging="187"/>
-      </w:pPr>
-      <w:r>
-        <w:rPr>
-          <w:rFonts w:ascii="Calibri" w:hAnsi="Calibri"/>
-          <w:b w:val="0"/>
-          <w:i w:val="0"/>
-          <w:color w:val="C09628"/>
-          <w:sz w:val="18"/>
-        </w:rPr>
-        <w:t xml:space="preserve">• </w:t>
-      </w:r>
-      <w:r>
-        <w:rPr>
-          <w:rFonts w:ascii="Calibri" w:hAnsi="Calibri"/>
-          <w:b w:val="0"/>
-          <w:i w:val="0"/>
-          <w:color w:val="3A3A3A"/>
-          <w:sz w:val="18"/>
-        </w:rPr>
-        <w:t xml:space="preserve">Developed a roadmap for potentially doubling JMS within 12 months, identifying investments in management capacity, recruitment, training, contract oversight, payroll, compliance, and technology.</w:t>
-      </w:r>
-    </w:p>
-    <w:p>
-      <w:pPr>
-        <w:spacing w:before="14" w:after="14" w:lineRule="exact" w:line="228"/>
-        <w:ind w:left="187" w:hanging="187"/>
-      </w:pPr>
-      <w:r>
-        <w:rPr>
-          <w:rFonts w:ascii="Calibri" w:hAnsi="Calibri"/>
-          <w:b w:val="0"/>
-          <w:i w:val="0"/>
-          <w:color w:val="C09628"/>
-          <w:sz w:val="18"/>
-        </w:rPr>
-        <w:t xml:space="preserve">• </w:t>
-      </w:r>
-      <w:r>
-        <w:rPr>
-          <w:rFonts w:ascii="Calibri" w:hAnsi="Calibri"/>
-          <w:b w:val="0"/>
-          <w:i w:val="0"/>
-          <w:color w:val="3A3A3A"/>
-          <w:sz w:val="18"/>
-        </w:rPr>
-        <w:t xml:space="preserve">Oversaw departmental talent acquisition, onboarding, staff development, and performance management.</w:t>
-      </w:r>
-    </w:p>
-    <w:tbl>
-      <w:tblPr>
-        <w:tblW w:type="auto" w:w="0"/>
-        <w:tblLook w:firstColumn="1" w:firstRow="1" w:lastColumn="0" w:lastRow="0" w:noHBand="0" w:noVBand="1" w:val="04A0"/>
-        <w:jc w:val="left"/>
-        <w:tblBorders>
-          <w:top w:val="none" w:sz="0" w:space="0" w:color="auto"/>
-          <w:left w:val="none" w:sz="0" w:space="0" w:color="auto"/>
-          <w:bottom w:val="none" w:sz="0" w:space="0" w:color="auto"/>
-          <w:right w:val="none" w:sz="0" w:space="0" w:color="auto"/>
-          <w:insideH w:val="none" w:sz="0" w:space="0" w:color="auto"/>
-          <w:insideV w:val="none" w:sz="0" w:space="0" w:color="auto"/>
-        </w:tblBorders>
-      </w:tblPr>
-      <w:tblGrid>
-        <w:gridCol w:w="7368"/>
-        <w:gridCol w:w="3000"/>
-      </w:tblGrid>
-      <w:tr>
-        <w:tc>
-          <w:tcPr>
-            <w:tcW w:type="dxa" w:w="7368"/>
-          </w:tcPr>
-          <w:p>
-            <w:pPr>
-              <w:keepNext/>
-              <w:spacing w:before="90" w:after="0"/>
-            </w:pPr>
-            <w:r>
-              <w:rPr>
-                <w:rFonts w:ascii="Calibri" w:hAnsi="Calibri"/>
-                <w:b/>
-                <w:i w:val="0"/>
-                <w:color w:val="1C1C1C"/>
-                <w:sz w:val="19"/>
-              </w:rPr>
-              <w:t xml:space="preserve">ALLUEL LOGISTICS</w:t>
-            </w:r>
-            <w:r>
-              <w:rPr>
-                <w:rFonts w:ascii="Calibri" w:hAnsi="Calibri"/>
-                <w:b w:val="0"/>
-                <w:i w:val="0"/>
-                <w:color w:val="555555"/>
-                <w:sz w:val="17"/>
-              </w:rPr>
-              <w:t xml:space="preserve">  |  New York, NY</w:t>
-            </w:r>
-          </w:p>
-        </w:tc>
-        <w:tc>
-          <w:tcPr>
-            <w:tcW w:type="dxa" w:w="3000"/>
-          </w:tcPr>
-          <w:p>
-            <w:pPr>
-              <w:keepNext/>
-              <w:spacing w:before="90" w:after="0"/>
-              <w:jc w:val="right"/>
-            </w:pPr>
-            <w:r>
-              <w:rPr>
-                <w:rFonts w:ascii="Calibri" w:hAnsi="Calibri"/>
-                <w:b/>
-                <w:i w:val="0"/>
-                <w:color w:val="C09628"/>
-                <w:sz w:val="18"/>
-              </w:rPr>
-              <w:t xml:space="preserve">Nov 2021–Aug 2022</w:t>
-            </w:r>
-          </w:p>
-        </w:tc>
-      </w:tr>
-    </w:tbl>
-    <w:p>
-      <w:pPr>
-        <w:keepNext/>
-        <w:spacing w:before="0" w:after="20"/>
-      </w:pPr>
-      <w:r>
-        <w:rPr>
-          <w:rFonts w:ascii="Calibri" w:hAnsi="Calibri"/>
-          <w:b w:val="0"/>
-          <w:i/>
-          <w:color w:val="1C1C1C"/>
-          <w:sz w:val="18"/>
-        </w:rPr>
-        <w:t xml:space="preserve">Vice President of Operations</w:t>
-      </w:r>
-    </w:p>
-    <w:p>
-      <w:pPr>
-        <w:spacing w:before="14" w:after="14" w:lineRule="exact" w:line="228"/>
-        <w:ind w:left="187" w:hanging="187"/>
-      </w:pPr>
-      <w:r>
-        <w:rPr>
-          <w:rFonts w:ascii="Calibri" w:hAnsi="Calibri"/>
-          <w:b w:val="0"/>
-          <w:i w:val="0"/>
-          <w:color w:val="C09628"/>
-          <w:sz w:val="18"/>
-        </w:rPr>
-        <w:t xml:space="preserve">• </w:t>
-      </w:r>
-      <w:r>
-        <w:rPr>
-          <w:rFonts w:ascii="Calibri" w:hAnsi="Calibri"/>
-          <w:b w:val="0"/>
-          <w:i w:val="0"/>
-          <w:color w:val="3A3A3A"/>
-          <w:sz w:val="18"/>
-        </w:rPr>
-        <w:t xml:space="preserve">Managed a $2M operating budget and renegotiated vendor agreements, reducing supply-chain and logistics costs 35%.</w:t>
-      </w:r>
-    </w:p>
-    <w:p>
-      <w:pPr>
-        <w:spacing w:before="14" w:after="14" w:lineRule="exact" w:line="228"/>
-        <w:ind w:left="187" w:hanging="187"/>
-      </w:pPr>
-      <w:r>
-        <w:rPr>
-          <w:rFonts w:ascii="Calibri" w:hAnsi="Calibri"/>
-          <w:b w:val="0"/>
-          <w:i w:val="0"/>
-          <w:color w:val="C09628"/>
-          <w:sz w:val="18"/>
-        </w:rPr>
-        <w:t xml:space="preserve">• </w:t>
-      </w:r>
-      <w:r>
-        <w:rPr>
-          <w:rFonts w:ascii="Calibri" w:hAnsi="Calibri"/>
-          <w:b w:val="0"/>
-          <w:i w:val="0"/>
-          <w:color w:val="3A3A3A"/>
-          <w:sz w:val="18"/>
-        </w:rPr>
-        <w:t xml:space="preserve">Implemented warehouse-management technology that cut data-processing time 60%; introduced CRM systems and trained staff.</w:t>
-      </w:r>
-    </w:p>
-    <w:p>
-      <w:pPr>
-        <w:spacing w:before="14" w:after="14" w:lineRule="exact" w:line="228"/>
-        <w:ind w:left="187" w:hanging="187"/>
-      </w:pPr>
-      <w:r>
-        <w:rPr>
-          <w:rFonts w:ascii="Calibri" w:hAnsi="Calibri"/>
-          <w:b w:val="0"/>
-          <w:i w:val="0"/>
-          <w:color w:val="C09628"/>
-          <w:sz w:val="18"/>
-        </w:rPr>
-        <w:t xml:space="preserve">• </w:t>
-      </w:r>
-      <w:r>
-        <w:rPr>
-          <w:rFonts w:ascii="Calibri" w:hAnsi="Calibri"/>
-          <w:b w:val="0"/>
-          <w:i w:val="0"/>
-          <w:color w:val="3A3A3A"/>
-          <w:sz w:val="18"/>
-        </w:rPr>
-        <w:t xml:space="preserve">Oversaw NYCHA logistics contracts serving 100 developments and supervised ~$500K in monthly NYC DHS billing.</w:t>
-      </w:r>
-    </w:p>
-    <w:p>
-      <w:pPr>
-        <w:spacing w:before="14" w:after="14" w:lineRule="exact" w:line="228"/>
-        <w:ind w:left="187" w:hanging="187"/>
-      </w:pPr>
-      <w:r>
-        <w:rPr>
-          <w:rFonts w:ascii="Calibri" w:hAnsi="Calibri"/>
-          <w:b w:val="0"/>
-          <w:i w:val="0"/>
-          <w:color w:val="C09628"/>
-          <w:sz w:val="18"/>
-        </w:rPr>
-        <w:t xml:space="preserve">• </w:t>
-      </w:r>
-      <w:r>
-        <w:rPr>
-          <w:rFonts w:ascii="Calibri" w:hAnsi="Calibri"/>
-          <w:b w:val="0"/>
-          <w:i w:val="0"/>
-          <w:color w:val="3A3A3A"/>
-          <w:sz w:val="18"/>
-        </w:rPr>
-        <w:t xml:space="preserve">Recruited and managed field, sales, and administrative staff; improved HR workflows and data accuracy.</w:t>
-      </w:r>
-    </w:p>
-    <w:tbl>
-      <w:tblPr>
-        <w:tblW w:type="auto" w:w="0"/>
-        <w:tblLook w:firstColumn="1" w:firstRow="1" w:lastColumn="0" w:lastRow="0" w:noHBand="0" w:noVBand="1" w:val="04A0"/>
-        <w:jc w:val="left"/>
-        <w:tblBorders>
-          <w:top w:val="none" w:sz="0" w:space="0" w:color="auto"/>
-          <w:left w:val="none" w:sz="0" w:space="0" w:color="auto"/>
-          <w:bottom w:val="none" w:sz="0" w:space="0" w:color="auto"/>
-          <w:right w:val="none" w:sz="0" w:space="0" w:color="auto"/>
-          <w:insideH w:val="none" w:sz="0" w:space="0" w:color="auto"/>
-          <w:insideV w:val="none" w:sz="0" w:space="0" w:color="auto"/>
-        </w:tblBorders>
-      </w:tblPr>
-      <w:tblGrid>
-        <w:gridCol w:w="7368"/>
-        <w:gridCol w:w="3000"/>
-      </w:tblGrid>
-      <w:tr>
-        <w:tc>
-          <w:tcPr>
-            <w:tcW w:type="dxa" w:w="7368"/>
-          </w:tcPr>
-          <w:p>
-            <w:pPr>
-              <w:keepNext/>
-              <w:spacing w:before="90" w:after="0"/>
-            </w:pPr>
-            <w:r>
-              <w:rPr>
-                <w:rFonts w:ascii="Calibri" w:hAnsi="Calibri"/>
-                <w:b/>
-                <w:i w:val="0"/>
-                <w:color w:val="1C1C1C"/>
-                <w:sz w:val="19"/>
-              </w:rPr>
-              <w:t xml:space="preserve">LAZARRE CONSULTING GROUP</w:t>
-            </w:r>
-            <w:r>
-              <w:rPr>
-                <w:rFonts w:ascii="Calibri" w:hAnsi="Calibri"/>
-                <w:b w:val="0"/>
-                <w:i w:val="0"/>
-                <w:color w:val="555555"/>
-                <w:sz w:val="17"/>
-              </w:rPr>
-              <w:t xml:space="preserve">  |  New York, NY</w:t>
-            </w:r>
-          </w:p>
-        </w:tc>
-        <w:tc>
-          <w:tcPr>
-            <w:tcW w:type="dxa" w:w="3000"/>
-          </w:tcPr>
-          <w:p>
-            <w:pPr>
-              <w:keepNext/>
-              <w:spacing w:before="90" w:after="0"/>
-              <w:jc w:val="right"/>
-            </w:pPr>
-            <w:r>
-              <w:rPr>
-                <w:rFonts w:ascii="Calibri" w:hAnsi="Calibri"/>
-                <w:b/>
-                <w:i w:val="0"/>
-                <w:color w:val="C09628"/>
-                <w:sz w:val="18"/>
-              </w:rPr>
-              <w:t xml:space="preserve">Dec 2016–Present</w:t>
-            </w:r>
-          </w:p>
-        </w:tc>
-      </w:tr>
-    </w:tbl>
-    <w:p>
-      <w:pPr>
-        <w:keepNext/>
-        <w:spacing w:before="0" w:after="20"/>
-      </w:pPr>
-      <w:r>
-        <w:rPr>
-          <w:rFonts w:ascii="Calibri" w:hAnsi="Calibri"/>
-          <w:b w:val="0"/>
-          <w:i/>
-          <w:color w:val="1C1C1C"/>
-          <w:sz w:val="18"/>
-        </w:rPr>
-        <w:t xml:space="preserve">Chief Executive Officer</w:t>
-      </w:r>
-    </w:p>
-    <w:p>
-      <w:pPr>
-        <w:spacing w:before="14" w:after="14" w:lineRule="exact" w:line="228"/>
-        <w:ind w:left="187" w:hanging="187"/>
-      </w:pPr>
-      <w:r>
-        <w:rPr>
-          <w:rFonts w:ascii="Calibri" w:hAnsi="Calibri"/>
-          <w:b w:val="0"/>
-          <w:i w:val="0"/>
-          <w:color w:val="C09628"/>
-          <w:sz w:val="18"/>
-        </w:rPr>
-        <w:t xml:space="preserve">• </w:t>
-      </w:r>
-      <w:r>
-        <w:rPr>
-          <w:rFonts w:ascii="Calibri" w:hAnsi="Calibri"/>
-          <w:b w:val="0"/>
-          <w:i w:val="0"/>
-          <w:color w:val="3A3A3A"/>
-          <w:sz w:val="18"/>
-        </w:rPr>
-        <w:t xml:space="preserve">Served as financial architect for a $200M national banking development initiative, supporting capital planning and financial structuring.</w:t>
-      </w:r>
-    </w:p>
-    <w:p>
-      <w:pPr>
-        <w:spacing w:before="14" w:after="14" w:lineRule="exact" w:line="228"/>
-        <w:ind w:left="187" w:hanging="187"/>
-      </w:pPr>
-      <w:r>
-        <w:rPr>
-          <w:rFonts w:ascii="Calibri" w:hAnsi="Calibri"/>
-          <w:b w:val="0"/>
-          <w:i w:val="0"/>
-          <w:color w:val="C09628"/>
-          <w:sz w:val="18"/>
-        </w:rPr>
-        <w:t xml:space="preserve">• </w:t>
-      </w:r>
-      <w:r>
-        <w:rPr>
-          <w:rFonts w:ascii="Calibri" w:hAnsi="Calibri"/>
-          <w:b w:val="0"/>
-          <w:i w:val="0"/>
-          <w:color w:val="3A3A3A"/>
-          <w:sz w:val="18"/>
-        </w:rPr>
-        <w:t xml:space="preserve">Developed operating and performance-improvement strategies for organizations and brands including American Express OPEN, Ogilvy, and Chubb.</w:t>
-      </w:r>
-    </w:p>
-    <w:p>
-      <w:pPr>
-        <w:spacing w:before="14" w:after="14" w:lineRule="exact" w:line="228"/>
-        <w:ind w:left="187" w:hanging="187"/>
-      </w:pPr>
-      <w:r>
-        <w:rPr>
-          <w:rFonts w:ascii="Calibri" w:hAnsi="Calibri"/>
-          <w:b w:val="0"/>
-          <w:i w:val="0"/>
-          <w:color w:val="C09628"/>
-          <w:sz w:val="18"/>
-        </w:rPr>
-        <w:t xml:space="preserve">• </w:t>
-      </w:r>
-      <w:r>
-        <w:rPr>
-          <w:rFonts w:ascii="Calibri" w:hAnsi="Calibri"/>
-          <w:b w:val="0"/>
-          <w:i w:val="0"/>
-          <w:color w:val="3A3A3A"/>
-          <w:sz w:val="18"/>
-        </w:rPr>
-        <w:t xml:space="preserve">Led financial remediation for a psychological services practice, identifying ~$251K in unclaimed deductions and preparing corrected financial statements.</w:t>
-      </w:r>
-    </w:p>
-    <w:tbl>
-      <w:tblPr>
-        <w:tblW w:type="auto" w:w="0"/>
-        <w:tblLook w:firstColumn="1" w:firstRow="1" w:lastColumn="0" w:lastRow="0" w:noHBand="0" w:noVBand="1" w:val="04A0"/>
-        <w:jc w:val="left"/>
-        <w:tblBorders>
-          <w:top w:val="none" w:sz="0" w:space="0" w:color="auto"/>
-          <w:left w:val="none" w:sz="0" w:space="0" w:color="auto"/>
-          <w:bottom w:val="none" w:sz="0" w:space="0" w:color="auto"/>
-          <w:right w:val="none" w:sz="0" w:space="0" w:color="auto"/>
-          <w:insideH w:val="none" w:sz="0" w:space="0" w:color="auto"/>
-          <w:insideV w:val="none" w:sz="0" w:space="0" w:color="auto"/>
-        </w:tblBorders>
-      </w:tblPr>
-      <w:tblGrid>
-        <w:gridCol w:w="7368"/>
-        <w:gridCol w:w="3000"/>
-      </w:tblGrid>
-      <w:tr>
-        <w:tc>
-          <w:tcPr>
-            <w:tcW w:type="dxa" w:w="7368"/>
-          </w:tcPr>
-          <w:p>
-            <w:pPr>
-              <w:keepNext/>
-              <w:spacing w:before="90" w:after="0"/>
-            </w:pPr>
-            <w:r>
-              <w:rPr>
-                <w:rFonts w:ascii="Calibri" w:hAnsi="Calibri"/>
-                <w:b/>
-                <w:i w:val="0"/>
-                <w:color w:val="1C1C1C"/>
-                <w:sz w:val="19"/>
-              </w:rPr>
-              <w:t xml:space="preserve">FITNESS COLLECTIVE INC.</w:t>
-            </w:r>
-            <w:r>
-              <w:rPr>
-                <w:rFonts w:ascii="Calibri" w:hAnsi="Calibri"/>
-                <w:b w:val="0"/>
-                <w:i w:val="0"/>
-                <w:color w:val="555555"/>
-                <w:sz w:val="17"/>
-              </w:rPr>
-              <w:t xml:space="preserve">  |  Brooklyn, NY</w:t>
-            </w:r>
-          </w:p>
-        </w:tc>
-        <w:tc>
-          <w:tcPr>
-            <w:tcW w:type="dxa" w:w="3000"/>
-          </w:tcPr>
-          <w:p>
-            <w:pPr>
-              <w:keepNext/>
-              <w:spacing w:before="90" w:after="0"/>
-              <w:jc w:val="right"/>
-            </w:pPr>
-            <w:r>
-              <w:rPr>
-                <w:rFonts w:ascii="Calibri" w:hAnsi="Calibri"/>
-                <w:b/>
-                <w:i w:val="0"/>
-                <w:color w:val="C09628"/>
-                <w:sz w:val="18"/>
-              </w:rPr>
-              <w:t xml:space="preserve">2004–2016</w:t>
-            </w:r>
-          </w:p>
-        </w:tc>
-      </w:tr>
-    </w:tbl>
-    <w:p>
-      <w:pPr>
-        <w:keepNext/>
-        <w:spacing w:before="0" w:after="20"/>
-      </w:pPr>
-      <w:r>
-        <w:rPr>
-          <w:rFonts w:ascii="Calibri" w:hAnsi="Calibri"/>
-          <w:b w:val="0"/>
-          <w:i/>
-          <w:color w:val="1C1C1C"/>
-          <w:sz w:val="18"/>
-        </w:rPr>
-        <w:t xml:space="preserve">CEO and Co-Founder</w:t>
-      </w:r>
-    </w:p>
-    <w:p>
-      <w:pPr>
-        <w:spacing w:before="14" w:after="14" w:lineRule="exact" w:line="228"/>
-        <w:ind w:left="187" w:hanging="187"/>
-      </w:pPr>
-      <w:r>
-        <w:rPr>
-          <w:rFonts w:ascii="Calibri" w:hAnsi="Calibri"/>
-          <w:b w:val="0"/>
-          <w:i w:val="0"/>
-          <w:color w:val="C09628"/>
-          <w:sz w:val="18"/>
-        </w:rPr>
-        <w:t xml:space="preserve">• </w:t>
-      </w:r>
-      <w:r>
-        <w:rPr>
-          <w:rFonts w:ascii="Calibri" w:hAnsi="Calibri"/>
-          <w:b w:val="0"/>
-          <w:i w:val="0"/>
-          <w:color w:val="3A3A3A"/>
-          <w:sz w:val="18"/>
-        </w:rPr>
-        <w:t xml:space="preserve">Scaled from a $5,000 investment to $1M in annual revenue within 24 months, then implemented a franchise model and launched three additional locations, growing to $10M in annual sales.</w:t>
-      </w:r>
-    </w:p>
-    <w:p>
-      <w:pPr>
-        <w:spacing w:before="14" w:after="14" w:lineRule="exact" w:line="228"/>
-        <w:ind w:left="187" w:hanging="187"/>
-      </w:pPr>
-      <w:r>
-        <w:rPr>
-          <w:rFonts w:ascii="Calibri" w:hAnsi="Calibri"/>
-          <w:b w:val="0"/>
-          <w:i w:val="0"/>
-          <w:color w:val="C09628"/>
-          <w:sz w:val="18"/>
-        </w:rPr>
-        <w:t xml:space="preserve">• </w:t>
-      </w:r>
-      <w:r>
-        <w:rPr>
-          <w:rFonts w:ascii="Calibri" w:hAnsi="Calibri"/>
-          <w:b w:val="0"/>
-          <w:i w:val="0"/>
-          <w:color w:val="3A3A3A"/>
-          <w:sz w:val="18"/>
-        </w:rPr>
-        <w:t xml:space="preserve">Built HR, payroll, and benefits infrastructure for 50+ employees, overseeing recruitment, training, performance management, and ~$65K in monthly payroll.</w:t>
-      </w:r>
-    </w:p>
-    <w:p>
-      <w:pPr>
-        <w:spacing w:before="14" w:after="14" w:lineRule="exact" w:line="228"/>
-        <w:ind w:left="187" w:hanging="187"/>
-      </w:pPr>
-      <w:r>
-        <w:rPr>
-          <w:rFonts w:ascii="Calibri" w:hAnsi="Calibri"/>
-          <w:b w:val="0"/>
-          <w:i w:val="0"/>
-          <w:color w:val="C09628"/>
-          <w:sz w:val="18"/>
-        </w:rPr>
-        <w:t xml:space="preserve">• </w:t>
-      </w:r>
-      <w:r>
-        <w:rPr>
-          <w:rFonts w:ascii="Calibri" w:hAnsi="Calibri"/>
-          <w:b w:val="0"/>
-          <w:i w:val="0"/>
-          <w:color w:val="3A3A3A"/>
-          <w:sz w:val="18"/>
-        </w:rPr>
-        <w:t xml:space="preserve">Implemented Mindbody CRM for client tracking, online booking, and targeted engagement across 4,000+ clients; established a training academy that certified 25 trainers.</w:t>
-      </w:r>
-    </w:p>
-    <w:p>
-      <w:pPr>
-        <w:spacing w:before="14" w:after="14" w:lineRule="exact" w:line="228"/>
-        <w:ind w:left="187" w:hanging="187"/>
-      </w:pPr>
-      <w:r>
-        <w:rPr>
-          <w:rFonts w:ascii="Calibri" w:hAnsi="Calibri"/>
-          <w:b w:val="0"/>
-          <w:i w:val="0"/>
-          <w:color w:val="C09628"/>
-          <w:sz w:val="18"/>
-        </w:rPr>
-        <w:t xml:space="preserve">• </w:t>
-      </w:r>
-      <w:r>
-        <w:rPr>
-          <w:rFonts w:ascii="Calibri" w:hAnsi="Calibri"/>
-          <w:b w:val="0"/>
-          <w:i w:val="0"/>
-          <w:color w:val="3A3A3A"/>
-          <w:sz w:val="18"/>
-        </w:rPr>
-        <w:t xml:space="preserve">Developed local business partnerships, cross-marketing initiatives, and community events; negotiated vendor and utility agreements.</w:t>
+        <w:t>Chief Financial Strategy Officer</w:t>
       </w:r>
     </w:p>
     <w:p>
       <w:pPr>
         <w:keepNext/>
-        <w:spacing w:before="120" w:after="40"/>
-        <w:pBdr>
-          <w:bottom w:val="single" w:sz="8" w:space="1" w:color="C09628"/>
-        </w:pBdr>
+        <w:spacing w:before="0" w:after="30" w:line="240" w:lineRule="auto"/>
       </w:pPr>
+      <w:r>
+        <w:rPr>
+          <w:rFonts w:ascii="Calibri" w:hAnsi="Calibri" w:eastAsia="Calibri"/>
+          <w:b w:val="0"/>
+          <w:i/>
+          <w:caps w:val="0"/>
+          <w:color w:val="555555"/>
+          <w:sz w:val="20"/>
+        </w:rPr>
+        <w:t>Fractional CFO and program leadership for nonprofit, public-sector, education, healthcare, and service businesses.</w:t>
+      </w:r>
+    </w:p>
+    <w:p>
+      <w:pPr>
+        <w:keepNext w:val="0"/>
+        <w:spacing w:before="0" w:after="30" w:line="247" w:lineRule="auto"/>
+        <w:ind w:left="259" w:hanging="202"/>
+      </w:pPr>
+      <w:r>
+        <w:rPr>
+          <w:rFonts w:ascii="Calibri" w:hAnsi="Calibri" w:eastAsia="Calibri"/>
+          <w:b w:val="0"/>
+          <w:i w:val="0"/>
+          <w:caps w:val="0"/>
+          <w:color w:val="1F3A5F"/>
+          <w:sz w:val="21"/>
+        </w:rPr>
+        <w:t xml:space="preserve">•  </w:t>
+      </w:r>
+      <w:r>
+        <w:rPr>
+          <w:rFonts w:ascii="Calibri" w:hAnsi="Calibri" w:eastAsia="Calibri"/>
+          <w:b w:val="0"/>
+          <w:i w:val="0"/>
+          <w:caps w:val="0"/>
+          <w:color w:val="222222"/>
+          <w:sz w:val="21"/>
+        </w:rPr>
+        <w:t>Created and led the NYPA clean-energy workforce training project from inception through final delivery over 18 months, owning proposal development, program design, budgeting, partner coordination, and participant training.</w:t>
+      </w:r>
+    </w:p>
+    <w:p>
+      <w:pPr>
+        <w:keepNext w:val="0"/>
+        <w:spacing w:before="0" w:after="30" w:line="247" w:lineRule="auto"/>
+        <w:ind w:left="259" w:hanging="202"/>
+      </w:pPr>
+      <w:r>
+        <w:rPr>
+          <w:rFonts w:ascii="Calibri" w:hAnsi="Calibri" w:eastAsia="Calibri"/>
+          <w:b w:val="0"/>
+          <w:i w:val="0"/>
+          <w:caps w:val="0"/>
+          <w:color w:val="1F3A5F"/>
+          <w:sz w:val="21"/>
+        </w:rPr>
+        <w:t xml:space="preserve">•  </w:t>
+      </w:r>
+      <w:r>
+        <w:rPr>
+          <w:rFonts w:ascii="Calibri" w:hAnsi="Calibri" w:eastAsia="Calibri"/>
+          <w:b w:val="0"/>
+          <w:i w:val="0"/>
+          <w:caps w:val="0"/>
+          <w:color w:val="222222"/>
+          <w:sz w:val="21"/>
+        </w:rPr>
+        <w:t>Built a workforce coalition spanning city and state agencies, elected officials, academic partners, Stanford Innovation Lab, KPMG, and the New York Power Authority.</w:t>
+      </w:r>
+    </w:p>
+    <w:p>
+      <w:pPr>
+        <w:keepNext w:val="0"/>
+        <w:spacing w:before="0" w:after="30" w:line="247" w:lineRule="auto"/>
+        <w:ind w:left="259" w:hanging="202"/>
+      </w:pPr>
+      <w:r>
+        <w:rPr>
+          <w:rFonts w:ascii="Calibri" w:hAnsi="Calibri" w:eastAsia="Calibri"/>
+          <w:b w:val="0"/>
+          <w:i w:val="0"/>
+          <w:caps w:val="0"/>
+          <w:color w:val="1F3A5F"/>
+          <w:sz w:val="21"/>
+        </w:rPr>
+        <w:t xml:space="preserve">•  </w:t>
+      </w:r>
+      <w:r>
+        <w:rPr>
+          <w:rFonts w:ascii="Calibri" w:hAnsi="Calibri" w:eastAsia="Calibri"/>
+          <w:b w:val="0"/>
+          <w:i w:val="0"/>
+          <w:caps w:val="0"/>
+          <w:color w:val="222222"/>
+          <w:sz w:val="21"/>
+        </w:rPr>
+        <w:t>Managed a multimillion-dollar project budget: allocated direct and indirect costs, managed restricted cash flow, and aligned spending with grant requirements and delivery milestones.</w:t>
+      </w:r>
+    </w:p>
+    <w:p>
+      <w:pPr>
+        <w:keepNext w:val="0"/>
+        <w:spacing w:before="0" w:after="30" w:line="247" w:lineRule="auto"/>
+        <w:ind w:left="259" w:hanging="202"/>
+      </w:pPr>
+      <w:r>
+        <w:rPr>
+          <w:rFonts w:ascii="Calibri" w:hAnsi="Calibri" w:eastAsia="Calibri"/>
+          <w:b w:val="0"/>
+          <w:i w:val="0"/>
+          <w:caps w:val="0"/>
+          <w:color w:val="1F3A5F"/>
+          <w:sz w:val="21"/>
+        </w:rPr>
+        <w:t xml:space="preserve">•  </w:t>
+      </w:r>
+      <w:r>
+        <w:rPr>
+          <w:rFonts w:ascii="Calibri" w:hAnsi="Calibri" w:eastAsia="Calibri"/>
+          <w:b w:val="0"/>
+          <w:i w:val="0"/>
+          <w:caps w:val="0"/>
+          <w:color w:val="222222"/>
+          <w:sz w:val="21"/>
+        </w:rPr>
+        <w:t>Led fundraising and partnership-agreement development, tying funding commitments to partner responsibilities and implementation needs.</w:t>
+      </w:r>
+    </w:p>
+    <w:p>
+      <w:pPr>
+        <w:keepNext w:val="0"/>
+        <w:spacing w:before="0" w:after="30" w:line="247" w:lineRule="auto"/>
+        <w:ind w:left="259" w:hanging="202"/>
+      </w:pPr>
+      <w:r>
+        <w:rPr>
+          <w:rFonts w:ascii="Calibri" w:hAnsi="Calibri" w:eastAsia="Calibri"/>
+          <w:b w:val="0"/>
+          <w:i w:val="0"/>
+          <w:caps w:val="0"/>
+          <w:color w:val="1F3A5F"/>
+          <w:sz w:val="21"/>
+        </w:rPr>
+        <w:t xml:space="preserve">•  </w:t>
+      </w:r>
+      <w:r>
+        <w:rPr>
+          <w:rFonts w:ascii="Calibri" w:hAnsi="Calibri" w:eastAsia="Calibri"/>
+          <w:b w:val="0"/>
+          <w:i w:val="0"/>
+          <w:caps w:val="0"/>
+          <w:color w:val="222222"/>
+          <w:sz w:val="21"/>
+        </w:rPr>
+        <w:t>Direct budgeting, forecasting, cash management, and multi-entity financial planning; advise leaders on financing, working capital, and growth priorities.</w:t>
+      </w:r>
+    </w:p>
+    <w:p>
+      <w:pPr>
+        <w:keepNext w:val="0"/>
+        <w:spacing w:before="0" w:after="30" w:line="247" w:lineRule="auto"/>
+        <w:ind w:left="259" w:hanging="202"/>
+      </w:pPr>
+      <w:r>
+        <w:rPr>
+          <w:rFonts w:ascii="Calibri" w:hAnsi="Calibri" w:eastAsia="Calibri"/>
+          <w:b w:val="0"/>
+          <w:i w:val="0"/>
+          <w:caps w:val="0"/>
+          <w:color w:val="1F3A5F"/>
+          <w:sz w:val="21"/>
+        </w:rPr>
+        <w:t xml:space="preserve">•  </w:t>
+      </w:r>
+      <w:r>
+        <w:rPr>
+          <w:rFonts w:ascii="Calibri" w:hAnsi="Calibri" w:eastAsia="Calibri"/>
+          <w:b w:val="0"/>
+          <w:i w:val="0"/>
+          <w:caps w:val="0"/>
+          <w:color w:val="222222"/>
+          <w:sz w:val="21"/>
+        </w:rPr>
+        <w:t>Build financial models, KPI dashboards, and SOPs; lead financial cleanup and reporting remediation with clients and their accountants.</w:t>
+      </w:r>
     </w:p>
     <w:p>
       <w:pPr>
         <w:keepNext/>
-        <w:spacing w:before="0" w:after="60"/>
-        <w:ind w:left="0"/>
+        <w:tabs>
+          <w:tab w:pos="10368" w:val="right"/>
+        </w:tabs>
+        <w:spacing w:before="120" w:after="0" w:line="240" w:lineRule="auto"/>
       </w:pPr>
       <w:r>
         <w:rPr>
-          <w:rFonts w:ascii="Calibri" w:hAnsi="Calibri"/>
+          <w:rFonts w:ascii="Calibri" w:hAnsi="Calibri" w:eastAsia="Calibri"/>
           <w:b/>
           <w:i w:val="0"/>
-          <w:color w:val="C09628"/>
-          <w:sz w:val="19"/>
+          <w:caps w:val="0"/>
+          <w:color w:val="1F3A5F"/>
+          <w:sz w:val="21"/>
         </w:rPr>
-        <w:t xml:space="preserve">TECHNOLOGY &amp; PROGRAM INNOVATION</w:t>
+        <w:t>OSBORNE ASSOCIATION</w:t>
+      </w:r>
+      <w:r>
+        <w:rPr>
+          <w:rFonts w:ascii="Calibri" w:hAnsi="Calibri" w:eastAsia="Calibri"/>
+          <w:b w:val="0"/>
+          <w:i w:val="0"/>
+          <w:caps w:val="0"/>
+          <w:color w:val="555555"/>
+          <w:sz w:val="21"/>
+        </w:rPr>
+        <w:t xml:space="preserve">  |  New York, NY</w:t>
+      </w:r>
+      <w:r>
+        <w:rPr>
+          <w:rFonts w:ascii="Calibri" w:hAnsi="Calibri" w:eastAsia="Calibri"/>
+          <w:b/>
+          <w:i w:val="0"/>
+          <w:caps w:val="0"/>
+          <w:color w:val="222222"/>
+          <w:sz w:val="21"/>
+        </w:rPr>
+        <w:tab/>
+        <w:t>Jan 2023 – Oct 2025</w:t>
       </w:r>
     </w:p>
     <w:p>
       <w:pPr>
-        <w:spacing w:before="14" w:after="14" w:lineRule="exact" w:line="228"/>
-        <w:ind w:left="187" w:hanging="187"/>
+        <w:keepNext/>
+        <w:spacing w:before="0" w:after="20" w:line="240" w:lineRule="auto"/>
       </w:pPr>
       <w:r>
         <w:rPr>
-          <w:rFonts w:ascii="Calibri" w:hAnsi="Calibri"/>
+          <w:rFonts w:ascii="Calibri" w:hAnsi="Calibri" w:eastAsia="Calibri"/>
+          <w:b/>
+          <w:i/>
+          <w:caps w:val="0"/>
+          <w:color w:val="222222"/>
+          <w:sz w:val="21"/>
+        </w:rPr>
+        <w:t>Vice President, Business Development &amp; Social Ventures</w:t>
+      </w:r>
+    </w:p>
+    <w:p>
+      <w:pPr>
+        <w:keepNext/>
+        <w:spacing w:before="0" w:after="30" w:line="240" w:lineRule="auto"/>
+      </w:pPr>
+      <w:r>
+        <w:rPr>
+          <w:rFonts w:ascii="Calibri" w:hAnsi="Calibri" w:eastAsia="Calibri"/>
+          <w:b w:val="0"/>
+          <w:i/>
+          <w:caps w:val="0"/>
+          <w:color w:val="555555"/>
+          <w:sz w:val="20"/>
+        </w:rPr>
+        <w:t>Led a 140-person division of a human-services organization supporting people affected by the criminal legal system.</w:t>
+      </w:r>
+    </w:p>
+    <w:p>
+      <w:pPr>
+        <w:keepNext w:val="0"/>
+        <w:spacing w:before="0" w:after="30" w:line="247" w:lineRule="auto"/>
+        <w:ind w:left="259" w:hanging="202"/>
+      </w:pPr>
+      <w:r>
+        <w:rPr>
+          <w:rFonts w:ascii="Calibri" w:hAnsi="Calibri" w:eastAsia="Calibri"/>
           <w:b w:val="0"/>
           <w:i w:val="0"/>
-          <w:color w:val="C09628"/>
-          <w:sz w:val="18"/>
+          <w:caps w:val="0"/>
+          <w:color w:val="1F3A5F"/>
+          <w:sz w:val="21"/>
         </w:rPr>
-        <w:t xml:space="preserve">• </w:t>
+        <w:t xml:space="preserve">•  </w:t>
       </w:r>
       <w:r>
         <w:rPr>
-          <w:rFonts w:ascii="Calibri" w:hAnsi="Calibri"/>
+          <w:rFonts w:ascii="Calibri" w:hAnsi="Calibri" w:eastAsia="Calibri"/>
+          <w:b w:val="0"/>
+          <w:i w:val="0"/>
+          <w:caps w:val="0"/>
+          <w:color w:val="222222"/>
+          <w:sz w:val="21"/>
+        </w:rPr>
+        <w:t>Held full P&amp;L accountability for an $80M portfolio, aligning budgets, staffing, partnerships, and program priorities.</w:t>
+      </w:r>
+    </w:p>
+    <w:p>
+      <w:pPr>
+        <w:keepNext w:val="0"/>
+        <w:spacing w:before="0" w:after="30" w:line="247" w:lineRule="auto"/>
+        <w:ind w:left="259" w:hanging="202"/>
+      </w:pPr>
+      <w:r>
+        <w:rPr>
+          <w:rFonts w:ascii="Calibri" w:hAnsi="Calibri" w:eastAsia="Calibri"/>
+          <w:b w:val="0"/>
+          <w:i w:val="0"/>
+          <w:caps w:val="0"/>
+          <w:color w:val="1F3A5F"/>
+          <w:sz w:val="21"/>
+        </w:rPr>
+        <w:t xml:space="preserve">•  </w:t>
+      </w:r>
+      <w:r>
+        <w:rPr>
+          <w:rFonts w:ascii="Calibri" w:hAnsi="Calibri" w:eastAsia="Calibri"/>
+          <w:b w:val="0"/>
+          <w:i w:val="0"/>
+          <w:caps w:val="0"/>
+          <w:color w:val="222222"/>
+          <w:sz w:val="21"/>
+        </w:rPr>
+        <w:t>Partnered with the CEO and Board on long-range planning, risk management, resource allocation, and growth.</w:t>
+      </w:r>
+    </w:p>
+    <w:p>
+      <w:pPr>
+        <w:keepNext w:val="0"/>
+        <w:spacing w:before="0" w:after="30" w:line="247" w:lineRule="auto"/>
+        <w:ind w:left="259" w:hanging="202"/>
+      </w:pPr>
+      <w:r>
+        <w:rPr>
+          <w:rFonts w:ascii="Calibri" w:hAnsi="Calibri" w:eastAsia="Calibri"/>
+          <w:b w:val="0"/>
+          <w:i w:val="0"/>
+          <w:caps w:val="0"/>
+          <w:color w:val="1F3A5F"/>
+          <w:sz w:val="21"/>
+        </w:rPr>
+        <w:t xml:space="preserve">•  </w:t>
+      </w:r>
+      <w:r>
+        <w:rPr>
+          <w:rFonts w:ascii="Calibri" w:hAnsi="Calibri" w:eastAsia="Calibri"/>
+          <w:b w:val="0"/>
+          <w:i w:val="0"/>
+          <w:caps w:val="0"/>
+          <w:color w:val="222222"/>
+          <w:sz w:val="21"/>
+        </w:rPr>
+        <w:t>Led a nine-month transitional-employment program serving 300+ formerly incarcerated people annually, coordinating employer partnerships and tracking outcomes against funder benchmarks.</w:t>
+      </w:r>
+    </w:p>
+    <w:p>
+      <w:pPr>
+        <w:keepNext w:val="0"/>
+        <w:spacing w:before="0" w:after="30" w:line="247" w:lineRule="auto"/>
+        <w:ind w:left="259" w:hanging="202"/>
+      </w:pPr>
+      <w:r>
+        <w:rPr>
+          <w:rFonts w:ascii="Calibri" w:hAnsi="Calibri" w:eastAsia="Calibri"/>
+          <w:b w:val="0"/>
+          <w:i w:val="0"/>
+          <w:caps w:val="0"/>
+          <w:color w:val="1F3A5F"/>
+          <w:sz w:val="21"/>
+        </w:rPr>
+        <w:t xml:space="preserve">•  </w:t>
+      </w:r>
+      <w:r>
+        <w:rPr>
+          <w:rFonts w:ascii="Calibri" w:hAnsi="Calibri" w:eastAsia="Calibri"/>
+          <w:b w:val="0"/>
+          <w:i w:val="0"/>
+          <w:caps w:val="0"/>
+          <w:color w:val="222222"/>
+          <w:sz w:val="21"/>
+        </w:rPr>
+        <w:t>Negotiated government, corporate, and philanthropic partnerships and launched earned-income social ventures.</w:t>
+      </w:r>
+    </w:p>
+    <w:p>
+      <w:pPr>
+        <w:keepNext w:val="0"/>
+        <w:spacing w:before="0" w:after="30" w:line="247" w:lineRule="auto"/>
+        <w:ind w:left="259" w:hanging="202"/>
+      </w:pPr>
+      <w:r>
+        <w:rPr>
+          <w:rFonts w:ascii="Calibri" w:hAnsi="Calibri" w:eastAsia="Calibri"/>
+          <w:b w:val="0"/>
+          <w:i w:val="0"/>
+          <w:caps w:val="0"/>
+          <w:color w:val="1F3A5F"/>
+          <w:sz w:val="21"/>
+        </w:rPr>
+        <w:t xml:space="preserve">•  </w:t>
+      </w:r>
+      <w:r>
+        <w:rPr>
+          <w:rFonts w:ascii="Calibri" w:hAnsi="Calibri" w:eastAsia="Calibri"/>
+          <w:b w:val="0"/>
+          <w:i w:val="0"/>
+          <w:caps w:val="0"/>
+          <w:color w:val="222222"/>
+          <w:sz w:val="21"/>
+        </w:rPr>
+        <w:t>Authored a growth and feasibility white paper on a potential Rikers Island service contract, integrating financial modeling, workforce needs, mission alignment, employee well-being, and operational risk.</w:t>
+      </w:r>
+    </w:p>
+    <w:p>
+      <w:pPr>
+        <w:keepNext w:val="0"/>
+        <w:spacing w:before="0" w:after="30" w:line="247" w:lineRule="auto"/>
+        <w:ind w:left="259" w:hanging="202"/>
+      </w:pPr>
+      <w:r>
+        <w:rPr>
+          <w:rFonts w:ascii="Calibri" w:hAnsi="Calibri" w:eastAsia="Calibri"/>
+          <w:b w:val="0"/>
+          <w:i w:val="0"/>
+          <w:caps w:val="0"/>
+          <w:color w:val="1F3A5F"/>
+          <w:sz w:val="21"/>
+        </w:rPr>
+        <w:t xml:space="preserve">•  </w:t>
+      </w:r>
+      <w:r>
+        <w:rPr>
+          <w:rFonts w:ascii="Calibri" w:hAnsi="Calibri" w:eastAsia="Calibri"/>
+          <w:b w:val="0"/>
+          <w:i w:val="0"/>
+          <w:caps w:val="0"/>
+          <w:color w:val="222222"/>
+          <w:sz w:val="21"/>
+        </w:rPr>
+        <w:t>Developed a roadmap to potentially double JMS within 12 months, sizing investments in management capacity, recruitment, training, contract oversight, payroll, compliance, and technology.</w:t>
+      </w:r>
+    </w:p>
+    <w:p>
+      <w:pPr>
+        <w:keepNext w:val="0"/>
+        <w:spacing w:before="0" w:after="30" w:line="247" w:lineRule="auto"/>
+        <w:ind w:left="259" w:hanging="202"/>
+      </w:pPr>
+      <w:r>
+        <w:rPr>
+          <w:rFonts w:ascii="Calibri" w:hAnsi="Calibri" w:eastAsia="Calibri"/>
+          <w:b w:val="0"/>
+          <w:i w:val="0"/>
+          <w:caps w:val="0"/>
+          <w:color w:val="1F3A5F"/>
+          <w:sz w:val="21"/>
+        </w:rPr>
+        <w:t xml:space="preserve">•  </w:t>
+      </w:r>
+      <w:r>
+        <w:rPr>
+          <w:rFonts w:ascii="Calibri" w:hAnsi="Calibri" w:eastAsia="Calibri"/>
+          <w:b w:val="0"/>
+          <w:i w:val="0"/>
+          <w:caps w:val="0"/>
+          <w:color w:val="222222"/>
+          <w:sz w:val="21"/>
+        </w:rPr>
+        <w:t>Oversaw departmental talent acquisition, onboarding, staff development, and performance management.</w:t>
+      </w:r>
+    </w:p>
+    <w:p>
+      <w:pPr>
+        <w:keepNext/>
+        <w:tabs>
+          <w:tab w:pos="10368" w:val="right"/>
+        </w:tabs>
+        <w:spacing w:before="120" w:after="0" w:line="240" w:lineRule="auto"/>
+      </w:pPr>
+      <w:r>
+        <w:rPr>
+          <w:rFonts w:ascii="Calibri" w:hAnsi="Calibri" w:eastAsia="Calibri"/>
           <w:b/>
           <w:i w:val="0"/>
-          <w:color w:val="1C1C1C"/>
-          <w:sz w:val="18"/>
+          <w:caps w:val="0"/>
+          <w:color w:val="1F3A5F"/>
+          <w:sz w:val="21"/>
+        </w:rPr>
+        <w:t>ALLUEL LOGISTICS</w:t>
+      </w:r>
+      <w:r>
+        <w:rPr>
+          <w:rFonts w:ascii="Calibri" w:hAnsi="Calibri" w:eastAsia="Calibri"/>
+          <w:b w:val="0"/>
+          <w:i w:val="0"/>
+          <w:caps w:val="0"/>
+          <w:color w:val="555555"/>
+          <w:sz w:val="21"/>
+        </w:rPr>
+        <w:t xml:space="preserve">  |  New York, NY</w:t>
+      </w:r>
+      <w:r>
+        <w:rPr>
+          <w:rFonts w:ascii="Calibri" w:hAnsi="Calibri" w:eastAsia="Calibri"/>
+          <w:b/>
+          <w:i w:val="0"/>
+          <w:caps w:val="0"/>
+          <w:color w:val="222222"/>
+          <w:sz w:val="21"/>
+        </w:rPr>
+        <w:tab/>
+        <w:t>Nov 2021 – Aug 2022</w:t>
+      </w:r>
+    </w:p>
+    <w:p>
+      <w:pPr>
+        <w:keepNext/>
+        <w:spacing w:before="0" w:after="20" w:line="240" w:lineRule="auto"/>
+      </w:pPr>
+      <w:r>
+        <w:rPr>
+          <w:rFonts w:ascii="Calibri" w:hAnsi="Calibri" w:eastAsia="Calibri"/>
+          <w:b/>
+          <w:i/>
+          <w:caps w:val="0"/>
+          <w:color w:val="222222"/>
+          <w:sz w:val="21"/>
+        </w:rPr>
+        <w:t>Vice President of Operations</w:t>
+      </w:r>
+    </w:p>
+    <w:p>
+      <w:pPr>
+        <w:keepNext w:val="0"/>
+        <w:spacing w:before="0" w:after="30" w:line="247" w:lineRule="auto"/>
+        <w:ind w:left="259" w:hanging="202"/>
+      </w:pPr>
+      <w:r>
+        <w:rPr>
+          <w:rFonts w:ascii="Calibri" w:hAnsi="Calibri" w:eastAsia="Calibri"/>
+          <w:b w:val="0"/>
+          <w:i w:val="0"/>
+          <w:caps w:val="0"/>
+          <w:color w:val="1F3A5F"/>
+          <w:sz w:val="21"/>
+        </w:rPr>
+        <w:t xml:space="preserve">•  </w:t>
+      </w:r>
+      <w:r>
+        <w:rPr>
+          <w:rFonts w:ascii="Calibri" w:hAnsi="Calibri" w:eastAsia="Calibri"/>
+          <w:b w:val="0"/>
+          <w:i w:val="0"/>
+          <w:caps w:val="0"/>
+          <w:color w:val="222222"/>
+          <w:sz w:val="21"/>
+        </w:rPr>
+        <w:t>Managed a $2M operating budget; renegotiated vendor agreements to cut supply-chain and logistics costs 35%.</w:t>
+      </w:r>
+    </w:p>
+    <w:p>
+      <w:pPr>
+        <w:keepNext w:val="0"/>
+        <w:spacing w:before="0" w:after="30" w:line="247" w:lineRule="auto"/>
+        <w:ind w:left="259" w:hanging="202"/>
+      </w:pPr>
+      <w:r>
+        <w:rPr>
+          <w:rFonts w:ascii="Calibri" w:hAnsi="Calibri" w:eastAsia="Calibri"/>
+          <w:b w:val="0"/>
+          <w:i w:val="0"/>
+          <w:caps w:val="0"/>
+          <w:color w:val="1F3A5F"/>
+          <w:sz w:val="21"/>
+        </w:rPr>
+        <w:t xml:space="preserve">•  </w:t>
+      </w:r>
+      <w:r>
+        <w:rPr>
+          <w:rFonts w:ascii="Calibri" w:hAnsi="Calibri" w:eastAsia="Calibri"/>
+          <w:b w:val="0"/>
+          <w:i w:val="0"/>
+          <w:caps w:val="0"/>
+          <w:color w:val="222222"/>
+          <w:sz w:val="21"/>
+        </w:rPr>
+        <w:t>Implemented warehouse-management technology that reduced data-processing time 60%; introduced CRM systems and trained staff.</w:t>
+      </w:r>
+    </w:p>
+    <w:p>
+      <w:pPr>
+        <w:keepNext w:val="0"/>
+        <w:spacing w:before="0" w:after="30" w:line="247" w:lineRule="auto"/>
+        <w:ind w:left="259" w:hanging="202"/>
+      </w:pPr>
+      <w:r>
+        <w:rPr>
+          <w:rFonts w:ascii="Calibri" w:hAnsi="Calibri" w:eastAsia="Calibri"/>
+          <w:b w:val="0"/>
+          <w:i w:val="0"/>
+          <w:caps w:val="0"/>
+          <w:color w:val="1F3A5F"/>
+          <w:sz w:val="21"/>
+        </w:rPr>
+        <w:t xml:space="preserve">•  </w:t>
+      </w:r>
+      <w:r>
+        <w:rPr>
+          <w:rFonts w:ascii="Calibri" w:hAnsi="Calibri" w:eastAsia="Calibri"/>
+          <w:b w:val="0"/>
+          <w:i w:val="0"/>
+          <w:caps w:val="0"/>
+          <w:color w:val="222222"/>
+          <w:sz w:val="21"/>
+        </w:rPr>
+        <w:t>Oversaw NYCHA logistics contracts serving 100 developments and supervised ~$500K in monthly NYC DHS billing.</w:t>
+      </w:r>
+    </w:p>
+    <w:p>
+      <w:pPr>
+        <w:keepNext w:val="0"/>
+        <w:spacing w:before="0" w:after="30" w:line="247" w:lineRule="auto"/>
+        <w:ind w:left="259" w:hanging="202"/>
+      </w:pPr>
+      <w:r>
+        <w:rPr>
+          <w:rFonts w:ascii="Calibri" w:hAnsi="Calibri" w:eastAsia="Calibri"/>
+          <w:b w:val="0"/>
+          <w:i w:val="0"/>
+          <w:caps w:val="0"/>
+          <w:color w:val="1F3A5F"/>
+          <w:sz w:val="21"/>
+        </w:rPr>
+        <w:t xml:space="preserve">•  </w:t>
+      </w:r>
+      <w:r>
+        <w:rPr>
+          <w:rFonts w:ascii="Calibri" w:hAnsi="Calibri" w:eastAsia="Calibri"/>
+          <w:b w:val="0"/>
+          <w:i w:val="0"/>
+          <w:caps w:val="0"/>
+          <w:color w:val="222222"/>
+          <w:sz w:val="21"/>
+        </w:rPr>
+        <w:t>Recruited and managed field, sales, and administrative staff; improved HR workflows and data accuracy.</w:t>
+      </w:r>
+    </w:p>
+    <w:p>
+      <w:pPr>
+        <w:keepNext/>
+        <w:tabs>
+          <w:tab w:pos="10368" w:val="right"/>
+        </w:tabs>
+        <w:spacing w:before="120" w:after="0" w:line="240" w:lineRule="auto"/>
+      </w:pPr>
+      <w:r>
+        <w:rPr>
+          <w:rFonts w:ascii="Calibri" w:hAnsi="Calibri" w:eastAsia="Calibri"/>
+          <w:b/>
+          <w:i w:val="0"/>
+          <w:caps w:val="0"/>
+          <w:color w:val="1F3A5F"/>
+          <w:sz w:val="21"/>
+        </w:rPr>
+        <w:t>LAZARRE CONSULTING GROUP</w:t>
+      </w:r>
+      <w:r>
+        <w:rPr>
+          <w:rFonts w:ascii="Calibri" w:hAnsi="Calibri" w:eastAsia="Calibri"/>
+          <w:b w:val="0"/>
+          <w:i w:val="0"/>
+          <w:caps w:val="0"/>
+          <w:color w:val="555555"/>
+          <w:sz w:val="21"/>
+        </w:rPr>
+        <w:t xml:space="preserve">  |  New York, NY</w:t>
+      </w:r>
+      <w:r>
+        <w:rPr>
+          <w:rFonts w:ascii="Calibri" w:hAnsi="Calibri" w:eastAsia="Calibri"/>
+          <w:b/>
+          <w:i w:val="0"/>
+          <w:caps w:val="0"/>
+          <w:color w:val="222222"/>
+          <w:sz w:val="21"/>
+        </w:rPr>
+        <w:tab/>
+        <w:t>Dec 2016 – Present</w:t>
+      </w:r>
+    </w:p>
+    <w:p>
+      <w:pPr>
+        <w:keepNext/>
+        <w:spacing w:before="0" w:after="20" w:line="240" w:lineRule="auto"/>
+      </w:pPr>
+      <w:r>
+        <w:rPr>
+          <w:rFonts w:ascii="Calibri" w:hAnsi="Calibri" w:eastAsia="Calibri"/>
+          <w:b/>
+          <w:i/>
+          <w:caps w:val="0"/>
+          <w:color w:val="222222"/>
+          <w:sz w:val="21"/>
+        </w:rPr>
+        <w:t>Chief Executive Officer</w:t>
+      </w:r>
+    </w:p>
+    <w:p>
+      <w:pPr>
+        <w:keepNext w:val="0"/>
+        <w:spacing w:before="0" w:after="30" w:line="247" w:lineRule="auto"/>
+        <w:ind w:left="259" w:hanging="202"/>
+      </w:pPr>
+      <w:r>
+        <w:rPr>
+          <w:rFonts w:ascii="Calibri" w:hAnsi="Calibri" w:eastAsia="Calibri"/>
+          <w:b w:val="0"/>
+          <w:i w:val="0"/>
+          <w:caps w:val="0"/>
+          <w:color w:val="1F3A5F"/>
+          <w:sz w:val="21"/>
+        </w:rPr>
+        <w:t xml:space="preserve">•  </w:t>
+      </w:r>
+      <w:r>
+        <w:rPr>
+          <w:rFonts w:ascii="Calibri" w:hAnsi="Calibri" w:eastAsia="Calibri"/>
+          <w:b w:val="0"/>
+          <w:i w:val="0"/>
+          <w:caps w:val="0"/>
+          <w:color w:val="222222"/>
+          <w:sz w:val="21"/>
+        </w:rPr>
+        <w:t>Served as financial architect for a $200M national banking development initiative, supporting capital planning and financial structuring.</w:t>
+      </w:r>
+    </w:p>
+    <w:p>
+      <w:pPr>
+        <w:keepNext w:val="0"/>
+        <w:spacing w:before="0" w:after="30" w:line="247" w:lineRule="auto"/>
+        <w:ind w:left="259" w:hanging="202"/>
+      </w:pPr>
+      <w:r>
+        <w:rPr>
+          <w:rFonts w:ascii="Calibri" w:hAnsi="Calibri" w:eastAsia="Calibri"/>
+          <w:b w:val="0"/>
+          <w:i w:val="0"/>
+          <w:caps w:val="0"/>
+          <w:color w:val="1F3A5F"/>
+          <w:sz w:val="21"/>
+        </w:rPr>
+        <w:t xml:space="preserve">•  </w:t>
+      </w:r>
+      <w:r>
+        <w:rPr>
+          <w:rFonts w:ascii="Calibri" w:hAnsi="Calibri" w:eastAsia="Calibri"/>
+          <w:b w:val="0"/>
+          <w:i w:val="0"/>
+          <w:caps w:val="0"/>
+          <w:color w:val="222222"/>
+          <w:sz w:val="21"/>
+        </w:rPr>
+        <w:t>Developed operating and performance-improvement strategies for organizations and brands including American Express OPEN, Ogilvy, and Chubb.</w:t>
+      </w:r>
+    </w:p>
+    <w:p>
+      <w:pPr>
+        <w:keepNext w:val="0"/>
+        <w:spacing w:before="0" w:after="30" w:line="247" w:lineRule="auto"/>
+        <w:ind w:left="259" w:hanging="202"/>
+      </w:pPr>
+      <w:r>
+        <w:rPr>
+          <w:rFonts w:ascii="Calibri" w:hAnsi="Calibri" w:eastAsia="Calibri"/>
+          <w:b w:val="0"/>
+          <w:i w:val="0"/>
+          <w:caps w:val="0"/>
+          <w:color w:val="1F3A5F"/>
+          <w:sz w:val="21"/>
+        </w:rPr>
+        <w:t xml:space="preserve">•  </w:t>
+      </w:r>
+      <w:r>
+        <w:rPr>
+          <w:rFonts w:ascii="Calibri" w:hAnsi="Calibri" w:eastAsia="Calibri"/>
+          <w:b w:val="0"/>
+          <w:i w:val="0"/>
+          <w:caps w:val="0"/>
+          <w:color w:val="222222"/>
+          <w:sz w:val="21"/>
+        </w:rPr>
+        <w:t>Led financial remediation for a psychological services practice, identifying ~$251K in unclaimed deductions and preparing corrected financial statements.</w:t>
+      </w:r>
+    </w:p>
+    <w:p>
+      <w:pPr>
+        <w:keepNext/>
+        <w:tabs>
+          <w:tab w:pos="10368" w:val="right"/>
+        </w:tabs>
+        <w:spacing w:before="120" w:after="0" w:line="240" w:lineRule="auto"/>
+      </w:pPr>
+      <w:r>
+        <w:rPr>
+          <w:rFonts w:ascii="Calibri" w:hAnsi="Calibri" w:eastAsia="Calibri"/>
+          <w:b/>
+          <w:i w:val="0"/>
+          <w:caps w:val="0"/>
+          <w:color w:val="1F3A5F"/>
+          <w:sz w:val="21"/>
+        </w:rPr>
+        <w:t>FITNESS COLLECTIVE INC.</w:t>
+      </w:r>
+      <w:r>
+        <w:rPr>
+          <w:rFonts w:ascii="Calibri" w:hAnsi="Calibri" w:eastAsia="Calibri"/>
+          <w:b w:val="0"/>
+          <w:i w:val="0"/>
+          <w:caps w:val="0"/>
+          <w:color w:val="555555"/>
+          <w:sz w:val="21"/>
+        </w:rPr>
+        <w:t xml:space="preserve">  |  Brooklyn, NY</w:t>
+      </w:r>
+      <w:r>
+        <w:rPr>
+          <w:rFonts w:ascii="Calibri" w:hAnsi="Calibri" w:eastAsia="Calibri"/>
+          <w:b/>
+          <w:i w:val="0"/>
+          <w:caps w:val="0"/>
+          <w:color w:val="222222"/>
+          <w:sz w:val="21"/>
+        </w:rPr>
+        <w:tab/>
+        <w:t>2004 – 2016</w:t>
+      </w:r>
+    </w:p>
+    <w:p>
+      <w:pPr>
+        <w:keepNext/>
+        <w:spacing w:before="0" w:after="20" w:line="240" w:lineRule="auto"/>
+      </w:pPr>
+      <w:r>
+        <w:rPr>
+          <w:rFonts w:ascii="Calibri" w:hAnsi="Calibri" w:eastAsia="Calibri"/>
+          <w:b/>
+          <w:i/>
+          <w:caps w:val="0"/>
+          <w:color w:val="222222"/>
+          <w:sz w:val="21"/>
+        </w:rPr>
+        <w:t>CEO &amp; Co-Founder</w:t>
+      </w:r>
+    </w:p>
+    <w:p>
+      <w:pPr>
+        <w:keepNext w:val="0"/>
+        <w:spacing w:before="0" w:after="30" w:line="247" w:lineRule="auto"/>
+        <w:ind w:left="259" w:hanging="202"/>
+      </w:pPr>
+      <w:r>
+        <w:rPr>
+          <w:rFonts w:ascii="Calibri" w:hAnsi="Calibri" w:eastAsia="Calibri"/>
+          <w:b w:val="0"/>
+          <w:i w:val="0"/>
+          <w:caps w:val="0"/>
+          <w:color w:val="1F3A5F"/>
+          <w:sz w:val="21"/>
+        </w:rPr>
+        <w:t xml:space="preserve">•  </w:t>
+      </w:r>
+      <w:r>
+        <w:rPr>
+          <w:rFonts w:ascii="Calibri" w:hAnsi="Calibri" w:eastAsia="Calibri"/>
+          <w:b w:val="0"/>
+          <w:i w:val="0"/>
+          <w:caps w:val="0"/>
+          <w:color w:val="222222"/>
+          <w:sz w:val="21"/>
+        </w:rPr>
+        <w:t>Scaled from a $5,000 investment to $1M in annual revenue within 24 months, then franchised and launched three additional locations, growing to $10M in annual sales.</w:t>
+      </w:r>
+    </w:p>
+    <w:p>
+      <w:pPr>
+        <w:keepNext w:val="0"/>
+        <w:spacing w:before="0" w:after="30" w:line="247" w:lineRule="auto"/>
+        <w:ind w:left="259" w:hanging="202"/>
+      </w:pPr>
+      <w:r>
+        <w:rPr>
+          <w:rFonts w:ascii="Calibri" w:hAnsi="Calibri" w:eastAsia="Calibri"/>
+          <w:b w:val="0"/>
+          <w:i w:val="0"/>
+          <w:caps w:val="0"/>
+          <w:color w:val="1F3A5F"/>
+          <w:sz w:val="21"/>
+        </w:rPr>
+        <w:t xml:space="preserve">•  </w:t>
+      </w:r>
+      <w:r>
+        <w:rPr>
+          <w:rFonts w:ascii="Calibri" w:hAnsi="Calibri" w:eastAsia="Calibri"/>
+          <w:b w:val="0"/>
+          <w:i w:val="0"/>
+          <w:caps w:val="0"/>
+          <w:color w:val="222222"/>
+          <w:sz w:val="21"/>
+        </w:rPr>
+        <w:t>Built HR, payroll, and benefits infrastructure for 50+ employees, overseeing recruitment, training, performance management, and ~$65K in monthly payroll.</w:t>
+      </w:r>
+    </w:p>
+    <w:p>
+      <w:pPr>
+        <w:keepNext w:val="0"/>
+        <w:spacing w:before="0" w:after="30" w:line="247" w:lineRule="auto"/>
+        <w:ind w:left="259" w:hanging="202"/>
+      </w:pPr>
+      <w:r>
+        <w:rPr>
+          <w:rFonts w:ascii="Calibri" w:hAnsi="Calibri" w:eastAsia="Calibri"/>
+          <w:b w:val="0"/>
+          <w:i w:val="0"/>
+          <w:caps w:val="0"/>
+          <w:color w:val="1F3A5F"/>
+          <w:sz w:val="21"/>
+        </w:rPr>
+        <w:t xml:space="preserve">•  </w:t>
+      </w:r>
+      <w:r>
+        <w:rPr>
+          <w:rFonts w:ascii="Calibri" w:hAnsi="Calibri" w:eastAsia="Calibri"/>
+          <w:b w:val="0"/>
+          <w:i w:val="0"/>
+          <w:caps w:val="0"/>
+          <w:color w:val="222222"/>
+          <w:sz w:val="21"/>
+        </w:rPr>
+        <w:t>Implemented Mindbody CRM for client tracking, booking, and targeted engagement across 4,000+ clients; founded a training academy that certified 25 trainers.</w:t>
+      </w:r>
+    </w:p>
+    <w:p>
+      <w:pPr>
+        <w:keepNext w:val="0"/>
+        <w:spacing w:before="0" w:after="30" w:line="247" w:lineRule="auto"/>
+        <w:ind w:left="259" w:hanging="202"/>
+      </w:pPr>
+      <w:r>
+        <w:rPr>
+          <w:rFonts w:ascii="Calibri" w:hAnsi="Calibri" w:eastAsia="Calibri"/>
+          <w:b w:val="0"/>
+          <w:i w:val="0"/>
+          <w:caps w:val="0"/>
+          <w:color w:val="1F3A5F"/>
+          <w:sz w:val="21"/>
+        </w:rPr>
+        <w:t xml:space="preserve">•  </w:t>
+      </w:r>
+      <w:r>
+        <w:rPr>
+          <w:rFonts w:ascii="Calibri" w:hAnsi="Calibri" w:eastAsia="Calibri"/>
+          <w:b w:val="0"/>
+          <w:i w:val="0"/>
+          <w:caps w:val="0"/>
+          <w:color w:val="222222"/>
+          <w:sz w:val="21"/>
+        </w:rPr>
+        <w:t>Developed local partnerships, cross-marketing, and community events; negotiated vendor and utility agreements.</w:t>
+      </w:r>
+    </w:p>
+    <w:p>
+      <w:pPr>
+        <w:keepNext/>
+        <w:spacing w:before="160" w:after="60" w:line="240" w:lineRule="auto"/>
+        <w:pBdr>
+          <w:bottom w:val="single" w:sz="8" w:space="1" w:color="1F3A5F"/>
+        </w:pBdr>
+      </w:pPr>
+      <w:r>
+        <w:rPr>
+          <w:rFonts w:ascii="Calibri" w:hAnsi="Calibri" w:eastAsia="Calibri"/>
+          <w:b/>
+          <w:i w:val="0"/>
+          <w:caps/>
+          <w:color w:val="1F3A5F"/>
+          <w:sz w:val="23"/>
+        </w:rPr>
+        <w:t>Technology &amp; Program Innovation</w:t>
+      </w:r>
+    </w:p>
+    <w:p>
+      <w:pPr>
+        <w:keepNext w:val="0"/>
+        <w:spacing w:before="0" w:after="30" w:line="247" w:lineRule="auto"/>
+        <w:ind w:left="259" w:hanging="202"/>
+      </w:pPr>
+      <w:r>
+        <w:rPr>
+          <w:rFonts w:ascii="Calibri" w:hAnsi="Calibri" w:eastAsia="Calibri"/>
+          <w:b w:val="0"/>
+          <w:i w:val="0"/>
+          <w:caps w:val="0"/>
+          <w:color w:val="1F3A5F"/>
+          <w:sz w:val="21"/>
+        </w:rPr>
+        <w:t xml:space="preserve">•  </w:t>
+      </w:r>
+      <w:r>
+        <w:rPr>
+          <w:rFonts w:ascii="Calibri" w:hAnsi="Calibri" w:eastAsia="Calibri"/>
+          <w:b/>
+          <w:i w:val="0"/>
+          <w:caps w:val="0"/>
+          <w:color w:val="222222"/>
+          <w:sz w:val="21"/>
         </w:rPr>
         <w:t xml:space="preserve">SkyNet: </w:t>
       </w:r>
       <w:r>
         <w:rPr>
-          <w:rFonts w:ascii="Calibri" w:hAnsi="Calibri"/>
+          <w:rFonts w:ascii="Calibri" w:hAnsi="Calibri" w:eastAsia="Calibri"/>
           <w:b w:val="0"/>
           <w:i w:val="0"/>
-          <w:color w:val="3A3A3A"/>
-          <w:sz w:val="18"/>
+          <w:caps w:val="0"/>
+          <w:color w:val="222222"/>
+          <w:sz w:val="21"/>
         </w:rPr>
-        <w:t xml:space="preserve">Built an AI-supported workflow connecting opportunity research, evaluation, document preparation, and reporting, with evidence validation, cost controls, and performance tracking.</w:t>
+        <w:t>Built an AI-supported workflow connecting opportunity research, evaluation, document preparation, and reporting, with evidence validation, cost controls, and performance tracking.</w:t>
       </w:r>
     </w:p>
     <w:p>
       <w:pPr>
-        <w:spacing w:before="14" w:after="14" w:lineRule="exact" w:line="228"/>
-        <w:ind w:left="187" w:hanging="187"/>
+        <w:keepNext w:val="0"/>
+        <w:spacing w:before="0" w:after="30" w:line="247" w:lineRule="auto"/>
+        <w:ind w:left="259" w:hanging="202"/>
       </w:pPr>
       <w:r>
         <w:rPr>
-          <w:rFonts w:ascii="Calibri" w:hAnsi="Calibri"/>
+          <w:rFonts w:ascii="Calibri" w:hAnsi="Calibri" w:eastAsia="Calibri"/>
           <w:b w:val="0"/>
           <w:i w:val="0"/>
-          <w:color w:val="C09628"/>
-          <w:sz w:val="18"/>
+          <w:caps w:val="0"/>
+          <w:color w:val="1F3A5F"/>
+          <w:sz w:val="21"/>
         </w:rPr>
-        <w:t xml:space="preserve">• </w:t>
+        <w:t xml:space="preserve">•  </w:t>
       </w:r>
       <w:r>
         <w:rPr>
-          <w:rFonts w:ascii="Calibri" w:hAnsi="Calibri"/>
+          <w:rFonts w:ascii="Calibri" w:hAnsi="Calibri" w:eastAsia="Calibri"/>
           <w:b/>
           <w:i w:val="0"/>
-          <w:color w:val="1C1C1C"/>
-          <w:sz w:val="18"/>
+          <w:caps w:val="0"/>
+          <w:color w:val="222222"/>
+          <w:sz w:val="21"/>
         </w:rPr>
         <w:t xml:space="preserve">JWA AI Career Launch: </w:t>
       </w:r>
       <w:r>
         <w:rPr>
-          <w:rFonts w:ascii="Calibri" w:hAnsi="Calibri"/>
+          <w:rFonts w:ascii="Calibri" w:hAnsi="Calibri" w:eastAsia="Calibri"/>
           <w:b w:val="0"/>
           <w:i w:val="0"/>
-          <w:color w:val="3A3A3A"/>
-          <w:sz w:val="18"/>
+          <w:caps w:val="0"/>
+          <w:color w:val="222222"/>
+          <w:sz w:val="21"/>
         </w:rPr>
-        <w:t xml:space="preserve">Designed and submitted a Citi Foundation proposal connecting AI learning, workforce preparation, and employment support, with measures for skills, employment, wages, and retention.</w:t>
+        <w:t>Designed and submitted a Citi Foundation proposal linking AI learning, workforce preparation, and employment support, with measures for skills, employment, wages, and retention.</w:t>
       </w:r>
     </w:p>
     <w:p>
       <w:pPr>
         <w:keepNext/>
-        <w:spacing w:before="120" w:after="40"/>
+        <w:spacing w:before="160" w:after="60" w:line="240" w:lineRule="auto"/>
         <w:pBdr>
-          <w:bottom w:val="single" w:sz="8" w:space="1" w:color="C09628"/>
+          <w:bottom w:val="single" w:sz="8" w:space="1" w:color="1F3A5F"/>
         </w:pBdr>
-      </w:pPr>
-    </w:p>
-    <w:p>
-      <w:pPr>
-        <w:keepNext/>
-        <w:spacing w:before="0" w:after="60"/>
-        <w:ind w:left="0"/>
       </w:pPr>
       <w:r>
         <w:rPr>
-          <w:rFonts w:ascii="Calibri" w:hAnsi="Calibri"/>
+          <w:rFonts w:ascii="Calibri" w:hAnsi="Calibri" w:eastAsia="Calibri"/>
           <w:b/>
           <w:i w:val="0"/>
-          <w:color w:val="C09628"/>
-          <w:sz w:val="19"/>
+          <w:caps/>
+          <w:color w:val="1F3A5F"/>
+          <w:sz w:val="23"/>
         </w:rPr>
-        <w:t xml:space="preserve">EDUCATION</w:t>
+        <w:t>Education</w:t>
       </w:r>
     </w:p>
     <w:p>
       <w:pPr>
-        <w:spacing w:before="10" w:after="10"/>
+        <w:keepNext w:val="0"/>
+        <w:tabs>
+          <w:tab w:pos="10368" w:val="right"/>
+        </w:tabs>
+        <w:spacing w:before="0" w:after="20" w:line="240" w:lineRule="auto"/>
       </w:pPr>
       <w:r>
         <w:rPr>
-          <w:rFonts w:ascii="Calibri" w:hAnsi="Calibri"/>
+          <w:rFonts w:ascii="Calibri" w:hAnsi="Calibri" w:eastAsia="Calibri"/>
           <w:b/>
           <w:i w:val="0"/>
-          <w:color w:val="1C1C1C"/>
-          <w:sz w:val="18"/>
+          <w:caps w:val="0"/>
+          <w:color w:val="222222"/>
+          <w:sz w:val="21"/>
         </w:rPr>
-        <w:t xml:space="preserve">Master of Business Administration, General Business Management</w:t>
+        <w:t>Master of Business Administration, General Business Management</w:t>
       </w:r>
       <w:r>
         <w:rPr>
-          <w:rFonts w:ascii="Calibri" w:hAnsi="Calibri"/>
+          <w:rFonts w:ascii="Calibri" w:hAnsi="Calibri" w:eastAsia="Calibri"/>
           <w:b w:val="0"/>
           <w:i w:val="0"/>
-          <w:color w:val="3A3A3A"/>
-          <w:sz w:val="18"/>
+          <w:caps w:val="0"/>
+          <w:color w:val="222222"/>
+          <w:sz w:val="21"/>
         </w:rPr>
-        <w:t xml:space="preserve">  |  West Texas A&amp;M University  |  2023</w:t>
+        <w:t xml:space="preserve">  |  West Texas A&amp;M University</w:t>
+      </w:r>
+      <w:r>
+        <w:rPr>
+          <w:rFonts w:ascii="Calibri" w:hAnsi="Calibri" w:eastAsia="Calibri"/>
+          <w:b w:val="0"/>
+          <w:i w:val="0"/>
+          <w:caps w:val="0"/>
+          <w:color w:val="222222"/>
+          <w:sz w:val="21"/>
+        </w:rPr>
+        <w:tab/>
+        <w:t>2023</w:t>
       </w:r>
     </w:p>
     <w:p>
       <w:pPr>
-        <w:spacing w:before="10" w:after="10"/>
+        <w:keepNext w:val="0"/>
+        <w:tabs>
+          <w:tab w:pos="10368" w:val="right"/>
+        </w:tabs>
+        <w:spacing w:before="0" w:after="20" w:line="240" w:lineRule="auto"/>
       </w:pPr>
       <w:r>
         <w:rPr>
-          <w:rFonts w:ascii="Calibri" w:hAnsi="Calibri"/>
+          <w:rFonts w:ascii="Calibri" w:hAnsi="Calibri" w:eastAsia="Calibri"/>
           <w:b/>
           <w:i w:val="0"/>
-          <w:color w:val="1C1C1C"/>
-          <w:sz w:val="18"/>
+          <w:caps w:val="0"/>
+          <w:color w:val="222222"/>
+          <w:sz w:val="21"/>
         </w:rPr>
-        <w:t xml:space="preserve">Bachelor of Science, Small Business Administration</w:t>
+        <w:t>Bachelor of Science, Small Business Administration</w:t>
       </w:r>
       <w:r>
         <w:rPr>
-          <w:rFonts w:ascii="Calibri" w:hAnsi="Calibri"/>
+          <w:rFonts w:ascii="Calibri" w:hAnsi="Calibri" w:eastAsia="Calibri"/>
           <w:b w:val="0"/>
           <w:i w:val="0"/>
-          <w:color w:val="3A3A3A"/>
-          <w:sz w:val="18"/>
+          <w:caps w:val="0"/>
+          <w:color w:val="222222"/>
+          <w:sz w:val="21"/>
         </w:rPr>
         <w:t xml:space="preserve">  |  Northern Arizona University</w:t>
       </w:r>
     </w:p>
     <w:sectPr>
       <w:pgSz w:w="12240" w:h="15840"/>
-      <w:pgMar w:top="648" w:right="864" w:bottom="648" w:left="864" w:header="720" w:footer="720" w:gutter="0"/>
+      <w:pgMar w:top="792" w:right="936" w:bottom="792" w:left="936" w:header="720" w:footer="720" w:gutter="0"/>
       <w:cols w:space="720"/>
       <w:docGrid w:linePitch="360"/>
     </w:sectPr>
@@ -2226,6 +1947,10 @@
     <w:name w:val="Normal"/>
     <w:qFormat/>
     <w:rsid w:val="00FC693F"/>
+    <w:rPr>
+      <w:rFonts w:ascii="Calibri" w:hAnsi="Calibri"/>
+      <w:sz w:val="21"/>
+    </w:rPr>
   </w:style>
   <w:style w:type="paragraph" w:styleId="Header">
     <w:name w:val="header"/>

</xml_diff>

<commit_message>
Executive resume: add 4-to-60 workforce growth, 12 direct reports, 92% retention; tighten to 2 pages
Co-Authored-By: Claude Opus 5.5 <noreply@anthropic.com>
Claude-Session: https://claude.ai/code/session_01Rb4ZTXZXZvRymPmEXq9dPj
</commit_message>
<xml_diff>
--- a/resumes/Clavel_Lazarre_Executive_Resume.docx
+++ b/resumes/Clavel_Lazarre_Executive_Resume.docx
@@ -62,7 +62,7 @@
     <w:p>
       <w:pPr>
         <w:keepNext/>
-        <w:spacing w:before="160" w:after="60" w:line="240" w:lineRule="auto"/>
+        <w:spacing w:before="140" w:after="40" w:line="240" w:lineRule="auto"/>
         <w:pBdr>
           <w:bottom w:val="single" w:sz="8" w:space="1" w:color="1F3A5F"/>
         </w:pBdr>
@@ -91,9 +91,9 @@
           <w:i w:val="0"/>
           <w:caps w:val="0"/>
           <w:color w:val="222222"/>
-          <w:sz w:val="21"/>
+          <w:sz w:val="20"/>
         </w:rPr>
-        <w:t>Operations and finance executive with 20+ years of experience building businesses, leading mission-driven programs, and creating the systems organizations need to grow. Held full P&amp;L accountability for an $80M portfolio and financial and operational oversight of a 140-person division. Co-founded a fitness business that reached $1M in annual revenue within 24 months, then expanded through a franchise model to $10M in annual sales.</w:t>
+        <w:t>Operations and finance executive with 20+ years of experience building businesses, leading mission-driven programs, and creating the systems organizations need to grow. Held full P&amp;L accountability for an $80M portfolio and financial and operational oversight of a 140-person division. Co-founded a fitness business that reached $1M in annual revenue within 24 months, then expanded through a franchise model to $10M in annual sales while growing the team from 4 to 60 full-time employees.</w:t>
       </w:r>
     </w:p>
     <w:p>
@@ -108,7 +108,7 @@
           <w:i w:val="0"/>
           <w:caps w:val="0"/>
           <w:color w:val="222222"/>
-          <w:sz w:val="21"/>
+          <w:sz w:val="20"/>
         </w:rPr>
         <w:t>Brings a founder’s understanding of growth and an operator’s discipline in execution. Partners with CEOs, boards, public agencies, and community organizations to evaluate opportunities, align resources, and translate strategy into budgets, partnerships, programs, and operating processes.</w:t>
       </w:r>
@@ -116,7 +116,7 @@
     <w:p>
       <w:pPr>
         <w:keepNext/>
-        <w:spacing w:before="160" w:after="60" w:line="240" w:lineRule="auto"/>
+        <w:spacing w:before="140" w:after="40" w:line="240" w:lineRule="auto"/>
         <w:pBdr>
           <w:bottom w:val="single" w:sz="8" w:space="1" w:color="1F3A5F"/>
         </w:pBdr>
@@ -136,7 +136,7 @@
     <w:p>
       <w:pPr>
         <w:keepNext w:val="0"/>
-        <w:spacing w:before="0" w:after="30" w:line="247" w:lineRule="auto"/>
+        <w:spacing w:before="0" w:after="20" w:line="240" w:lineRule="auto"/>
         <w:ind w:left="259" w:hanging="202"/>
       </w:pPr>
       <w:r>
@@ -146,7 +146,7 @@
           <w:i w:val="0"/>
           <w:caps w:val="0"/>
           <w:color w:val="1F3A5F"/>
-          <w:sz w:val="21"/>
+          <w:sz w:val="20"/>
         </w:rPr>
         <w:t xml:space="preserve">•  </w:t>
       </w:r>
@@ -157,7 +157,7 @@
           <w:i w:val="0"/>
           <w:caps w:val="0"/>
           <w:color w:val="222222"/>
-          <w:sz w:val="21"/>
+          <w:sz w:val="20"/>
         </w:rPr>
         <w:t xml:space="preserve">Built and expanded a business: </w:t>
       </w:r>
@@ -168,15 +168,15 @@
           <w:i w:val="0"/>
           <w:caps w:val="0"/>
           <w:color w:val="222222"/>
-          <w:sz w:val="21"/>
+          <w:sz w:val="20"/>
         </w:rPr>
-        <w:t>Grew Fitness Collective from a $5,000 investment to $10M in annual sales, establishing a franchise model and launching three additional locations.</w:t>
+        <w:t>Grew Fitness Collective from a $5,000 investment to $10M in annual sales and from 4 to 60 full-time employees (15x), establishing a franchise model and three additional locations.</w:t>
       </w:r>
     </w:p>
     <w:p>
       <w:pPr>
         <w:keepNext w:val="0"/>
-        <w:spacing w:before="0" w:after="30" w:line="247" w:lineRule="auto"/>
+        <w:spacing w:before="0" w:after="20" w:line="240" w:lineRule="auto"/>
         <w:ind w:left="259" w:hanging="202"/>
       </w:pPr>
       <w:r>
@@ -186,7 +186,7 @@
           <w:i w:val="0"/>
           <w:caps w:val="0"/>
           <w:color w:val="1F3A5F"/>
-          <w:sz w:val="21"/>
+          <w:sz w:val="20"/>
         </w:rPr>
         <w:t xml:space="preserve">•  </w:t>
       </w:r>
@@ -197,7 +197,7 @@
           <w:i w:val="0"/>
           <w:caps w:val="0"/>
           <w:color w:val="222222"/>
-          <w:sz w:val="21"/>
+          <w:sz w:val="20"/>
         </w:rPr>
         <w:t xml:space="preserve">Led at substantial scale: </w:t>
       </w:r>
@@ -208,7 +208,7 @@
           <w:i w:val="0"/>
           <w:caps w:val="0"/>
           <w:color w:val="222222"/>
-          <w:sz w:val="21"/>
+          <w:sz w:val="20"/>
         </w:rPr>
         <w:t>Oversaw a 140-person division and an $80M P&amp;L at Osborne Association, connecting financial accountability, workforce development, partnerships, and service delivery.</w:t>
       </w:r>
@@ -216,7 +216,7 @@
     <w:p>
       <w:pPr>
         <w:keepNext w:val="0"/>
-        <w:spacing w:before="0" w:after="30" w:line="247" w:lineRule="auto"/>
+        <w:spacing w:before="0" w:after="20" w:line="240" w:lineRule="auto"/>
         <w:ind w:left="259" w:hanging="202"/>
       </w:pPr>
       <w:r>
@@ -226,7 +226,7 @@
           <w:i w:val="0"/>
           <w:caps w:val="0"/>
           <w:color w:val="1F3A5F"/>
-          <w:sz w:val="21"/>
+          <w:sz w:val="20"/>
         </w:rPr>
         <w:t xml:space="preserve">•  </w:t>
       </w:r>
@@ -237,7 +237,7 @@
           <w:i w:val="0"/>
           <w:caps w:val="0"/>
           <w:color w:val="222222"/>
-          <w:sz w:val="21"/>
+          <w:sz w:val="20"/>
         </w:rPr>
         <w:t xml:space="preserve">Created mission-driven programs: </w:t>
       </w:r>
@@ -248,15 +248,15 @@
           <w:i w:val="0"/>
           <w:caps w:val="0"/>
           <w:color w:val="222222"/>
-          <w:sz w:val="21"/>
+          <w:sz w:val="20"/>
         </w:rPr>
-        <w:t>Led a nine-month transitional-employment program serving 300+ formerly incarcerated people annually; created and delivered an 18-month NYPA clean-energy workforce project.</w:t>
+        <w:t>Led a nine-month transitional-employment program serving 300+ formerly incarcerated people annually; created and delivered an 18-month NYPA clean-energy workforce project with 92% retention.</w:t>
       </w:r>
     </w:p>
     <w:p>
       <w:pPr>
         <w:keepNext w:val="0"/>
-        <w:spacing w:before="0" w:after="30" w:line="247" w:lineRule="auto"/>
+        <w:spacing w:before="0" w:after="20" w:line="240" w:lineRule="auto"/>
         <w:ind w:left="259" w:hanging="202"/>
       </w:pPr>
       <w:r>
@@ -266,7 +266,7 @@
           <w:i w:val="0"/>
           <w:caps w:val="0"/>
           <w:color w:val="1F3A5F"/>
-          <w:sz w:val="21"/>
+          <w:sz w:val="20"/>
         </w:rPr>
         <w:t xml:space="preserve">•  </w:t>
       </w:r>
@@ -277,7 +277,7 @@
           <w:i w:val="0"/>
           <w:caps w:val="0"/>
           <w:color w:val="222222"/>
-          <w:sz w:val="21"/>
+          <w:sz w:val="20"/>
         </w:rPr>
         <w:t xml:space="preserve">Improved operating performance: </w:t>
       </w:r>
@@ -288,7 +288,7 @@
           <w:i w:val="0"/>
           <w:caps w:val="0"/>
           <w:color w:val="222222"/>
-          <w:sz w:val="21"/>
+          <w:sz w:val="20"/>
         </w:rPr>
         <w:t>Cut vendor costs 35% and processing time 60% at Alluel Logistics through negotiation and systems improvements.</w:t>
       </w:r>
@@ -296,7 +296,7 @@
     <w:p>
       <w:pPr>
         <w:keepNext/>
-        <w:spacing w:before="160" w:after="60" w:line="240" w:lineRule="auto"/>
+        <w:spacing w:before="140" w:after="40" w:line="240" w:lineRule="auto"/>
         <w:pBdr>
           <w:bottom w:val="single" w:sz="8" w:space="1" w:color="1F3A5F"/>
         </w:pBdr>
@@ -325,7 +325,7 @@
           <w:i w:val="0"/>
           <w:caps w:val="0"/>
           <w:color w:val="222222"/>
-          <w:sz w:val="21"/>
+          <w:sz w:val="20"/>
         </w:rPr>
         <w:t>Organizational Growth  |  General Management  |  P&amp;L Leadership  |  Budgeting &amp; Resource Allocation  |  CEO &amp; Board Partnership  |  People Operations  |  Program Development  |  Coalition Building  |  Fundraising &amp; Grant Stewardship  |  Risk Management  |  Performance Reporting &amp; KPIs  |  Technology &amp; Process Improvement  |  Workforce Development  |  Social Enterprise  |  Practical AI Implementation</w:t>
       </w:r>
@@ -333,7 +333,7 @@
     <w:p>
       <w:pPr>
         <w:keepNext/>
-        <w:spacing w:before="160" w:after="60" w:line="240" w:lineRule="auto"/>
+        <w:spacing w:before="140" w:after="40" w:line="240" w:lineRule="auto"/>
         <w:pBdr>
           <w:bottom w:val="single" w:sz="8" w:space="1" w:color="1F3A5F"/>
         </w:pBdr>
@@ -354,9 +354,9 @@
       <w:pPr>
         <w:keepNext/>
         <w:tabs>
-          <w:tab w:pos="10368" w:val="right"/>
+          <w:tab w:pos="10512" w:val="right"/>
         </w:tabs>
-        <w:spacing w:before="120" w:after="0" w:line="240" w:lineRule="auto"/>
+        <w:spacing w:before="100" w:after="0" w:line="240" w:lineRule="auto"/>
       </w:pPr>
       <w:r>
         <w:rPr>
@@ -365,7 +365,7 @@
           <w:i w:val="0"/>
           <w:caps w:val="0"/>
           <w:color w:val="1F3A5F"/>
-          <w:sz w:val="21"/>
+          <w:sz w:val="20"/>
         </w:rPr>
         <w:t>MAROON STRATEGIST, LLC</w:t>
       </w:r>
@@ -376,7 +376,7 @@
           <w:i w:val="0"/>
           <w:caps w:val="0"/>
           <w:color w:val="555555"/>
-          <w:sz w:val="21"/>
+          <w:sz w:val="20"/>
         </w:rPr>
         <w:t xml:space="preserve">  |  Brooklyn, NY</w:t>
       </w:r>
@@ -387,7 +387,7 @@
           <w:i w:val="0"/>
           <w:caps w:val="0"/>
           <w:color w:val="222222"/>
-          <w:sz w:val="21"/>
+          <w:sz w:val="20"/>
         </w:rPr>
         <w:tab/>
         <w:t>Mar 2024 – Present</w:t>
@@ -405,7 +405,7 @@
           <w:i/>
           <w:caps w:val="0"/>
           <w:color w:val="222222"/>
-          <w:sz w:val="21"/>
+          <w:sz w:val="20"/>
         </w:rPr>
         <w:t>Chief Financial Strategy Officer</w:t>
       </w:r>
@@ -424,13 +424,13 @@
           <w:color w:val="555555"/>
           <w:sz w:val="20"/>
         </w:rPr>
-        <w:t>Fractional CFO and program leadership for nonprofit, public-sector, education, healthcare, and service businesses.</w:t>
+        <w:t>Fractional CFO and program leadership across nonprofit, public-sector, education, healthcare, and service businesses, connecting financial planning with partnerships, operating systems, and program execution.</w:t>
       </w:r>
     </w:p>
     <w:p>
       <w:pPr>
         <w:keepNext w:val="0"/>
-        <w:spacing w:before="0" w:after="30" w:line="247" w:lineRule="auto"/>
+        <w:spacing w:before="0" w:after="20" w:line="240" w:lineRule="auto"/>
         <w:ind w:left="259" w:hanging="202"/>
       </w:pPr>
       <w:r>
@@ -440,7 +440,7 @@
           <w:i w:val="0"/>
           <w:caps w:val="0"/>
           <w:color w:val="1F3A5F"/>
-          <w:sz w:val="21"/>
+          <w:sz w:val="20"/>
         </w:rPr>
         <w:t xml:space="preserve">•  </w:t>
       </w:r>
@@ -451,15 +451,15 @@
           <w:i w:val="0"/>
           <w:caps w:val="0"/>
           <w:color w:val="222222"/>
-          <w:sz w:val="21"/>
+          <w:sz w:val="20"/>
         </w:rPr>
-        <w:t>Created and led the NYPA clean-energy workforce training project from inception through final delivery over 18 months, owning proposal development, program design, budgeting, partner coordination, and participant training.</w:t>
+        <w:t>Created and led the NYPA clean-energy workforce training project from inception through completion over 18 months, overseeing proposal development, program design, budgeting, partner coordination, and participant training.</w:t>
       </w:r>
     </w:p>
     <w:p>
       <w:pPr>
         <w:keepNext w:val="0"/>
-        <w:spacing w:before="0" w:after="30" w:line="247" w:lineRule="auto"/>
+        <w:spacing w:before="0" w:after="20" w:line="240" w:lineRule="auto"/>
         <w:ind w:left="259" w:hanging="202"/>
       </w:pPr>
       <w:r>
@@ -469,7 +469,7 @@
           <w:i w:val="0"/>
           <w:caps w:val="0"/>
           <w:color w:val="1F3A5F"/>
-          <w:sz w:val="21"/>
+          <w:sz w:val="20"/>
         </w:rPr>
         <w:t xml:space="preserve">•  </w:t>
       </w:r>
@@ -480,15 +480,15 @@
           <w:i w:val="0"/>
           <w:caps w:val="0"/>
           <w:color w:val="222222"/>
-          <w:sz w:val="21"/>
+          <w:sz w:val="20"/>
         </w:rPr>
-        <w:t>Built a workforce coalition spanning city and state agencies, elected officials, academic partners, Stanford Innovation Lab, KPMG, and the New York Power Authority.</w:t>
+        <w:t>Completed the program with a 92% retention rate and established new energy-sector employer relationships, building a partnership network to support continued workforce development.</w:t>
       </w:r>
     </w:p>
     <w:p>
       <w:pPr>
         <w:keepNext w:val="0"/>
-        <w:spacing w:before="0" w:after="30" w:line="247" w:lineRule="auto"/>
+        <w:spacing w:before="0" w:after="20" w:line="240" w:lineRule="auto"/>
         <w:ind w:left="259" w:hanging="202"/>
       </w:pPr>
       <w:r>
@@ -498,7 +498,7 @@
           <w:i w:val="0"/>
           <w:caps w:val="0"/>
           <w:color w:val="1F3A5F"/>
-          <w:sz w:val="21"/>
+          <w:sz w:val="20"/>
         </w:rPr>
         <w:t xml:space="preserve">•  </w:t>
       </w:r>
@@ -509,15 +509,15 @@
           <w:i w:val="0"/>
           <w:caps w:val="0"/>
           <w:color w:val="222222"/>
-          <w:sz w:val="21"/>
+          <w:sz w:val="20"/>
         </w:rPr>
-        <w:t>Managed a multimillion-dollar project budget: allocated direct and indirect costs, managed restricted cash flow, and aligned spending with grant requirements and delivery milestones.</w:t>
+        <w:t>Built a coalition involving city and state agencies, elected officials, academic partners, Stanford Innovation Lab, KPMG, and the New York Power Authority; coordinated responsibilities and resources around training delivery.</w:t>
       </w:r>
     </w:p>
     <w:p>
       <w:pPr>
         <w:keepNext w:val="0"/>
-        <w:spacing w:before="0" w:after="30" w:line="247" w:lineRule="auto"/>
+        <w:spacing w:before="0" w:after="20" w:line="240" w:lineRule="auto"/>
         <w:ind w:left="259" w:hanging="202"/>
       </w:pPr>
       <w:r>
@@ -527,7 +527,7 @@
           <w:i w:val="0"/>
           <w:caps w:val="0"/>
           <w:color w:val="1F3A5F"/>
-          <w:sz w:val="21"/>
+          <w:sz w:val="20"/>
         </w:rPr>
         <w:t xml:space="preserve">•  </w:t>
       </w:r>
@@ -538,15 +538,15 @@
           <w:i w:val="0"/>
           <w:caps w:val="0"/>
           <w:color w:val="222222"/>
-          <w:sz w:val="21"/>
+          <w:sz w:val="20"/>
         </w:rPr>
-        <w:t>Led fundraising and partnership-agreement development, tying funding commitments to partner responsibilities and implementation needs.</w:t>
+        <w:t>Developed and managed a multimillion-dollar budget, allocating direct and indirect costs, managing restricted cash flow, and aligning expenditures with grant requirements and delivery milestones.</w:t>
       </w:r>
     </w:p>
     <w:p>
       <w:pPr>
         <w:keepNext w:val="0"/>
-        <w:spacing w:before="0" w:after="30" w:line="247" w:lineRule="auto"/>
+        <w:spacing w:before="0" w:after="20" w:line="240" w:lineRule="auto"/>
         <w:ind w:left="259" w:hanging="202"/>
       </w:pPr>
       <w:r>
@@ -556,7 +556,7 @@
           <w:i w:val="0"/>
           <w:caps w:val="0"/>
           <w:color w:val="1F3A5F"/>
-          <w:sz w:val="21"/>
+          <w:sz w:val="20"/>
         </w:rPr>
         <w:t xml:space="preserve">•  </w:t>
       </w:r>
@@ -567,15 +567,15 @@
           <w:i w:val="0"/>
           <w:caps w:val="0"/>
           <w:color w:val="222222"/>
-          <w:sz w:val="21"/>
+          <w:sz w:val="20"/>
         </w:rPr>
-        <w:t>Direct budgeting, forecasting, cash management, and multi-entity financial planning; advise leaders on financing, working capital, and growth priorities.</w:t>
+        <w:t>Led fundraising and partnership-agreement development; brought NYSID into the partnership network and liaised with Assembly partners to develop relationships and opportunities.</w:t>
       </w:r>
     </w:p>
     <w:p>
       <w:pPr>
         <w:keepNext w:val="0"/>
-        <w:spacing w:before="0" w:after="30" w:line="247" w:lineRule="auto"/>
+        <w:spacing w:before="0" w:after="20" w:line="240" w:lineRule="auto"/>
         <w:ind w:left="259" w:hanging="202"/>
       </w:pPr>
       <w:r>
@@ -585,7 +585,7 @@
           <w:i w:val="0"/>
           <w:caps w:val="0"/>
           <w:color w:val="1F3A5F"/>
-          <w:sz w:val="21"/>
+          <w:sz w:val="20"/>
         </w:rPr>
         <w:t xml:space="preserve">•  </w:t>
       </w:r>
@@ -596,18 +596,18 @@
           <w:i w:val="0"/>
           <w:caps w:val="0"/>
           <w:color w:val="222222"/>
-          <w:sz w:val="21"/>
+          <w:sz w:val="20"/>
         </w:rPr>
-        <w:t>Build financial models, KPI dashboards, and SOPs; lead financial cleanup and reporting remediation with clients and their accountants.</w:t>
+        <w:t>Direct budgeting, forecasting, cash management, and multi-entity financial planning; build financial models, KPI dashboards, and SOPs to support leadership decisions and operating accountability.</w:t>
       </w:r>
     </w:p>
     <w:p>
       <w:pPr>
         <w:keepNext/>
         <w:tabs>
-          <w:tab w:pos="10368" w:val="right"/>
+          <w:tab w:pos="10512" w:val="right"/>
         </w:tabs>
-        <w:spacing w:before="120" w:after="0" w:line="240" w:lineRule="auto"/>
+        <w:spacing w:before="100" w:after="0" w:line="240" w:lineRule="auto"/>
       </w:pPr>
       <w:r>
         <w:rPr>
@@ -616,7 +616,7 @@
           <w:i w:val="0"/>
           <w:caps w:val="0"/>
           <w:color w:val="1F3A5F"/>
-          <w:sz w:val="21"/>
+          <w:sz w:val="20"/>
         </w:rPr>
         <w:t>OSBORNE ASSOCIATION</w:t>
       </w:r>
@@ -627,7 +627,7 @@
           <w:i w:val="0"/>
           <w:caps w:val="0"/>
           <w:color w:val="555555"/>
-          <w:sz w:val="21"/>
+          <w:sz w:val="20"/>
         </w:rPr>
         <w:t xml:space="preserve">  |  New York, NY</w:t>
       </w:r>
@@ -638,7 +638,7 @@
           <w:i w:val="0"/>
           <w:caps w:val="0"/>
           <w:color w:val="222222"/>
-          <w:sz w:val="21"/>
+          <w:sz w:val="20"/>
         </w:rPr>
         <w:tab/>
         <w:t>Jan 2023 – Oct 2025</w:t>
@@ -656,7 +656,7 @@
           <w:i/>
           <w:caps w:val="0"/>
           <w:color w:val="222222"/>
-          <w:sz w:val="21"/>
+          <w:sz w:val="20"/>
         </w:rPr>
         <w:t>Vice President, Business Development &amp; Social Ventures</w:t>
       </w:r>
@@ -675,13 +675,13 @@
           <w:color w:val="555555"/>
           <w:sz w:val="20"/>
         </w:rPr>
-        <w:t>Led a 140-person division of a human-services organization supporting people affected by the criminal legal system.</w:t>
+        <w:t>Led a 140-person division through 12 direct reports spanning budget and finance, grant stewardship, operations, and frontline supervision. Combined financial accountability, people leadership, and business development to strengthen delivery and expand mission-driven programs.</w:t>
       </w:r>
     </w:p>
     <w:p>
       <w:pPr>
         <w:keepNext w:val="0"/>
-        <w:spacing w:before="0" w:after="30" w:line="247" w:lineRule="auto"/>
+        <w:spacing w:before="0" w:after="20" w:line="240" w:lineRule="auto"/>
         <w:ind w:left="259" w:hanging="202"/>
       </w:pPr>
       <w:r>
@@ -691,7 +691,7 @@
           <w:i w:val="0"/>
           <w:caps w:val="0"/>
           <w:color w:val="1F3A5F"/>
-          <w:sz w:val="21"/>
+          <w:sz w:val="20"/>
         </w:rPr>
         <w:t xml:space="preserve">•  </w:t>
       </w:r>
@@ -702,15 +702,15 @@
           <w:i w:val="0"/>
           <w:caps w:val="0"/>
           <w:color w:val="222222"/>
-          <w:sz w:val="21"/>
+          <w:sz w:val="20"/>
         </w:rPr>
-        <w:t>Held full P&amp;L accountability for an $80M portfolio, aligning budgets, staffing, partnerships, and program priorities.</w:t>
+        <w:t>Managed 12 direct reports, directing hiring, onboarding, training, performance management, and day-to-day execution across financial, operational, and program responsibilities.</w:t>
       </w:r>
     </w:p>
     <w:p>
       <w:pPr>
         <w:keepNext w:val="0"/>
-        <w:spacing w:before="0" w:after="30" w:line="247" w:lineRule="auto"/>
+        <w:spacing w:before="0" w:after="20" w:line="240" w:lineRule="auto"/>
         <w:ind w:left="259" w:hanging="202"/>
       </w:pPr>
       <w:r>
@@ -720,7 +720,7 @@
           <w:i w:val="0"/>
           <w:caps w:val="0"/>
           <w:color w:val="1F3A5F"/>
-          <w:sz w:val="21"/>
+          <w:sz w:val="20"/>
         </w:rPr>
         <w:t xml:space="preserve">•  </w:t>
       </w:r>
@@ -731,15 +731,15 @@
           <w:i w:val="0"/>
           <w:caps w:val="0"/>
           <w:color w:val="222222"/>
-          <w:sz w:val="21"/>
+          <w:sz w:val="20"/>
         </w:rPr>
-        <w:t>Partnered with the CEO and Board on long-range planning, risk management, resource allocation, and growth.</w:t>
+        <w:t>Established a management cadence of weekly team meetings, individual check-ins, and recurring operational and financial reviews, using budgets and performance reports to identify issues, align priorities, and guide decisions.</w:t>
       </w:r>
     </w:p>
     <w:p>
       <w:pPr>
         <w:keepNext w:val="0"/>
-        <w:spacing w:before="0" w:after="30" w:line="247" w:lineRule="auto"/>
+        <w:spacing w:before="0" w:after="20" w:line="240" w:lineRule="auto"/>
         <w:ind w:left="259" w:hanging="202"/>
       </w:pPr>
       <w:r>
@@ -749,7 +749,7 @@
           <w:i w:val="0"/>
           <w:caps w:val="0"/>
           <w:color w:val="1F3A5F"/>
-          <w:sz w:val="21"/>
+          <w:sz w:val="20"/>
         </w:rPr>
         <w:t xml:space="preserve">•  </w:t>
       </w:r>
@@ -760,15 +760,15 @@
           <w:i w:val="0"/>
           <w:caps w:val="0"/>
           <w:color w:val="222222"/>
-          <w:sz w:val="21"/>
+          <w:sz w:val="20"/>
         </w:rPr>
-        <w:t>Led a nine-month transitional-employment program serving 300+ formerly incarcerated people annually, coordinating employer partnerships and tracking outcomes against funder benchmarks.</w:t>
+        <w:t>Held full P&amp;L accountability for an $80M portfolio, aligning staffing, budgets, grant obligations, and program delivery with organizational priorities.</w:t>
       </w:r>
     </w:p>
     <w:p>
       <w:pPr>
         <w:keepNext w:val="0"/>
-        <w:spacing w:before="0" w:after="30" w:line="247" w:lineRule="auto"/>
+        <w:spacing w:before="0" w:after="20" w:line="240" w:lineRule="auto"/>
         <w:ind w:left="259" w:hanging="202"/>
       </w:pPr>
       <w:r>
@@ -778,7 +778,7 @@
           <w:i w:val="0"/>
           <w:caps w:val="0"/>
           <w:color w:val="1F3A5F"/>
-          <w:sz w:val="21"/>
+          <w:sz w:val="20"/>
         </w:rPr>
         <w:t xml:space="preserve">•  </w:t>
       </w:r>
@@ -789,15 +789,15 @@
           <w:i w:val="0"/>
           <w:caps w:val="0"/>
           <w:color w:val="222222"/>
-          <w:sz w:val="21"/>
+          <w:sz w:val="20"/>
         </w:rPr>
-        <w:t>Negotiated government, corporate, and philanthropic partnerships and launched earned-income social ventures.</w:t>
+        <w:t>Built growth opportunities across multiple industries through new partnerships, direct funding opportunities, and business development, incorporating expansion planning into ongoing operations.</w:t>
       </w:r>
     </w:p>
     <w:p>
       <w:pPr>
         <w:keepNext w:val="0"/>
-        <w:spacing w:before="0" w:after="30" w:line="247" w:lineRule="auto"/>
+        <w:spacing w:before="0" w:after="20" w:line="240" w:lineRule="auto"/>
         <w:ind w:left="259" w:hanging="202"/>
       </w:pPr>
       <w:r>
@@ -807,7 +807,7 @@
           <w:i w:val="0"/>
           <w:caps w:val="0"/>
           <w:color w:val="1F3A5F"/>
-          <w:sz w:val="21"/>
+          <w:sz w:val="20"/>
         </w:rPr>
         <w:t xml:space="preserve">•  </w:t>
       </w:r>
@@ -818,15 +818,15 @@
           <w:i w:val="0"/>
           <w:caps w:val="0"/>
           <w:color w:val="222222"/>
-          <w:sz w:val="21"/>
+          <w:sz w:val="20"/>
         </w:rPr>
-        <w:t>Authored a growth and feasibility white paper on a potential Rikers Island service contract, integrating financial modeling, workforce needs, mission alignment, employee well-being, and operational risk.</w:t>
+        <w:t>Led a nine-month transitional-employment program serving 300+ formerly incarcerated people annually, coordinating employer partnerships and tracking outcomes against funder benchmarks.</w:t>
       </w:r>
     </w:p>
     <w:p>
       <w:pPr>
         <w:keepNext w:val="0"/>
-        <w:spacing w:before="0" w:after="30" w:line="247" w:lineRule="auto"/>
+        <w:spacing w:before="0" w:after="20" w:line="240" w:lineRule="auto"/>
         <w:ind w:left="259" w:hanging="202"/>
       </w:pPr>
       <w:r>
@@ -836,7 +836,7 @@
           <w:i w:val="0"/>
           <w:caps w:val="0"/>
           <w:color w:val="1F3A5F"/>
-          <w:sz w:val="21"/>
+          <w:sz w:val="20"/>
         </w:rPr>
         <w:t xml:space="preserve">•  </w:t>
       </w:r>
@@ -847,15 +847,15 @@
           <w:i w:val="0"/>
           <w:caps w:val="0"/>
           <w:color w:val="222222"/>
-          <w:sz w:val="21"/>
+          <w:sz w:val="20"/>
         </w:rPr>
-        <w:t>Developed a roadmap to potentially double JMS within 12 months, sizing investments in management capacity, recruitment, training, contract oversight, payroll, compliance, and technology.</w:t>
+        <w:t>Partnered with the CEO and Board on planning, risk management, resource allocation, and growth; negotiated government, corporate, and philanthropic partnerships.</w:t>
       </w:r>
     </w:p>
     <w:p>
       <w:pPr>
         <w:keepNext w:val="0"/>
-        <w:spacing w:before="0" w:after="30" w:line="247" w:lineRule="auto"/>
+        <w:spacing w:before="0" w:after="20" w:line="240" w:lineRule="auto"/>
         <w:ind w:left="259" w:hanging="202"/>
       </w:pPr>
       <w:r>
@@ -865,7 +865,7 @@
           <w:i w:val="0"/>
           <w:caps w:val="0"/>
           <w:color w:val="1F3A5F"/>
-          <w:sz w:val="21"/>
+          <w:sz w:val="20"/>
         </w:rPr>
         <w:t xml:space="preserve">•  </w:t>
       </w:r>
@@ -876,18 +876,18 @@
           <w:i w:val="0"/>
           <w:caps w:val="0"/>
           <w:color w:val="222222"/>
-          <w:sz w:val="21"/>
+          <w:sz w:val="20"/>
         </w:rPr>
-        <w:t>Oversaw departmental talent acquisition, onboarding, staff development, and performance management.</w:t>
+        <w:t>Authored a Rikers Island contract feasibility white paper and a roadmap for potentially doubling JMS within 12 months, identifying required investments in management, staffing, training, compliance, payroll, and technology.</w:t>
       </w:r>
     </w:p>
     <w:p>
       <w:pPr>
         <w:keepNext/>
         <w:tabs>
-          <w:tab w:pos="10368" w:val="right"/>
+          <w:tab w:pos="10512" w:val="right"/>
         </w:tabs>
-        <w:spacing w:before="120" w:after="0" w:line="240" w:lineRule="auto"/>
+        <w:spacing w:before="100" w:after="0" w:line="240" w:lineRule="auto"/>
       </w:pPr>
       <w:r>
         <w:rPr>
@@ -896,7 +896,7 @@
           <w:i w:val="0"/>
           <w:caps w:val="0"/>
           <w:color w:val="1F3A5F"/>
-          <w:sz w:val="21"/>
+          <w:sz w:val="20"/>
         </w:rPr>
         <w:t>ALLUEL LOGISTICS</w:t>
       </w:r>
@@ -907,7 +907,7 @@
           <w:i w:val="0"/>
           <w:caps w:val="0"/>
           <w:color w:val="555555"/>
-          <w:sz w:val="21"/>
+          <w:sz w:val="20"/>
         </w:rPr>
         <w:t xml:space="preserve">  |  New York, NY</w:t>
       </w:r>
@@ -918,7 +918,7 @@
           <w:i w:val="0"/>
           <w:caps w:val="0"/>
           <w:color w:val="222222"/>
-          <w:sz w:val="21"/>
+          <w:sz w:val="20"/>
         </w:rPr>
         <w:tab/>
         <w:t>Nov 2021 – Aug 2022</w:t>
@@ -936,7 +936,7 @@
           <w:i/>
           <w:caps w:val="0"/>
           <w:color w:val="222222"/>
-          <w:sz w:val="21"/>
+          <w:sz w:val="20"/>
         </w:rPr>
         <w:t>Vice President of Operations</w:t>
       </w:r>
@@ -944,7 +944,7 @@
     <w:p>
       <w:pPr>
         <w:keepNext w:val="0"/>
-        <w:spacing w:before="0" w:after="30" w:line="247" w:lineRule="auto"/>
+        <w:spacing w:before="0" w:after="20" w:line="240" w:lineRule="auto"/>
         <w:ind w:left="259" w:hanging="202"/>
       </w:pPr>
       <w:r>
@@ -954,7 +954,7 @@
           <w:i w:val="0"/>
           <w:caps w:val="0"/>
           <w:color w:val="1F3A5F"/>
-          <w:sz w:val="21"/>
+          <w:sz w:val="20"/>
         </w:rPr>
         <w:t xml:space="preserve">•  </w:t>
       </w:r>
@@ -965,7 +965,7 @@
           <w:i w:val="0"/>
           <w:caps w:val="0"/>
           <w:color w:val="222222"/>
-          <w:sz w:val="21"/>
+          <w:sz w:val="20"/>
         </w:rPr>
         <w:t>Managed a $2M operating budget; renegotiated vendor agreements to cut supply-chain and logistics costs 35%.</w:t>
       </w:r>
@@ -973,7 +973,7 @@
     <w:p>
       <w:pPr>
         <w:keepNext w:val="0"/>
-        <w:spacing w:before="0" w:after="30" w:line="247" w:lineRule="auto"/>
+        <w:spacing w:before="0" w:after="20" w:line="240" w:lineRule="auto"/>
         <w:ind w:left="259" w:hanging="202"/>
       </w:pPr>
       <w:r>
@@ -983,7 +983,7 @@
           <w:i w:val="0"/>
           <w:caps w:val="0"/>
           <w:color w:val="1F3A5F"/>
-          <w:sz w:val="21"/>
+          <w:sz w:val="20"/>
         </w:rPr>
         <w:t xml:space="preserve">•  </w:t>
       </w:r>
@@ -994,7 +994,7 @@
           <w:i w:val="0"/>
           <w:caps w:val="0"/>
           <w:color w:val="222222"/>
-          <w:sz w:val="21"/>
+          <w:sz w:val="20"/>
         </w:rPr>
         <w:t>Implemented warehouse-management technology that reduced data-processing time 60%; introduced CRM systems and trained staff.</w:t>
       </w:r>
@@ -1002,7 +1002,7 @@
     <w:p>
       <w:pPr>
         <w:keepNext w:val="0"/>
-        <w:spacing w:before="0" w:after="30" w:line="247" w:lineRule="auto"/>
+        <w:spacing w:before="0" w:after="20" w:line="240" w:lineRule="auto"/>
         <w:ind w:left="259" w:hanging="202"/>
       </w:pPr>
       <w:r>
@@ -1012,7 +1012,7 @@
           <w:i w:val="0"/>
           <w:caps w:val="0"/>
           <w:color w:val="1F3A5F"/>
-          <w:sz w:val="21"/>
+          <w:sz w:val="20"/>
         </w:rPr>
         <w:t xml:space="preserve">•  </w:t>
       </w:r>
@@ -1023,7 +1023,7 @@
           <w:i w:val="0"/>
           <w:caps w:val="0"/>
           <w:color w:val="222222"/>
-          <w:sz w:val="21"/>
+          <w:sz w:val="20"/>
         </w:rPr>
         <w:t>Oversaw NYCHA logistics contracts serving 100 developments and supervised ~$500K in monthly NYC DHS billing.</w:t>
       </w:r>
@@ -1031,7 +1031,7 @@
     <w:p>
       <w:pPr>
         <w:keepNext w:val="0"/>
-        <w:spacing w:before="0" w:after="30" w:line="247" w:lineRule="auto"/>
+        <w:spacing w:before="0" w:after="20" w:line="240" w:lineRule="auto"/>
         <w:ind w:left="259" w:hanging="202"/>
       </w:pPr>
       <w:r>
@@ -1041,7 +1041,7 @@
           <w:i w:val="0"/>
           <w:caps w:val="0"/>
           <w:color w:val="1F3A5F"/>
-          <w:sz w:val="21"/>
+          <w:sz w:val="20"/>
         </w:rPr>
         <w:t xml:space="preserve">•  </w:t>
       </w:r>
@@ -1052,7 +1052,7 @@
           <w:i w:val="0"/>
           <w:caps w:val="0"/>
           <w:color w:val="222222"/>
-          <w:sz w:val="21"/>
+          <w:sz w:val="20"/>
         </w:rPr>
         <w:t>Recruited and managed field, sales, and administrative staff; improved HR workflows and data accuracy.</w:t>
       </w:r>
@@ -1061,9 +1061,9 @@
       <w:pPr>
         <w:keepNext/>
         <w:tabs>
-          <w:tab w:pos="10368" w:val="right"/>
+          <w:tab w:pos="10512" w:val="right"/>
         </w:tabs>
-        <w:spacing w:before="120" w:after="0" w:line="240" w:lineRule="auto"/>
+        <w:spacing w:before="100" w:after="0" w:line="240" w:lineRule="auto"/>
       </w:pPr>
       <w:r>
         <w:rPr>
@@ -1072,7 +1072,7 @@
           <w:i w:val="0"/>
           <w:caps w:val="0"/>
           <w:color w:val="1F3A5F"/>
-          <w:sz w:val="21"/>
+          <w:sz w:val="20"/>
         </w:rPr>
         <w:t>LAZARRE CONSULTING GROUP</w:t>
       </w:r>
@@ -1083,7 +1083,7 @@
           <w:i w:val="0"/>
           <w:caps w:val="0"/>
           <w:color w:val="555555"/>
-          <w:sz w:val="21"/>
+          <w:sz w:val="20"/>
         </w:rPr>
         <w:t xml:space="preserve">  |  New York, NY</w:t>
       </w:r>
@@ -1094,7 +1094,7 @@
           <w:i w:val="0"/>
           <w:caps w:val="0"/>
           <w:color w:val="222222"/>
-          <w:sz w:val="21"/>
+          <w:sz w:val="20"/>
         </w:rPr>
         <w:tab/>
         <w:t>Dec 2016 – Present</w:t>
@@ -1112,15 +1112,32 @@
           <w:i/>
           <w:caps w:val="0"/>
           <w:color w:val="222222"/>
-          <w:sz w:val="21"/>
+          <w:sz w:val="20"/>
         </w:rPr>
         <w:t>Chief Executive Officer</w:t>
       </w:r>
     </w:p>
     <w:p>
       <w:pPr>
+        <w:keepNext/>
+        <w:spacing w:before="0" w:after="30" w:line="240" w:lineRule="auto"/>
+      </w:pPr>
+      <w:r>
+        <w:rPr>
+          <w:rFonts w:ascii="Calibri" w:hAnsi="Calibri" w:eastAsia="Calibri"/>
+          <w:b w:val="0"/>
+          <w:i/>
+          <w:caps w:val="0"/>
+          <w:color w:val="555555"/>
+          <w:sz w:val="20"/>
+        </w:rPr>
+        <w:t>Ongoing private-client advisory practice alongside project-based fractional CFO engagements, providing business consulting, financial analysis, and personal financial and wealth-management support.</w:t>
+      </w:r>
+    </w:p>
+    <w:p>
+      <w:pPr>
         <w:keepNext w:val="0"/>
-        <w:spacing w:before="0" w:after="30" w:line="247" w:lineRule="auto"/>
+        <w:spacing w:before="0" w:after="20" w:line="240" w:lineRule="auto"/>
         <w:ind w:left="259" w:hanging="202"/>
       </w:pPr>
       <w:r>
@@ -1130,7 +1147,7 @@
           <w:i w:val="0"/>
           <w:caps w:val="0"/>
           <w:color w:val="1F3A5F"/>
-          <w:sz w:val="21"/>
+          <w:sz w:val="20"/>
         </w:rPr>
         <w:t xml:space="preserve">•  </w:t>
       </w:r>
@@ -1141,7 +1158,7 @@
           <w:i w:val="0"/>
           <w:caps w:val="0"/>
           <w:color w:val="222222"/>
-          <w:sz w:val="21"/>
+          <w:sz w:val="20"/>
         </w:rPr>
         <w:t>Served as financial architect for a $200M national banking development initiative, supporting capital planning and financial structuring.</w:t>
       </w:r>
@@ -1149,7 +1166,7 @@
     <w:p>
       <w:pPr>
         <w:keepNext w:val="0"/>
-        <w:spacing w:before="0" w:after="30" w:line="247" w:lineRule="auto"/>
+        <w:spacing w:before="0" w:after="20" w:line="240" w:lineRule="auto"/>
         <w:ind w:left="259" w:hanging="202"/>
       </w:pPr>
       <w:r>
@@ -1159,7 +1176,7 @@
           <w:i w:val="0"/>
           <w:caps w:val="0"/>
           <w:color w:val="1F3A5F"/>
-          <w:sz w:val="21"/>
+          <w:sz w:val="20"/>
         </w:rPr>
         <w:t xml:space="preserve">•  </w:t>
       </w:r>
@@ -1170,15 +1187,15 @@
           <w:i w:val="0"/>
           <w:caps w:val="0"/>
           <w:color w:val="222222"/>
-          <w:sz w:val="21"/>
+          <w:sz w:val="20"/>
         </w:rPr>
-        <w:t>Developed operating and performance-improvement strategies for organizations and brands including American Express OPEN, Ogilvy, and Chubb.</w:t>
+        <w:t>Developed operational and performance-improvement strategies for organizations and brands including American Express OPEN, Ogilvy, and Chubb.</w:t>
       </w:r>
     </w:p>
     <w:p>
       <w:pPr>
         <w:keepNext w:val="0"/>
-        <w:spacing w:before="0" w:after="30" w:line="247" w:lineRule="auto"/>
+        <w:spacing w:before="0" w:after="20" w:line="240" w:lineRule="auto"/>
         <w:ind w:left="259" w:hanging="202"/>
       </w:pPr>
       <w:r>
@@ -1188,7 +1205,7 @@
           <w:i w:val="0"/>
           <w:caps w:val="0"/>
           <w:color w:val="1F3A5F"/>
-          <w:sz w:val="21"/>
+          <w:sz w:val="20"/>
         </w:rPr>
         <w:t xml:space="preserve">•  </w:t>
       </w:r>
@@ -1199,7 +1216,7 @@
           <w:i w:val="0"/>
           <w:caps w:val="0"/>
           <w:color w:val="222222"/>
-          <w:sz w:val="21"/>
+          <w:sz w:val="20"/>
         </w:rPr>
         <w:t>Led financial remediation for a psychological services practice, identifying ~$251K in unclaimed deductions and preparing corrected financial statements.</w:t>
       </w:r>
@@ -1208,9 +1225,9 @@
       <w:pPr>
         <w:keepNext/>
         <w:tabs>
-          <w:tab w:pos="10368" w:val="right"/>
+          <w:tab w:pos="10512" w:val="right"/>
         </w:tabs>
-        <w:spacing w:before="120" w:after="0" w:line="240" w:lineRule="auto"/>
+        <w:spacing w:before="100" w:after="0" w:line="240" w:lineRule="auto"/>
       </w:pPr>
       <w:r>
         <w:rPr>
@@ -1219,7 +1236,7 @@
           <w:i w:val="0"/>
           <w:caps w:val="0"/>
           <w:color w:val="1F3A5F"/>
-          <w:sz w:val="21"/>
+          <w:sz w:val="20"/>
         </w:rPr>
         <w:t>FITNESS COLLECTIVE INC.</w:t>
       </w:r>
@@ -1230,7 +1247,7 @@
           <w:i w:val="0"/>
           <w:caps w:val="0"/>
           <w:color w:val="555555"/>
-          <w:sz w:val="21"/>
+          <w:sz w:val="20"/>
         </w:rPr>
         <w:t xml:space="preserve">  |  Brooklyn, NY</w:t>
       </w:r>
@@ -1241,7 +1258,7 @@
           <w:i w:val="0"/>
           <w:caps w:val="0"/>
           <w:color w:val="222222"/>
-          <w:sz w:val="21"/>
+          <w:sz w:val="20"/>
         </w:rPr>
         <w:tab/>
         <w:t>2004 – 2016</w:t>
@@ -1259,15 +1276,32 @@
           <w:i/>
           <w:caps w:val="0"/>
           <w:color w:val="222222"/>
-          <w:sz w:val="21"/>
+          <w:sz w:val="20"/>
         </w:rPr>
         <w:t>CEO &amp; Co-Founder</w:t>
       </w:r>
     </w:p>
     <w:p>
       <w:pPr>
+        <w:keepNext/>
+        <w:spacing w:before="0" w:after="30" w:line="240" w:lineRule="auto"/>
+      </w:pPr>
+      <w:r>
+        <w:rPr>
+          <w:rFonts w:ascii="Calibri" w:hAnsi="Calibri" w:eastAsia="Calibri"/>
+          <w:b w:val="0"/>
+          <w:i/>
+          <w:caps w:val="0"/>
+          <w:color w:val="555555"/>
+          <w:sz w:val="20"/>
+        </w:rPr>
+        <w:t>Built and expanded a health and wellness business by combining direct customer acquisition, neighborhood partnerships, and the people and technology systems needed to support multiple locations.</w:t>
+      </w:r>
+    </w:p>
+    <w:p>
+      <w:pPr>
         <w:keepNext w:val="0"/>
-        <w:spacing w:before="0" w:after="30" w:line="247" w:lineRule="auto"/>
+        <w:spacing w:before="0" w:after="20" w:line="240" w:lineRule="auto"/>
         <w:ind w:left="259" w:hanging="202"/>
       </w:pPr>
       <w:r>
@@ -1277,7 +1311,7 @@
           <w:i w:val="0"/>
           <w:caps w:val="0"/>
           <w:color w:val="1F3A5F"/>
-          <w:sz w:val="21"/>
+          <w:sz w:val="20"/>
         </w:rPr>
         <w:t xml:space="preserve">•  </w:t>
       </w:r>
@@ -1288,15 +1322,15 @@
           <w:i w:val="0"/>
           <w:caps w:val="0"/>
           <w:color w:val="222222"/>
-          <w:sz w:val="21"/>
+          <w:sz w:val="20"/>
         </w:rPr>
-        <w:t>Scaled from a $5,000 investment to $1M in annual revenue within 24 months, then franchised and launched three additional locations, growing to $10M in annual sales.</w:t>
+        <w:t>Scaled from a $5,000 investment to $1M in annual revenue within 24 months, then implemented a franchise model and launched three additional locations, growing to $10M in annual sales.</w:t>
       </w:r>
     </w:p>
     <w:p>
       <w:pPr>
         <w:keepNext w:val="0"/>
-        <w:spacing w:before="0" w:after="30" w:line="247" w:lineRule="auto"/>
+        <w:spacing w:before="0" w:after="20" w:line="240" w:lineRule="auto"/>
         <w:ind w:left="259" w:hanging="202"/>
       </w:pPr>
       <w:r>
@@ -1306,7 +1340,7 @@
           <w:i w:val="0"/>
           <w:caps w:val="0"/>
           <w:color w:val="1F3A5F"/>
-          <w:sz w:val="21"/>
+          <w:sz w:val="20"/>
         </w:rPr>
         <w:t xml:space="preserve">•  </w:t>
       </w:r>
@@ -1317,15 +1351,15 @@
           <w:i w:val="0"/>
           <w:caps w:val="0"/>
           <w:color w:val="222222"/>
-          <w:sz w:val="21"/>
+          <w:sz w:val="20"/>
         </w:rPr>
-        <w:t>Built HR, payroll, and benefits infrastructure for 50+ employees, overseeing recruitment, training, performance management, and ~$65K in monthly payroll.</w:t>
+        <w:t>Scaled the workforce from 4 to 60 full-time employees across accounting, IT, facilities, personal training, group fitness, and other functions, building the staffing structure needed to support business expansion.</w:t>
       </w:r>
     </w:p>
     <w:p>
       <w:pPr>
         <w:keepNext w:val="0"/>
-        <w:spacing w:before="0" w:after="30" w:line="247" w:lineRule="auto"/>
+        <w:spacing w:before="0" w:after="20" w:line="240" w:lineRule="auto"/>
         <w:ind w:left="259" w:hanging="202"/>
       </w:pPr>
       <w:r>
@@ -1335,7 +1369,7 @@
           <w:i w:val="0"/>
           <w:caps w:val="0"/>
           <w:color w:val="1F3A5F"/>
-          <w:sz w:val="21"/>
+          <w:sz w:val="20"/>
         </w:rPr>
         <w:t xml:space="preserve">•  </w:t>
       </w:r>
@@ -1346,15 +1380,15 @@
           <w:i w:val="0"/>
           <w:caps w:val="0"/>
           <w:color w:val="222222"/>
-          <w:sz w:val="21"/>
+          <w:sz w:val="20"/>
         </w:rPr>
-        <w:t>Implemented Mindbody CRM for client tracking, booking, and targeted engagement across 4,000+ clients; founded a training academy that certified 25 trainers.</w:t>
+        <w:t>Created roles and helped recruit, supervise, and train employees across these functions, with hands-on involvement in building both service delivery and business-support teams.</w:t>
       </w:r>
     </w:p>
     <w:p>
       <w:pPr>
         <w:keepNext w:val="0"/>
-        <w:spacing w:before="0" w:after="30" w:line="247" w:lineRule="auto"/>
+        <w:spacing w:before="0" w:after="20" w:line="240" w:lineRule="auto"/>
         <w:ind w:left="259" w:hanging="202"/>
       </w:pPr>
       <w:r>
@@ -1364,7 +1398,7 @@
           <w:i w:val="0"/>
           <w:caps w:val="0"/>
           <w:color w:val="1F3A5F"/>
-          <w:sz w:val="21"/>
+          <w:sz w:val="20"/>
         </w:rPr>
         <w:t xml:space="preserve">•  </w:t>
       </w:r>
@@ -1375,15 +1409,102 @@
           <w:i w:val="0"/>
           <w:caps w:val="0"/>
           <w:color w:val="222222"/>
-          <w:sz w:val="21"/>
+          <w:sz w:val="20"/>
         </w:rPr>
-        <w:t>Developed local partnerships, cross-marketing, and community events; negotiated vendor and utility agreements.</w:t>
+        <w:t>Built HR, payroll, and benefits infrastructure to support the expanding workforce and operations across multiple locations.</w:t>
+      </w:r>
+    </w:p>
+    <w:p>
+      <w:pPr>
+        <w:keepNext w:val="0"/>
+        <w:spacing w:before="0" w:after="20" w:line="240" w:lineRule="auto"/>
+        <w:ind w:left="259" w:hanging="202"/>
+      </w:pPr>
+      <w:r>
+        <w:rPr>
+          <w:rFonts w:ascii="Calibri" w:hAnsi="Calibri" w:eastAsia="Calibri"/>
+          <w:b w:val="0"/>
+          <w:i w:val="0"/>
+          <w:caps w:val="0"/>
+          <w:color w:val="1F3A5F"/>
+          <w:sz w:val="20"/>
+        </w:rPr>
+        <w:t xml:space="preserve">•  </w:t>
+      </w:r>
+      <w:r>
+        <w:rPr>
+          <w:rFonts w:ascii="Calibri" w:hAnsi="Calibri" w:eastAsia="Calibri"/>
+          <w:b w:val="0"/>
+          <w:i w:val="0"/>
+          <w:caps w:val="0"/>
+          <w:color w:val="222222"/>
+          <w:sz w:val="20"/>
+        </w:rPr>
+        <w:t>Led direct outreach, grassroots marketing, website development, and partnerships with local businesses to attract clients and establish a presence in each operating neighborhood.</w:t>
+      </w:r>
+    </w:p>
+    <w:p>
+      <w:pPr>
+        <w:keepNext w:val="0"/>
+        <w:spacing w:before="0" w:after="20" w:line="240" w:lineRule="auto"/>
+        <w:ind w:left="259" w:hanging="202"/>
+      </w:pPr>
+      <w:r>
+        <w:rPr>
+          <w:rFonts w:ascii="Calibri" w:hAnsi="Calibri" w:eastAsia="Calibri"/>
+          <w:b w:val="0"/>
+          <w:i w:val="0"/>
+          <w:caps w:val="0"/>
+          <w:color w:val="1F3A5F"/>
+          <w:sz w:val="20"/>
+        </w:rPr>
+        <w:t xml:space="preserve">•  </w:t>
+      </w:r>
+      <w:r>
+        <w:rPr>
+          <w:rFonts w:ascii="Calibri" w:hAnsi="Calibri" w:eastAsia="Calibri"/>
+          <w:b w:val="0"/>
+          <w:i w:val="0"/>
+          <w:caps w:val="0"/>
+          <w:color w:val="222222"/>
+          <w:sz w:val="20"/>
+        </w:rPr>
+        <w:t>Implemented Mindbody CRM for client tracking, booking, and targeted engagement across 4,000+ clients.</w:t>
+      </w:r>
+    </w:p>
+    <w:p>
+      <w:pPr>
+        <w:keepNext w:val="0"/>
+        <w:spacing w:before="0" w:after="20" w:line="240" w:lineRule="auto"/>
+        <w:ind w:left="259" w:hanging="202"/>
+      </w:pPr>
+      <w:r>
+        <w:rPr>
+          <w:rFonts w:ascii="Calibri" w:hAnsi="Calibri" w:eastAsia="Calibri"/>
+          <w:b w:val="0"/>
+          <w:i w:val="0"/>
+          <w:caps w:val="0"/>
+          <w:color w:val="1F3A5F"/>
+          <w:sz w:val="20"/>
+        </w:rPr>
+        <w:t xml:space="preserve">•  </w:t>
+      </w:r>
+      <w:r>
+        <w:rPr>
+          <w:rFonts w:ascii="Calibri" w:hAnsi="Calibri" w:eastAsia="Calibri"/>
+          <w:b w:val="0"/>
+          <w:i w:val="0"/>
+          <w:caps w:val="0"/>
+          <w:color w:val="222222"/>
+          <w:sz w:val="20"/>
+        </w:rPr>
+        <w:t>Established a training academy supporting certification of 25 trainers, expanding workforce capacity and service offerings.</w:t>
       </w:r>
     </w:p>
     <w:p>
       <w:pPr>
         <w:keepNext/>
-        <w:spacing w:before="160" w:after="60" w:line="240" w:lineRule="auto"/>
+        <w:spacing w:before="140" w:after="40" w:line="240" w:lineRule="auto"/>
         <w:pBdr>
           <w:bottom w:val="single" w:sz="8" w:space="1" w:color="1F3A5F"/>
         </w:pBdr>
@@ -1403,7 +1524,7 @@
     <w:p>
       <w:pPr>
         <w:keepNext w:val="0"/>
-        <w:spacing w:before="0" w:after="30" w:line="247" w:lineRule="auto"/>
+        <w:spacing w:before="0" w:after="20" w:line="240" w:lineRule="auto"/>
         <w:ind w:left="259" w:hanging="202"/>
       </w:pPr>
       <w:r>
@@ -1413,7 +1534,7 @@
           <w:i w:val="0"/>
           <w:caps w:val="0"/>
           <w:color w:val="1F3A5F"/>
-          <w:sz w:val="21"/>
+          <w:sz w:val="20"/>
         </w:rPr>
         <w:t xml:space="preserve">•  </w:t>
       </w:r>
@@ -1424,7 +1545,7 @@
           <w:i w:val="0"/>
           <w:caps w:val="0"/>
           <w:color w:val="222222"/>
-          <w:sz w:val="21"/>
+          <w:sz w:val="20"/>
         </w:rPr>
         <w:t xml:space="preserve">SkyNet: </w:t>
       </w:r>
@@ -1435,7 +1556,7 @@
           <w:i w:val="0"/>
           <w:caps w:val="0"/>
           <w:color w:val="222222"/>
-          <w:sz w:val="21"/>
+          <w:sz w:val="20"/>
         </w:rPr>
         <w:t>Built an AI-supported workflow connecting opportunity research, evaluation, document preparation, and reporting, with evidence validation, cost controls, and performance tracking.</w:t>
       </w:r>
@@ -1443,7 +1564,7 @@
     <w:p>
       <w:pPr>
         <w:keepNext w:val="0"/>
-        <w:spacing w:before="0" w:after="30" w:line="247" w:lineRule="auto"/>
+        <w:spacing w:before="0" w:after="20" w:line="240" w:lineRule="auto"/>
         <w:ind w:left="259" w:hanging="202"/>
       </w:pPr>
       <w:r>
@@ -1453,7 +1574,7 @@
           <w:i w:val="0"/>
           <w:caps w:val="0"/>
           <w:color w:val="1F3A5F"/>
-          <w:sz w:val="21"/>
+          <w:sz w:val="20"/>
         </w:rPr>
         <w:t xml:space="preserve">•  </w:t>
       </w:r>
@@ -1464,7 +1585,7 @@
           <w:i w:val="0"/>
           <w:caps w:val="0"/>
           <w:color w:val="222222"/>
-          <w:sz w:val="21"/>
+          <w:sz w:val="20"/>
         </w:rPr>
         <w:t xml:space="preserve">JWA AI Career Launch: </w:t>
       </w:r>
@@ -1475,7 +1596,7 @@
           <w:i w:val="0"/>
           <w:caps w:val="0"/>
           <w:color w:val="222222"/>
-          <w:sz w:val="21"/>
+          <w:sz w:val="20"/>
         </w:rPr>
         <w:t>Designed and submitted a Citi Foundation proposal linking AI learning, workforce preparation, and employment support, with measures for skills, employment, wages, and retention.</w:t>
       </w:r>
@@ -1483,7 +1604,7 @@
     <w:p>
       <w:pPr>
         <w:keepNext/>
-        <w:spacing w:before="160" w:after="60" w:line="240" w:lineRule="auto"/>
+        <w:spacing w:before="140" w:after="40" w:line="240" w:lineRule="auto"/>
         <w:pBdr>
           <w:bottom w:val="single" w:sz="8" w:space="1" w:color="1F3A5F"/>
         </w:pBdr>
@@ -1504,7 +1625,7 @@
       <w:pPr>
         <w:keepNext w:val="0"/>
         <w:tabs>
-          <w:tab w:pos="10368" w:val="right"/>
+          <w:tab w:pos="10512" w:val="right"/>
         </w:tabs>
         <w:spacing w:before="0" w:after="20" w:line="240" w:lineRule="auto"/>
       </w:pPr>
@@ -1515,7 +1636,7 @@
           <w:i w:val="0"/>
           <w:caps w:val="0"/>
           <w:color w:val="222222"/>
-          <w:sz w:val="21"/>
+          <w:sz w:val="20"/>
         </w:rPr>
         <w:t>Master of Business Administration, General Business Management</w:t>
       </w:r>
@@ -1526,7 +1647,7 @@
           <w:i w:val="0"/>
           <w:caps w:val="0"/>
           <w:color w:val="222222"/>
-          <w:sz w:val="21"/>
+          <w:sz w:val="20"/>
         </w:rPr>
         <w:t xml:space="preserve">  |  West Texas A&amp;M University</w:t>
       </w:r>
@@ -1537,7 +1658,7 @@
           <w:i w:val="0"/>
           <w:caps w:val="0"/>
           <w:color w:val="222222"/>
-          <w:sz w:val="21"/>
+          <w:sz w:val="20"/>
         </w:rPr>
         <w:tab/>
         <w:t>2023</w:t>
@@ -1547,7 +1668,7 @@
       <w:pPr>
         <w:keepNext w:val="0"/>
         <w:tabs>
-          <w:tab w:pos="10368" w:val="right"/>
+          <w:tab w:pos="10512" w:val="right"/>
         </w:tabs>
         <w:spacing w:before="0" w:after="20" w:line="240" w:lineRule="auto"/>
       </w:pPr>
@@ -1558,7 +1679,7 @@
           <w:i w:val="0"/>
           <w:caps w:val="0"/>
           <w:color w:val="222222"/>
-          <w:sz w:val="21"/>
+          <w:sz w:val="20"/>
         </w:rPr>
         <w:t>Bachelor of Science, Small Business Administration</w:t>
       </w:r>
@@ -1569,14 +1690,14 @@
           <w:i w:val="0"/>
           <w:caps w:val="0"/>
           <w:color w:val="222222"/>
-          <w:sz w:val="21"/>
+          <w:sz w:val="20"/>
         </w:rPr>
         <w:t xml:space="preserve">  |  Northern Arizona University</w:t>
       </w:r>
     </w:p>
     <w:sectPr>
       <w:pgSz w:w="12240" w:h="15840"/>
-      <w:pgMar w:top="792" w:right="936" w:bottom="792" w:left="936" w:header="720" w:footer="720" w:gutter="0"/>
+      <w:pgMar w:top="720" w:right="864" w:bottom="720" w:left="864" w:header="720" w:footer="720" w:gutter="0"/>
       <w:cols w:space="720"/>
       <w:docGrid w:linePitch="360"/>
     </w:sectPr>
@@ -1949,7 +2070,7 @@
     <w:rsid w:val="00FC693F"/>
     <w:rPr>
       <w:rFonts w:ascii="Calibri" w:hAnsi="Calibri"/>
-      <w:sz w:val="21"/>
+      <w:sz w:val="20"/>
     </w:rPr>
   </w:style>
   <w:style w:type="paragraph" w:styleId="Header">

</xml_diff>

<commit_message>
Final executive resume: scaling commitment line, 2 full pages
Co-Authored-By: Claude Opus 5.5 <noreply@anthropic.com>
Claude-Session: https://claude.ai/code/session_01Rb4ZTXZXZvRymPmEXq9dPj
</commit_message>
<xml_diff>
--- a/resumes/Clavel_Lazarre_Executive_Resume.docx
+++ b/resumes/Clavel_Lazarre_Executive_Resume.docx
@@ -91,7 +91,7 @@
           <w:i w:val="0"/>
           <w:caps w:val="0"/>
           <w:color w:val="222222"/>
-          <w:sz w:val="20"/>
+          <w:sz w:val="21"/>
         </w:rPr>
         <w:t>Operations and finance executive with 20+ years of experience building businesses, leading mission-driven programs, and creating the systems organizations need to grow. Held full P&amp;L accountability for an $80M portfolio and financial and operational oversight of a 140-person division. Co-founded a fitness business that reached $1M in annual revenue within 24 months, then expanded through a franchise model to $10M in annual sales while growing the team from 4 to 60 full-time employees.</w:t>
       </w:r>
@@ -108,9 +108,9 @@
           <w:i w:val="0"/>
           <w:caps w:val="0"/>
           <w:color w:val="222222"/>
-          <w:sz w:val="20"/>
+          <w:sz w:val="21"/>
         </w:rPr>
-        <w:t>Brings a founder’s understanding of growth and an operator’s discipline in execution. Partners with CEOs, boards, public agencies, and community organizations to evaluate opportunities, align resources, and translate strategy into budgets, partnerships, programs, and operating processes.</w:t>
+        <w:t>Brings a founder’s understanding of growth and an operator’s discipline in execution, partnering with CEOs, boards, public agencies, and community organizations to translate strategy into budgets, partnerships, programs, and operations. Committed to building the people, systems, and operating discipline that allow organizations to scale sustainably and deliver on their mission.</w:t>
       </w:r>
     </w:p>
     <w:p>
@@ -146,7 +146,7 @@
           <w:i w:val="0"/>
           <w:caps w:val="0"/>
           <w:color w:val="1F3A5F"/>
-          <w:sz w:val="20"/>
+          <w:sz w:val="21"/>
         </w:rPr>
         <w:t xml:space="preserve">•  </w:t>
       </w:r>
@@ -157,7 +157,7 @@
           <w:i w:val="0"/>
           <w:caps w:val="0"/>
           <w:color w:val="222222"/>
-          <w:sz w:val="20"/>
+          <w:sz w:val="21"/>
         </w:rPr>
         <w:t xml:space="preserve">Built and expanded a business: </w:t>
       </w:r>
@@ -168,7 +168,7 @@
           <w:i w:val="0"/>
           <w:caps w:val="0"/>
           <w:color w:val="222222"/>
-          <w:sz w:val="20"/>
+          <w:sz w:val="21"/>
         </w:rPr>
         <w:t>Grew Fitness Collective from a $5,000 investment to $10M in annual sales and from 4 to 60 full-time employees (15x), establishing a franchise model and three additional locations.</w:t>
       </w:r>
@@ -186,7 +186,7 @@
           <w:i w:val="0"/>
           <w:caps w:val="0"/>
           <w:color w:val="1F3A5F"/>
-          <w:sz w:val="20"/>
+          <w:sz w:val="21"/>
         </w:rPr>
         <w:t xml:space="preserve">•  </w:t>
       </w:r>
@@ -197,9 +197,9 @@
           <w:i w:val="0"/>
           <w:caps w:val="0"/>
           <w:color w:val="222222"/>
-          <w:sz w:val="20"/>
+          <w:sz w:val="21"/>
         </w:rPr>
-        <w:t xml:space="preserve">Led at substantial scale: </w:t>
+        <w:t xml:space="preserve">Built leadership accountability: </w:t>
       </w:r>
       <w:r>
         <w:rPr>
@@ -208,9 +208,9 @@
           <w:i w:val="0"/>
           <w:caps w:val="0"/>
           <w:color w:val="222222"/>
-          <w:sz w:val="20"/>
+          <w:sz w:val="21"/>
         </w:rPr>
-        <w:t>Oversaw a 140-person division and an $80M P&amp;L at Osborne Association, connecting financial accountability, workforce development, partnerships, and service delivery.</w:t>
+        <w:t>Managed 12 direct reports within a 140-person division, using weekly meetings, individual check-ins, and operational and financial reviews to align priorities and guide execution.</w:t>
       </w:r>
     </w:p>
     <w:p>
@@ -226,7 +226,7 @@
           <w:i w:val="0"/>
           <w:caps w:val="0"/>
           <w:color w:val="1F3A5F"/>
-          <w:sz w:val="20"/>
+          <w:sz w:val="21"/>
         </w:rPr>
         <w:t xml:space="preserve">•  </w:t>
       </w:r>
@@ -237,7 +237,7 @@
           <w:i w:val="0"/>
           <w:caps w:val="0"/>
           <w:color w:val="222222"/>
-          <w:sz w:val="20"/>
+          <w:sz w:val="21"/>
         </w:rPr>
         <w:t xml:space="preserve">Created mission-driven programs: </w:t>
       </w:r>
@@ -248,9 +248,9 @@
           <w:i w:val="0"/>
           <w:caps w:val="0"/>
           <w:color w:val="222222"/>
-          <w:sz w:val="20"/>
+          <w:sz w:val="21"/>
         </w:rPr>
-        <w:t>Led a nine-month transitional-employment program serving 300+ formerly incarcerated people annually; created and delivered an 18-month NYPA clean-energy workforce project with 92% retention.</w:t>
+        <w:t>Led a nine-month transitional-employment program serving 300+ formerly incarcerated people annually; created and delivered an 18-month NYPA clean-energy workforce program with a 92% certificate-completion rate.</w:t>
       </w:r>
     </w:p>
     <w:p>
@@ -266,7 +266,7 @@
           <w:i w:val="0"/>
           <w:caps w:val="0"/>
           <w:color w:val="1F3A5F"/>
-          <w:sz w:val="20"/>
+          <w:sz w:val="21"/>
         </w:rPr>
         <w:t xml:space="preserve">•  </w:t>
       </w:r>
@@ -277,7 +277,7 @@
           <w:i w:val="0"/>
           <w:caps w:val="0"/>
           <w:color w:val="222222"/>
-          <w:sz w:val="20"/>
+          <w:sz w:val="21"/>
         </w:rPr>
         <w:t xml:space="preserve">Improved operating performance: </w:t>
       </w:r>
@@ -288,7 +288,7 @@
           <w:i w:val="0"/>
           <w:caps w:val="0"/>
           <w:color w:val="222222"/>
-          <w:sz w:val="20"/>
+          <w:sz w:val="21"/>
         </w:rPr>
         <w:t>Cut vendor costs 35% and processing time 60% at Alluel Logistics through negotiation and systems improvements.</w:t>
       </w:r>
@@ -325,9 +325,9 @@
           <w:i w:val="0"/>
           <w:caps w:val="0"/>
           <w:color w:val="222222"/>
-          <w:sz w:val="20"/>
+          <w:sz w:val="21"/>
         </w:rPr>
-        <w:t>Organizational Growth  |  General Management  |  P&amp;L Leadership  |  Budgeting &amp; Resource Allocation  |  CEO &amp; Board Partnership  |  People Operations  |  Program Development  |  Coalition Building  |  Fundraising &amp; Grant Stewardship  |  Risk Management  |  Performance Reporting &amp; KPIs  |  Technology &amp; Process Improvement  |  Workforce Development  |  Social Enterprise  |  Practical AI Implementation</w:t>
+        <w:t>Organizational Growth  |  General Management  |  P&amp;L Leadership  |  Budgeting &amp; Resource Allocation  |  CEO &amp; Board Partnership  |  People Operations &amp; Talent Development  |  Program Development  |  Coalition Building &amp; Partnerships  |  Performance Reporting &amp; KPIs  |  Technology &amp; Process Improvement</w:t>
       </w:r>
     </w:p>
     <w:p>
@@ -347,7 +347,7 @@
           <w:color w:val="1F3A5F"/>
           <w:sz w:val="23"/>
         </w:rPr>
-        <w:t>Professional Experience</w:t>
+        <w:t>Selected Professional Experience</w:t>
       </w:r>
     </w:p>
     <w:p>
@@ -365,7 +365,7 @@
           <w:i w:val="0"/>
           <w:caps w:val="0"/>
           <w:color w:val="1F3A5F"/>
-          <w:sz w:val="20"/>
+          <w:sz w:val="21"/>
         </w:rPr>
         <w:t>MAROON STRATEGIST, LLC</w:t>
       </w:r>
@@ -376,7 +376,7 @@
           <w:i w:val="0"/>
           <w:caps w:val="0"/>
           <w:color w:val="555555"/>
-          <w:sz w:val="20"/>
+          <w:sz w:val="21"/>
         </w:rPr>
         <w:t xml:space="preserve">  |  Brooklyn, NY</w:t>
       </w:r>
@@ -387,7 +387,7 @@
           <w:i w:val="0"/>
           <w:caps w:val="0"/>
           <w:color w:val="222222"/>
-          <w:sz w:val="20"/>
+          <w:sz w:val="21"/>
         </w:rPr>
         <w:tab/>
         <w:t>Mar 2024 – Present</w:t>
@@ -405,7 +405,7 @@
           <w:i/>
           <w:caps w:val="0"/>
           <w:color w:val="222222"/>
-          <w:sz w:val="20"/>
+          <w:sz w:val="21"/>
         </w:rPr>
         <w:t>Chief Financial Strategy Officer</w:t>
       </w:r>
@@ -424,7 +424,7 @@
           <w:color w:val="555555"/>
           <w:sz w:val="20"/>
         </w:rPr>
-        <w:t>Fractional CFO and program leadership across nonprofit, public-sector, education, healthcare, and service businesses, connecting financial planning with partnerships, operating systems, and program execution.</w:t>
+        <w:t>Fractional CFO and program leadership connecting financial planning with partnerships, operating systems, and execution.</w:t>
       </w:r>
     </w:p>
     <w:p>
@@ -440,7 +440,7 @@
           <w:i w:val="0"/>
           <w:caps w:val="0"/>
           <w:color w:val="1F3A5F"/>
-          <w:sz w:val="20"/>
+          <w:sz w:val="21"/>
         </w:rPr>
         <w:t xml:space="preserve">•  </w:t>
       </w:r>
@@ -451,9 +451,9 @@
           <w:i w:val="0"/>
           <w:caps w:val="0"/>
           <w:color w:val="222222"/>
-          <w:sz w:val="20"/>
+          <w:sz w:val="21"/>
         </w:rPr>
-        <w:t>Created and led the NYPA clean-energy workforce training project from inception through completion over 18 months, overseeing proposal development, program design, budgeting, partner coordination, and participant training.</w:t>
+        <w:t>Created and led the NYPA clean-energy workforce training program from inception through completion over 18 months, overseeing proposal development, program design, budgeting, partnerships, and training; 92% of enrolled participants completed the program and earned a certificate, and the program established new energy-sector employer relationships.</w:t>
       </w:r>
     </w:p>
     <w:p>
@@ -469,7 +469,7 @@
           <w:i w:val="0"/>
           <w:caps w:val="0"/>
           <w:color w:val="1F3A5F"/>
-          <w:sz w:val="20"/>
+          <w:sz w:val="21"/>
         </w:rPr>
         <w:t xml:space="preserve">•  </w:t>
       </w:r>
@@ -480,36 +480,7 @@
           <w:i w:val="0"/>
           <w:caps w:val="0"/>
           <w:color w:val="222222"/>
-          <w:sz w:val="20"/>
-        </w:rPr>
-        <w:t>Completed the program with a 92% retention rate and established new energy-sector employer relationships, building a partnership network to support continued workforce development.</w:t>
-      </w:r>
-    </w:p>
-    <w:p>
-      <w:pPr>
-        <w:keepNext w:val="0"/>
-        <w:spacing w:before="0" w:after="20" w:line="240" w:lineRule="auto"/>
-        <w:ind w:left="259" w:hanging="202"/>
-      </w:pPr>
-      <w:r>
-        <w:rPr>
-          <w:rFonts w:ascii="Calibri" w:hAnsi="Calibri" w:eastAsia="Calibri"/>
-          <w:b w:val="0"/>
-          <w:i w:val="0"/>
-          <w:caps w:val="0"/>
-          <w:color w:val="1F3A5F"/>
-          <w:sz w:val="20"/>
-        </w:rPr>
-        <w:t xml:space="preserve">•  </w:t>
-      </w:r>
-      <w:r>
-        <w:rPr>
-          <w:rFonts w:ascii="Calibri" w:hAnsi="Calibri" w:eastAsia="Calibri"/>
-          <w:b w:val="0"/>
-          <w:i w:val="0"/>
-          <w:caps w:val="0"/>
-          <w:color w:val="222222"/>
-          <w:sz w:val="20"/>
+          <w:sz w:val="21"/>
         </w:rPr>
         <w:t>Built a coalition involving city and state agencies, elected officials, academic partners, Stanford Innovation Lab, KPMG, and the New York Power Authority; coordinated responsibilities and resources around training delivery.</w:t>
       </w:r>
@@ -527,7 +498,7 @@
           <w:i w:val="0"/>
           <w:caps w:val="0"/>
           <w:color w:val="1F3A5F"/>
-          <w:sz w:val="20"/>
+          <w:sz w:val="21"/>
         </w:rPr>
         <w:t xml:space="preserve">•  </w:t>
       </w:r>
@@ -538,7 +509,7 @@
           <w:i w:val="0"/>
           <w:caps w:val="0"/>
           <w:color w:val="222222"/>
-          <w:sz w:val="20"/>
+          <w:sz w:val="21"/>
         </w:rPr>
         <w:t>Developed and managed a multimillion-dollar budget, allocating direct and indirect costs, managing restricted cash flow, and aligning expenditures with grant requirements and delivery milestones.</w:t>
       </w:r>
@@ -556,7 +527,7 @@
           <w:i w:val="0"/>
           <w:caps w:val="0"/>
           <w:color w:val="1F3A5F"/>
-          <w:sz w:val="20"/>
+          <w:sz w:val="21"/>
         </w:rPr>
         <w:t xml:space="preserve">•  </w:t>
       </w:r>
@@ -567,7 +538,7 @@
           <w:i w:val="0"/>
           <w:caps w:val="0"/>
           <w:color w:val="222222"/>
-          <w:sz w:val="20"/>
+          <w:sz w:val="21"/>
         </w:rPr>
         <w:t>Led fundraising and partnership-agreement development; brought NYSID into the partnership network and liaised with Assembly partners to develop relationships and opportunities.</w:t>
       </w:r>
@@ -585,7 +556,7 @@
           <w:i w:val="0"/>
           <w:caps w:val="0"/>
           <w:color w:val="1F3A5F"/>
-          <w:sz w:val="20"/>
+          <w:sz w:val="21"/>
         </w:rPr>
         <w:t xml:space="preserve">•  </w:t>
       </w:r>
@@ -596,7 +567,7 @@
           <w:i w:val="0"/>
           <w:caps w:val="0"/>
           <w:color w:val="222222"/>
-          <w:sz w:val="20"/>
+          <w:sz w:val="21"/>
         </w:rPr>
         <w:t>Direct budgeting, forecasting, cash management, and multi-entity financial planning; build financial models, KPI dashboards, and SOPs to support leadership decisions and operating accountability.</w:t>
       </w:r>
@@ -616,7 +587,7 @@
           <w:i w:val="0"/>
           <w:caps w:val="0"/>
           <w:color w:val="1F3A5F"/>
-          <w:sz w:val="20"/>
+          <w:sz w:val="21"/>
         </w:rPr>
         <w:t>OSBORNE ASSOCIATION</w:t>
       </w:r>
@@ -627,7 +598,7 @@
           <w:i w:val="0"/>
           <w:caps w:val="0"/>
           <w:color w:val="555555"/>
-          <w:sz w:val="20"/>
+          <w:sz w:val="21"/>
         </w:rPr>
         <w:t xml:space="preserve">  |  New York, NY</w:t>
       </w:r>
@@ -638,7 +609,7 @@
           <w:i w:val="0"/>
           <w:caps w:val="0"/>
           <w:color w:val="222222"/>
-          <w:sz w:val="20"/>
+          <w:sz w:val="21"/>
         </w:rPr>
         <w:tab/>
         <w:t>Jan 2023 – Oct 2025</w:t>
@@ -656,7 +627,7 @@
           <w:i/>
           <w:caps w:val="0"/>
           <w:color w:val="222222"/>
-          <w:sz w:val="20"/>
+          <w:sz w:val="21"/>
         </w:rPr>
         <w:t>Vice President, Business Development &amp; Social Ventures</w:t>
       </w:r>
@@ -675,7 +646,7 @@
           <w:color w:val="555555"/>
           <w:sz w:val="20"/>
         </w:rPr>
-        <w:t>Led a 140-person division through 12 direct reports spanning budget and finance, grant stewardship, operations, and frontline supervision. Combined financial accountability, people leadership, and business development to strengthen delivery and expand mission-driven programs.</w:t>
+        <w:t>Led a 140-person division of a human-services organization serving people affected by the criminal legal system.</w:t>
       </w:r>
     </w:p>
     <w:p>
@@ -691,7 +662,7 @@
           <w:i w:val="0"/>
           <w:caps w:val="0"/>
           <w:color w:val="1F3A5F"/>
-          <w:sz w:val="20"/>
+          <w:sz w:val="21"/>
         </w:rPr>
         <w:t xml:space="preserve">•  </w:t>
       </w:r>
@@ -702,7 +673,7 @@
           <w:i w:val="0"/>
           <w:caps w:val="0"/>
           <w:color w:val="222222"/>
-          <w:sz w:val="20"/>
+          <w:sz w:val="21"/>
         </w:rPr>
         <w:t>Managed 12 direct reports, directing hiring, onboarding, training, performance management, and day-to-day execution across financial, operational, and program responsibilities.</w:t>
       </w:r>
@@ -720,7 +691,7 @@
           <w:i w:val="0"/>
           <w:caps w:val="0"/>
           <w:color w:val="1F3A5F"/>
-          <w:sz w:val="20"/>
+          <w:sz w:val="21"/>
         </w:rPr>
         <w:t xml:space="preserve">•  </w:t>
       </w:r>
@@ -731,7 +702,7 @@
           <w:i w:val="0"/>
           <w:caps w:val="0"/>
           <w:color w:val="222222"/>
-          <w:sz w:val="20"/>
+          <w:sz w:val="21"/>
         </w:rPr>
         <w:t>Established a management cadence of weekly team meetings, individual check-ins, and recurring operational and financial reviews, using budgets and performance reports to identify issues, align priorities, and guide decisions.</w:t>
       </w:r>
@@ -749,7 +720,7 @@
           <w:i w:val="0"/>
           <w:caps w:val="0"/>
           <w:color w:val="1F3A5F"/>
-          <w:sz w:val="20"/>
+          <w:sz w:val="21"/>
         </w:rPr>
         <w:t xml:space="preserve">•  </w:t>
       </w:r>
@@ -760,7 +731,7 @@
           <w:i w:val="0"/>
           <w:caps w:val="0"/>
           <w:color w:val="222222"/>
-          <w:sz w:val="20"/>
+          <w:sz w:val="21"/>
         </w:rPr>
         <w:t>Held full P&amp;L accountability for an $80M portfolio, aligning staffing, budgets, grant obligations, and program delivery with organizational priorities.</w:t>
       </w:r>
@@ -778,7 +749,7 @@
           <w:i w:val="0"/>
           <w:caps w:val="0"/>
           <w:color w:val="1F3A5F"/>
-          <w:sz w:val="20"/>
+          <w:sz w:val="21"/>
         </w:rPr>
         <w:t xml:space="preserve">•  </w:t>
       </w:r>
@@ -789,7 +760,7 @@
           <w:i w:val="0"/>
           <w:caps w:val="0"/>
           <w:color w:val="222222"/>
-          <w:sz w:val="20"/>
+          <w:sz w:val="21"/>
         </w:rPr>
         <w:t>Built growth opportunities across multiple industries through new partnerships, direct funding opportunities, and business development, incorporating expansion planning into ongoing operations.</w:t>
       </w:r>
@@ -807,7 +778,7 @@
           <w:i w:val="0"/>
           <w:caps w:val="0"/>
           <w:color w:val="1F3A5F"/>
-          <w:sz w:val="20"/>
+          <w:sz w:val="21"/>
         </w:rPr>
         <w:t xml:space="preserve">•  </w:t>
       </w:r>
@@ -818,7 +789,7 @@
           <w:i w:val="0"/>
           <w:caps w:val="0"/>
           <w:color w:val="222222"/>
-          <w:sz w:val="20"/>
+          <w:sz w:val="21"/>
         </w:rPr>
         <w:t>Led a nine-month transitional-employment program serving 300+ formerly incarcerated people annually, coordinating employer partnerships and tracking outcomes against funder benchmarks.</w:t>
       </w:r>
@@ -836,7 +807,7 @@
           <w:i w:val="0"/>
           <w:caps w:val="0"/>
           <w:color w:val="1F3A5F"/>
-          <w:sz w:val="20"/>
+          <w:sz w:val="21"/>
         </w:rPr>
         <w:t xml:space="preserve">•  </w:t>
       </w:r>
@@ -847,7 +818,7 @@
           <w:i w:val="0"/>
           <w:caps w:val="0"/>
           <w:color w:val="222222"/>
-          <w:sz w:val="20"/>
+          <w:sz w:val="21"/>
         </w:rPr>
         <w:t>Partnered with the CEO and Board on planning, risk management, resource allocation, and growth; negotiated government, corporate, and philanthropic partnerships.</w:t>
       </w:r>
@@ -865,7 +836,7 @@
           <w:i w:val="0"/>
           <w:caps w:val="0"/>
           <w:color w:val="1F3A5F"/>
-          <w:sz w:val="20"/>
+          <w:sz w:val="21"/>
         </w:rPr>
         <w:t xml:space="preserve">•  </w:t>
       </w:r>
@@ -876,7 +847,7 @@
           <w:i w:val="0"/>
           <w:caps w:val="0"/>
           <w:color w:val="222222"/>
-          <w:sz w:val="20"/>
+          <w:sz w:val="21"/>
         </w:rPr>
         <w:t>Authored a Rikers Island contract feasibility white paper and a roadmap for potentially doubling JMS within 12 months, identifying required investments in management, staffing, training, compliance, payroll, and technology.</w:t>
       </w:r>
@@ -896,7 +867,7 @@
           <w:i w:val="0"/>
           <w:caps w:val="0"/>
           <w:color w:val="1F3A5F"/>
-          <w:sz w:val="20"/>
+          <w:sz w:val="21"/>
         </w:rPr>
         <w:t>ALLUEL LOGISTICS</w:t>
       </w:r>
@@ -907,7 +878,7 @@
           <w:i w:val="0"/>
           <w:caps w:val="0"/>
           <w:color w:val="555555"/>
-          <w:sz w:val="20"/>
+          <w:sz w:val="21"/>
         </w:rPr>
         <w:t xml:space="preserve">  |  New York, NY</w:t>
       </w:r>
@@ -918,7 +889,7 @@
           <w:i w:val="0"/>
           <w:caps w:val="0"/>
           <w:color w:val="222222"/>
-          <w:sz w:val="20"/>
+          <w:sz w:val="21"/>
         </w:rPr>
         <w:tab/>
         <w:t>Nov 2021 – Aug 2022</w:t>
@@ -936,7 +907,7 @@
           <w:i/>
           <w:caps w:val="0"/>
           <w:color w:val="222222"/>
-          <w:sz w:val="20"/>
+          <w:sz w:val="21"/>
         </w:rPr>
         <w:t>Vice President of Operations</w:t>
       </w:r>
@@ -954,7 +925,7 @@
           <w:i w:val="0"/>
           <w:caps w:val="0"/>
           <w:color w:val="1F3A5F"/>
-          <w:sz w:val="20"/>
+          <w:sz w:val="21"/>
         </w:rPr>
         <w:t xml:space="preserve">•  </w:t>
       </w:r>
@@ -965,7 +936,7 @@
           <w:i w:val="0"/>
           <w:caps w:val="0"/>
           <w:color w:val="222222"/>
-          <w:sz w:val="20"/>
+          <w:sz w:val="21"/>
         </w:rPr>
         <w:t>Managed a $2M operating budget; renegotiated vendor agreements to cut supply-chain and logistics costs 35%.</w:t>
       </w:r>
@@ -983,7 +954,7 @@
           <w:i w:val="0"/>
           <w:caps w:val="0"/>
           <w:color w:val="1F3A5F"/>
-          <w:sz w:val="20"/>
+          <w:sz w:val="21"/>
         </w:rPr>
         <w:t xml:space="preserve">•  </w:t>
       </w:r>
@@ -994,7 +965,7 @@
           <w:i w:val="0"/>
           <w:caps w:val="0"/>
           <w:color w:val="222222"/>
-          <w:sz w:val="20"/>
+          <w:sz w:val="21"/>
         </w:rPr>
         <w:t>Implemented warehouse-management technology that reduced data-processing time 60%; introduced CRM systems and trained staff.</w:t>
       </w:r>
@@ -1012,7 +983,7 @@
           <w:i w:val="0"/>
           <w:caps w:val="0"/>
           <w:color w:val="1F3A5F"/>
-          <w:sz w:val="20"/>
+          <w:sz w:val="21"/>
         </w:rPr>
         <w:t xml:space="preserve">•  </w:t>
       </w:r>
@@ -1023,7 +994,7 @@
           <w:i w:val="0"/>
           <w:caps w:val="0"/>
           <w:color w:val="222222"/>
-          <w:sz w:val="20"/>
+          <w:sz w:val="21"/>
         </w:rPr>
         <w:t>Oversaw NYCHA logistics contracts serving 100 developments and supervised ~$500K in monthly NYC DHS billing.</w:t>
       </w:r>
@@ -1041,7 +1012,7 @@
           <w:i w:val="0"/>
           <w:caps w:val="0"/>
           <w:color w:val="1F3A5F"/>
-          <w:sz w:val="20"/>
+          <w:sz w:val="21"/>
         </w:rPr>
         <w:t xml:space="preserve">•  </w:t>
       </w:r>
@@ -1052,7 +1023,7 @@
           <w:i w:val="0"/>
           <w:caps w:val="0"/>
           <w:color w:val="222222"/>
-          <w:sz w:val="20"/>
+          <w:sz w:val="21"/>
         </w:rPr>
         <w:t>Recruited and managed field, sales, and administrative staff; improved HR workflows and data accuracy.</w:t>
       </w:r>
@@ -1072,7 +1043,7 @@
           <w:i w:val="0"/>
           <w:caps w:val="0"/>
           <w:color w:val="1F3A5F"/>
-          <w:sz w:val="20"/>
+          <w:sz w:val="21"/>
         </w:rPr>
         <w:t>LAZARRE CONSULTING GROUP</w:t>
       </w:r>
@@ -1083,7 +1054,7 @@
           <w:i w:val="0"/>
           <w:caps w:val="0"/>
           <w:color w:val="555555"/>
-          <w:sz w:val="20"/>
+          <w:sz w:val="21"/>
         </w:rPr>
         <w:t xml:space="preserve">  |  New York, NY</w:t>
       </w:r>
@@ -1094,7 +1065,7 @@
           <w:i w:val="0"/>
           <w:caps w:val="0"/>
           <w:color w:val="222222"/>
-          <w:sz w:val="20"/>
+          <w:sz w:val="21"/>
         </w:rPr>
         <w:tab/>
         <w:t>Dec 2016 – Present</w:t>
@@ -1112,7 +1083,7 @@
           <w:i/>
           <w:caps w:val="0"/>
           <w:color w:val="222222"/>
-          <w:sz w:val="20"/>
+          <w:sz w:val="21"/>
         </w:rPr>
         <w:t>Chief Executive Officer</w:t>
       </w:r>
@@ -1147,7 +1118,7 @@
           <w:i w:val="0"/>
           <w:caps w:val="0"/>
           <w:color w:val="1F3A5F"/>
-          <w:sz w:val="20"/>
+          <w:sz w:val="21"/>
         </w:rPr>
         <w:t xml:space="preserve">•  </w:t>
       </w:r>
@@ -1158,7 +1129,7 @@
           <w:i w:val="0"/>
           <w:caps w:val="0"/>
           <w:color w:val="222222"/>
-          <w:sz w:val="20"/>
+          <w:sz w:val="21"/>
         </w:rPr>
         <w:t>Served as financial architect for a $200M national banking development initiative, supporting capital planning and financial structuring.</w:t>
       </w:r>
@@ -1176,7 +1147,7 @@
           <w:i w:val="0"/>
           <w:caps w:val="0"/>
           <w:color w:val="1F3A5F"/>
-          <w:sz w:val="20"/>
+          <w:sz w:val="21"/>
         </w:rPr>
         <w:t xml:space="preserve">•  </w:t>
       </w:r>
@@ -1187,38 +1158,9 @@
           <w:i w:val="0"/>
           <w:caps w:val="0"/>
           <w:color w:val="222222"/>
-          <w:sz w:val="20"/>
+          <w:sz w:val="21"/>
         </w:rPr>
         <w:t>Developed operational and performance-improvement strategies for organizations and brands including American Express OPEN, Ogilvy, and Chubb.</w:t>
-      </w:r>
-    </w:p>
-    <w:p>
-      <w:pPr>
-        <w:keepNext w:val="0"/>
-        <w:spacing w:before="0" w:after="20" w:line="240" w:lineRule="auto"/>
-        <w:ind w:left="259" w:hanging="202"/>
-      </w:pPr>
-      <w:r>
-        <w:rPr>
-          <w:rFonts w:ascii="Calibri" w:hAnsi="Calibri" w:eastAsia="Calibri"/>
-          <w:b w:val="0"/>
-          <w:i w:val="0"/>
-          <w:caps w:val="0"/>
-          <w:color w:val="1F3A5F"/>
-          <w:sz w:val="20"/>
-        </w:rPr>
-        <w:t xml:space="preserve">•  </w:t>
-      </w:r>
-      <w:r>
-        <w:rPr>
-          <w:rFonts w:ascii="Calibri" w:hAnsi="Calibri" w:eastAsia="Calibri"/>
-          <w:b w:val="0"/>
-          <w:i w:val="0"/>
-          <w:caps w:val="0"/>
-          <w:color w:val="222222"/>
-          <w:sz w:val="20"/>
-        </w:rPr>
-        <w:t>Led financial remediation for a psychological services practice, identifying ~$251K in unclaimed deductions and preparing corrected financial statements.</w:t>
       </w:r>
     </w:p>
     <w:p>
@@ -1236,7 +1178,7 @@
           <w:i w:val="0"/>
           <w:caps w:val="0"/>
           <w:color w:val="1F3A5F"/>
-          <w:sz w:val="20"/>
+          <w:sz w:val="21"/>
         </w:rPr>
         <w:t>FITNESS COLLECTIVE INC.</w:t>
       </w:r>
@@ -1247,7 +1189,7 @@
           <w:i w:val="0"/>
           <w:caps w:val="0"/>
           <w:color w:val="555555"/>
-          <w:sz w:val="20"/>
+          <w:sz w:val="21"/>
         </w:rPr>
         <w:t xml:space="preserve">  |  Brooklyn, NY</w:t>
       </w:r>
@@ -1258,7 +1200,7 @@
           <w:i w:val="0"/>
           <w:caps w:val="0"/>
           <w:color w:val="222222"/>
-          <w:sz w:val="20"/>
+          <w:sz w:val="21"/>
         </w:rPr>
         <w:tab/>
         <w:t>2004 – 2016</w:t>
@@ -1276,7 +1218,7 @@
           <w:i/>
           <w:caps w:val="0"/>
           <w:color w:val="222222"/>
-          <w:sz w:val="20"/>
+          <w:sz w:val="21"/>
         </w:rPr>
         <w:t>CEO &amp; Co-Founder</w:t>
       </w:r>
@@ -1311,7 +1253,7 @@
           <w:i w:val="0"/>
           <w:caps w:val="0"/>
           <w:color w:val="1F3A5F"/>
-          <w:sz w:val="20"/>
+          <w:sz w:val="21"/>
         </w:rPr>
         <w:t xml:space="preserve">•  </w:t>
       </w:r>
@@ -1322,7 +1264,7 @@
           <w:i w:val="0"/>
           <w:caps w:val="0"/>
           <w:color w:val="222222"/>
-          <w:sz w:val="20"/>
+          <w:sz w:val="21"/>
         </w:rPr>
         <w:t>Scaled from a $5,000 investment to $1M in annual revenue within 24 months, then implemented a franchise model and launched three additional locations, growing to $10M in annual sales.</w:t>
       </w:r>
@@ -1340,7 +1282,7 @@
           <w:i w:val="0"/>
           <w:caps w:val="0"/>
           <w:color w:val="1F3A5F"/>
-          <w:sz w:val="20"/>
+          <w:sz w:val="21"/>
         </w:rPr>
         <w:t xml:space="preserve">•  </w:t>
       </w:r>
@@ -1351,9 +1293,9 @@
           <w:i w:val="0"/>
           <w:caps w:val="0"/>
           <w:color w:val="222222"/>
-          <w:sz w:val="20"/>
+          <w:sz w:val="21"/>
         </w:rPr>
-        <w:t>Scaled the workforce from 4 to 60 full-time employees across accounting, IT, facilities, personal training, group fitness, and other functions, building the staffing structure needed to support business expansion.</w:t>
+        <w:t>Scaled the workforce from 4 to 60 full-time employees across accounting, IT, facilities, personal training, and group fitness; created roles and participated directly in recruitment, supervision, and training.</w:t>
       </w:r>
     </w:p>
     <w:p>
@@ -1369,7 +1311,7 @@
           <w:i w:val="0"/>
           <w:caps w:val="0"/>
           <w:color w:val="1F3A5F"/>
-          <w:sz w:val="20"/>
+          <w:sz w:val="21"/>
         </w:rPr>
         <w:t xml:space="preserve">•  </w:t>
       </w:r>
@@ -1380,9 +1322,9 @@
           <w:i w:val="0"/>
           <w:caps w:val="0"/>
           <w:color w:val="222222"/>
-          <w:sz w:val="20"/>
+          <w:sz w:val="21"/>
         </w:rPr>
-        <w:t>Created roles and helped recruit, supervise, and train employees across these functions, with hands-on involvement in building both service delivery and business-support teams.</w:t>
+        <w:t>Built HR, payroll, benefits, and client-management infrastructure to support expansion across multiple locations, including Mindbody CRM serving a client base of 4,000+.</w:t>
       </w:r>
     </w:p>
     <w:p>
@@ -1398,7 +1340,7 @@
           <w:i w:val="0"/>
           <w:caps w:val="0"/>
           <w:color w:val="1F3A5F"/>
-          <w:sz w:val="20"/>
+          <w:sz w:val="21"/>
         </w:rPr>
         <w:t xml:space="preserve">•  </w:t>
       </w:r>
@@ -1409,36 +1351,7 @@
           <w:i w:val="0"/>
           <w:caps w:val="0"/>
           <w:color w:val="222222"/>
-          <w:sz w:val="20"/>
-        </w:rPr>
-        <w:t>Built HR, payroll, and benefits infrastructure to support the expanding workforce and operations across multiple locations.</w:t>
-      </w:r>
-    </w:p>
-    <w:p>
-      <w:pPr>
-        <w:keepNext w:val="0"/>
-        <w:spacing w:before="0" w:after="20" w:line="240" w:lineRule="auto"/>
-        <w:ind w:left="259" w:hanging="202"/>
-      </w:pPr>
-      <w:r>
-        <w:rPr>
-          <w:rFonts w:ascii="Calibri" w:hAnsi="Calibri" w:eastAsia="Calibri"/>
-          <w:b w:val="0"/>
-          <w:i w:val="0"/>
-          <w:caps w:val="0"/>
-          <w:color w:val="1F3A5F"/>
-          <w:sz w:val="20"/>
-        </w:rPr>
-        <w:t xml:space="preserve">•  </w:t>
-      </w:r>
-      <w:r>
-        <w:rPr>
-          <w:rFonts w:ascii="Calibri" w:hAnsi="Calibri" w:eastAsia="Calibri"/>
-          <w:b w:val="0"/>
-          <w:i w:val="0"/>
-          <w:caps w:val="0"/>
-          <w:color w:val="222222"/>
-          <w:sz w:val="20"/>
+          <w:sz w:val="21"/>
         </w:rPr>
         <w:t>Led direct outreach, grassroots marketing, website development, and partnerships with local businesses to attract clients and establish a presence in each operating neighborhood.</w:t>
       </w:r>
@@ -1456,7 +1369,7 @@
           <w:i w:val="0"/>
           <w:caps w:val="0"/>
           <w:color w:val="1F3A5F"/>
-          <w:sz w:val="20"/>
+          <w:sz w:val="21"/>
         </w:rPr>
         <w:t xml:space="preserve">•  </w:t>
       </w:r>
@@ -1467,36 +1380,7 @@
           <w:i w:val="0"/>
           <w:caps w:val="0"/>
           <w:color w:val="222222"/>
-          <w:sz w:val="20"/>
-        </w:rPr>
-        <w:t>Implemented Mindbody CRM for client tracking, booking, and targeted engagement across 4,000+ clients.</w:t>
-      </w:r>
-    </w:p>
-    <w:p>
-      <w:pPr>
-        <w:keepNext w:val="0"/>
-        <w:spacing w:before="0" w:after="20" w:line="240" w:lineRule="auto"/>
-        <w:ind w:left="259" w:hanging="202"/>
-      </w:pPr>
-      <w:r>
-        <w:rPr>
-          <w:rFonts w:ascii="Calibri" w:hAnsi="Calibri" w:eastAsia="Calibri"/>
-          <w:b w:val="0"/>
-          <w:i w:val="0"/>
-          <w:caps w:val="0"/>
-          <w:color w:val="1F3A5F"/>
-          <w:sz w:val="20"/>
-        </w:rPr>
-        <w:t xml:space="preserve">•  </w:t>
-      </w:r>
-      <w:r>
-        <w:rPr>
-          <w:rFonts w:ascii="Calibri" w:hAnsi="Calibri" w:eastAsia="Calibri"/>
-          <w:b w:val="0"/>
-          <w:i w:val="0"/>
-          <w:caps w:val="0"/>
-          <w:color w:val="222222"/>
-          <w:sz w:val="20"/>
+          <w:sz w:val="21"/>
         </w:rPr>
         <w:t>Established a training academy supporting certification of 25 trainers, expanding workforce capacity and service offerings.</w:t>
       </w:r>
@@ -1534,7 +1418,7 @@
           <w:i w:val="0"/>
           <w:caps w:val="0"/>
           <w:color w:val="1F3A5F"/>
-          <w:sz w:val="20"/>
+          <w:sz w:val="21"/>
         </w:rPr>
         <w:t xml:space="preserve">•  </w:t>
       </w:r>
@@ -1545,7 +1429,7 @@
           <w:i w:val="0"/>
           <w:caps w:val="0"/>
           <w:color w:val="222222"/>
-          <w:sz w:val="20"/>
+          <w:sz w:val="21"/>
         </w:rPr>
         <w:t xml:space="preserve">SkyNet: </w:t>
       </w:r>
@@ -1556,7 +1440,7 @@
           <w:i w:val="0"/>
           <w:caps w:val="0"/>
           <w:color w:val="222222"/>
-          <w:sz w:val="20"/>
+          <w:sz w:val="21"/>
         </w:rPr>
         <w:t>Built an AI-supported workflow connecting opportunity research, evaluation, document preparation, and reporting, with evidence validation, cost controls, and performance tracking.</w:t>
       </w:r>
@@ -1574,7 +1458,7 @@
           <w:i w:val="0"/>
           <w:caps w:val="0"/>
           <w:color w:val="1F3A5F"/>
-          <w:sz w:val="20"/>
+          <w:sz w:val="21"/>
         </w:rPr>
         <w:t xml:space="preserve">•  </w:t>
       </w:r>
@@ -1585,7 +1469,7 @@
           <w:i w:val="0"/>
           <w:caps w:val="0"/>
           <w:color w:val="222222"/>
-          <w:sz w:val="20"/>
+          <w:sz w:val="21"/>
         </w:rPr>
         <w:t xml:space="preserve">JWA AI Career Launch: </w:t>
       </w:r>
@@ -1596,9 +1480,9 @@
           <w:i w:val="0"/>
           <w:caps w:val="0"/>
           <w:color w:val="222222"/>
-          <w:sz w:val="20"/>
+          <w:sz w:val="21"/>
         </w:rPr>
-        <w:t>Designed and submitted a Citi Foundation proposal linking AI learning, workforce preparation, and employment support, with measures for skills, employment, wages, and retention.</w:t>
+        <w:t>Designed and submitted a Citi Foundation proposal linking AI learning, workforce preparation, and employment support, with proposed measures for skills, employment, wages, and retention.</w:t>
       </w:r>
     </w:p>
     <w:p>
@@ -1636,7 +1520,7 @@
           <w:i w:val="0"/>
           <w:caps w:val="0"/>
           <w:color w:val="222222"/>
-          <w:sz w:val="20"/>
+          <w:sz w:val="21"/>
         </w:rPr>
         <w:t>Master of Business Administration, General Business Management</w:t>
       </w:r>
@@ -1647,7 +1531,7 @@
           <w:i w:val="0"/>
           <w:caps w:val="0"/>
           <w:color w:val="222222"/>
-          <w:sz w:val="20"/>
+          <w:sz w:val="21"/>
         </w:rPr>
         <w:t xml:space="preserve">  |  West Texas A&amp;M University</w:t>
       </w:r>
@@ -1658,7 +1542,7 @@
           <w:i w:val="0"/>
           <w:caps w:val="0"/>
           <w:color w:val="222222"/>
-          <w:sz w:val="20"/>
+          <w:sz w:val="21"/>
         </w:rPr>
         <w:tab/>
         <w:t>2023</w:t>
@@ -1679,7 +1563,7 @@
           <w:i w:val="0"/>
           <w:caps w:val="0"/>
           <w:color w:val="222222"/>
-          <w:sz w:val="20"/>
+          <w:sz w:val="21"/>
         </w:rPr>
         <w:t>Bachelor of Science, Small Business Administration</w:t>
       </w:r>
@@ -1690,7 +1574,7 @@
           <w:i w:val="0"/>
           <w:caps w:val="0"/>
           <w:color w:val="222222"/>
-          <w:sz w:val="20"/>
+          <w:sz w:val="21"/>
         </w:rPr>
         <w:t xml:space="preserve">  |  Northern Arizona University</w:t>
       </w:r>
@@ -2070,7 +1954,7 @@
     <w:rsid w:val="00FC693F"/>
     <w:rPr>
       <w:rFonts w:ascii="Calibri" w:hAnsi="Calibri"/>
-      <w:sz w:val="20"/>
+      <w:sz w:val="21"/>
     </w:rPr>
   </w:style>
   <w:style w:type="paragraph" w:styleId="Header">

</xml_diff>